<commit_message>
Fix Word & PDF header layout to match live preview with vibrant 68/32 stripes, clean vertical badge divider, and full institutional contact metadata
</commit_message>
<xml_diff>
--- a/SGB_Functionality_Audit_2026/01_SGB_Constitution/01_Meeting_Notice_and_Invitation_2026-01-19.docx
+++ b/SGB_Functionality_Audit_2026/01_SGB_Constitution/01_Meeting_Notice_and_Invitation_2026-01-19.docx
@@ -2,6 +2,288 @@
 <file path=word/document.xml><?xml version="1.0" encoding="utf-8"?>
 <w:document xmlns:wpc="http://schemas.microsoft.com/office/word/2010/wordprocessingCanvas" xmlns:mc="http://schemas.openxmlformats.org/markup-compatibility/2006" xmlns:o="urn:schemas-microsoft-com:office:office" xmlns:r="http://schemas.openxmlformats.org/officeDocument/2006/relationships" xmlns:m="http://schemas.openxmlformats.org/officeDocument/2006/math" xmlns:v="urn:schemas-microsoft-com:vml" xmlns:wp14="http://schemas.microsoft.com/office/word/2010/wordprocessingDrawing" xmlns:wp="http://schemas.openxmlformats.org/drawingml/2006/wordprocessingDrawing" xmlns:w10="urn:schemas-microsoft-com:office:word" xmlns:w="http://schemas.openxmlformats.org/wordprocessingml/2006/main" xmlns:w14="http://schemas.microsoft.com/office/word/2010/wordml" xmlns:w15="http://schemas.microsoft.com/office/word/2012/wordml" xmlns:wpg="http://schemas.microsoft.com/office/word/2010/wordprocessingGroup" xmlns:wpi="http://schemas.microsoft.com/office/word/2010/wordprocessingInk" xmlns:wne="http://schemas.microsoft.com/office/word/2006/wordml" xmlns:wps="http://schemas.microsoft.com/office/word/2010/wordprocessingShape" xmlns:cx="http://schemas.microsoft.com/office/drawing/2014/chartex" xmlns:cx1="http://schemas.microsoft.com/office/drawing/2015/9/8/chartex" xmlns:cx2="http://schemas.microsoft.com/office/drawing/2015/10/21/chartex" xmlns:cx3="http://schemas.microsoft.com/office/drawing/2016/5/9/chartex" xmlns:cx4="http://schemas.microsoft.com/office/drawing/2016/5/10/chartex" xmlns:cx5="http://schemas.microsoft.com/office/drawing/2016/5/11/chartex" xmlns:cx6="http://schemas.microsoft.com/office/drawing/2016/5/12/chartex" xmlns:cx7="http://schemas.microsoft.com/office/drawing/2016/5/13/chartex" xmlns:cx8="http://schemas.microsoft.com/office/drawing/2016/5/14/chartex" xmlns:aink="http://schemas.microsoft.com/office/drawing/2016/ink" xmlns:am3d="http://schemas.microsoft.com/office/drawing/2017/model3d" xmlns:w16cex="http://schemas.microsoft.com/office/word/2018/wordml/cex" xmlns:w16cid="http://schemas.microsoft.com/office/word/2016/wordml/cid" xmlns:w16="http://schemas.microsoft.com/office/word/2018/wordml" xmlns:w16sdtdh="http://schemas.microsoft.com/office/word/2020/wordml/sdtdatahash" xmlns:w16se="http://schemas.microsoft.com/office/word/2015/wordml/symex" mc:Ignorable="w14 w15 wp14">
   <w:body>
+    <w:tbl>
+      <w:tblPr>
+        <w:tblW w:type="dxa" w:w="10771"/>
+        <w:tblBorders>
+          <w:top w:val="none"/>
+          <w:left w:val="none"/>
+          <w:bottom w:val="none"/>
+          <w:right w:val="none"/>
+          <w:insideH w:val="none"/>
+          <w:insideV w:val="none"/>
+        </w:tblBorders>
+      </w:tblPr>
+      <w:tblGrid>
+        <w:gridCol w:w="100"/>
+        <w:gridCol w:w="100"/>
+      </w:tblGrid>
+      <w:tr>
+        <w:trPr>
+          <w:trHeight w:val="198" w:hRule="exact"/>
+        </w:trPr>
+        <w:tc>
+          <w:tcPr>
+            <w:tcW w:type="dxa" w:w="7324"/>
+            <w:shd w:fill="A6192E"/>
+            <w:tcMar>
+              <w:top w:type="dxa" w:w="0"/>
+              <w:left w:type="dxa" w:w="0"/>
+              <w:bottom w:type="dxa" w:w="0"/>
+              <w:right w:type="dxa" w:w="0"/>
+            </w:tcMar>
+          </w:tcPr>
+          <w:p>
+            <w:pPr>
+              <w:spacing w:after="0" w:before="0" w:line="20"/>
+            </w:pPr>
+            <w:r>
+              <w:rPr>
+                <w:sz w:val="2"/>
+                <w:szCs w:val="2"/>
+              </w:rPr>
+              <w:t xml:space="preserve"> </w:t>
+            </w:r>
+          </w:p>
+        </w:tc>
+        <w:tc>
+          <w:tcPr>
+            <w:tcW w:type="dxa" w:w="3446"/>
+            <w:shd w:fill="0C2340"/>
+            <w:tcMar>
+              <w:top w:type="dxa" w:w="0"/>
+              <w:left w:type="dxa" w:w="0"/>
+              <w:bottom w:type="dxa" w:w="0"/>
+              <w:right w:type="dxa" w:w="0"/>
+            </w:tcMar>
+          </w:tcPr>
+          <w:p>
+            <w:pPr>
+              <w:spacing w:after="0" w:before="0" w:line="20"/>
+            </w:pPr>
+            <w:r>
+              <w:rPr>
+                <w:sz w:val="2"/>
+                <w:szCs w:val="2"/>
+              </w:rPr>
+              <w:t xml:space="preserve"> </w:t>
+            </w:r>
+          </w:p>
+        </w:tc>
+      </w:tr>
+    </w:tbl>
+    <w:p>
+      <w:pPr>
+        <w:spacing w:after="60" w:before="0"/>
+      </w:pPr>
+    </w:p>
+    <w:tbl>
+      <w:tblPr>
+        <w:tblW w:type="dxa" w:w="10771"/>
+        <w:tblBorders>
+          <w:top w:val="none"/>
+          <w:left w:val="none"/>
+          <w:bottom w:val="none"/>
+          <w:right w:val="none"/>
+          <w:insideH w:val="none"/>
+          <w:insideV w:val="none"/>
+        </w:tblBorders>
+      </w:tblPr>
+      <w:tblGrid>
+        <w:gridCol w:w="100"/>
+        <w:gridCol w:w="100"/>
+        <w:gridCol w:w="100"/>
+      </w:tblGrid>
+      <w:tr>
+        <w:tc>
+          <w:tcPr>
+            <w:tcW w:type="dxa" w:w="907"/>
+            <w:tcMar>
+              <w:top w:type="dxa" w:w="10"/>
+              <w:left w:type="dxa" w:w="0"/>
+              <w:bottom w:type="dxa" w:w="10"/>
+              <w:right w:type="dxa" w:w="40"/>
+            </w:tcMar>
+            <w:vAlign w:val="center"/>
+          </w:tcPr>
+          <w:p>
+            <w:pPr>
+              <w:spacing w:after="0" w:before="0"/>
+            </w:pPr>
+            <w:r>
+              <w:drawing>
+                <wp:inline distT="0" distB="0" distL="0" distR="0">
+                  <wp:extent cx="438150" cy="438150"/>
+                  <wp:effectExtent t="0" r="0" b="0" l="0"/>
+                  <wp:docPr id="1" name="" descr="" title=""/>
+                  <wp:cNvGraphicFramePr>
+                    <a:graphicFrameLocks xmlns:a="http://schemas.openxmlformats.org/drawingml/2006/main" noChangeAspect="1"/>
+                  </wp:cNvGraphicFramePr>
+                  <a:graphic xmlns:a="http://schemas.openxmlformats.org/drawingml/2006/main">
+                    <a:graphicData uri="http://schemas.openxmlformats.org/drawingml/2006/picture">
+                      <pic:pic xmlns:pic="http://schemas.openxmlformats.org/drawingml/2006/picture">
+                        <pic:nvPicPr>
+                          <pic:cNvPr id="0" name="" descr=""/>
+                          <pic:cNvPicPr>
+                            <a:picLocks noChangeAspect="1" noChangeArrowheads="1"/>
+                          </pic:cNvPicPr>
+                        </pic:nvPicPr>
+                        <pic:blipFill>
+                          <a:blip r:embed="rId8" cstate="none"/>
+                          <a:srcRect/>
+                          <a:stretch>
+                            <a:fillRect/>
+                          </a:stretch>
+                        </pic:blipFill>
+                        <pic:spPr bwMode="auto">
+                          <a:xfrm>
+                            <a:off x="0" y="0"/>
+                            <a:ext cx="438150" cy="438150"/>
+                          </a:xfrm>
+                          <a:prstGeom prst="rect">
+                            <a:avLst/>
+                          </a:prstGeom>
+                        </pic:spPr>
+                      </pic:pic>
+                    </a:graphicData>
+                  </a:graphic>
+                </wp:inline>
+              </w:drawing>
+            </w:r>
+          </w:p>
+        </w:tc>
+        <w:tc>
+          <w:tcPr>
+            <w:tcW w:type="dxa" w:w="7823"/>
+            <w:tcMar>
+              <w:top w:type="dxa" w:w="10"/>
+              <w:left w:type="dxa" w:w="30"/>
+              <w:bottom w:type="dxa" w:w="10"/>
+              <w:right w:type="dxa" w:w="30"/>
+            </w:tcMar>
+            <w:vAlign w:val="center"/>
+          </w:tcPr>
+          <w:p>
+            <w:pPr>
+              <w:spacing w:after="8" w:before="0" w:line="220"/>
+            </w:pPr>
+            <w:r>
+              <w:rPr>
+                <w:rFonts w:ascii="Arial" w:cs="Arial" w:eastAsia="Arial" w:hAnsi="Arial"/>
+                <w:b/>
+                <w:bCs/>
+                <w:color w:val="0C2340"/>
+                <w:sz w:val="20"/>
+                <w:szCs w:val="20"/>
+              </w:rPr>
+              <w:t xml:space="preserve">LADY GREY ARTS ACADEMY</w:t>
+            </w:r>
+          </w:p>
+          <w:p>
+            <w:pPr>
+              <w:spacing w:after="8" w:before="0" w:line="220"/>
+            </w:pPr>
+            <w:r>
+              <w:rPr>
+                <w:rFonts w:ascii="Arial" w:cs="Arial" w:eastAsia="Arial" w:hAnsi="Arial"/>
+                <w:b/>
+                <w:bCs/>
+                <w:i/>
+                <w:iCs/>
+                <w:color w:val="A6192E"/>
+                <w:sz w:val="15"/>
+                <w:szCs w:val="15"/>
+              </w:rPr>
+              <w:t xml:space="preserve">Where Learning is an Art</w:t>
+            </w:r>
+          </w:p>
+          <w:p>
+            <w:pPr>
+              <w:spacing w:after="6" w:before="0" w:line="200"/>
+            </w:pPr>
+            <w:r>
+              <w:rPr>
+                <w:rFonts w:ascii="Arial" w:cs="Arial" w:eastAsia="Arial" w:hAnsi="Arial"/>
+                <w:color w:val="475569"/>
+                <w:sz w:val="14"/>
+                <w:szCs w:val="14"/>
+              </w:rPr>
+              <w:t xml:space="preserve">18 Brummer Street, Lady Grey, 9755 | Tel: 051 603 0046 | admin@lgaa.co.za</w:t>
+            </w:r>
+          </w:p>
+          <w:p>
+            <w:pPr>
+              <w:spacing w:after="0" w:before="0" w:line="200"/>
+            </w:pPr>
+            <w:r>
+              <w:rPr>
+                <w:rFonts w:ascii="Arial" w:cs="Arial" w:eastAsia="Arial" w:hAnsi="Arial"/>
+                <w:color w:val="475569"/>
+                <w:sz w:val="14"/>
+                <w:szCs w:val="14"/>
+              </w:rPr>
+              <w:t xml:space="preserve">EMIS: 200600985 | District: Joe Gqabi | Circuit: Ekhephini | CMC: Maletswai</w:t>
+            </w:r>
+          </w:p>
+        </w:tc>
+        <w:tc>
+          <w:tcPr>
+            <w:tcW w:type="dxa" w:w="2040"/>
+            <w:tcBorders>
+              <w:top w:val="none"/>
+              <w:left w:val="single" w:color="0C2340" w:sz="20"/>
+              <w:bottom w:val="none"/>
+              <w:right w:val="none"/>
+            </w:tcBorders>
+            <w:tcMar>
+              <w:top w:type="dxa" w:w="10"/>
+              <w:left w:type="dxa" w:w="60"/>
+              <w:bottom w:type="dxa" w:w="10"/>
+              <w:right w:type="dxa" w:w="0"/>
+            </w:tcMar>
+            <w:vAlign w:val="center"/>
+          </w:tcPr>
+          <w:p>
+            <w:pPr>
+              <w:spacing w:after="2" w:before="0" w:line="200"/>
+            </w:pPr>
+            <w:r>
+              <w:rPr>
+                <w:rFonts w:ascii="Arial" w:cs="Arial" w:eastAsia="Arial" w:hAnsi="Arial"/>
+                <w:b/>
+                <w:bCs/>
+                <w:color w:val="0C2340"/>
+                <w:sz w:val="19"/>
+                <w:szCs w:val="19"/>
+              </w:rPr>
+              <w:t xml:space="preserve">SGB</w:t>
+            </w:r>
+          </w:p>
+          <w:p>
+            <w:pPr>
+              <w:spacing w:after="0" w:before="0" w:line="180"/>
+            </w:pPr>
+            <w:r>
+              <w:rPr>
+                <w:rFonts w:ascii="Arial" w:cs="Arial" w:eastAsia="Arial" w:hAnsi="Arial"/>
+                <w:color w:val="64748B"/>
+                <w:sz w:val="14"/>
+                <w:szCs w:val="14"/>
+              </w:rPr>
+              <w:t xml:space="preserve">NOTICE &amp; INVITATION</w:t>
+            </w:r>
+          </w:p>
+        </w:tc>
+      </w:tr>
+    </w:tbl>
+    <w:p>
+      <w:pPr>
+        <w:pBdr>
+          <w:bottom w:val="single" w:color="CBD5E1" w:sz="6"/>
+        </w:pBdr>
+        <w:spacing w:after="120" w:before="40"/>
+      </w:pPr>
+    </w:p>
     <w:p>
       <w:pPr>
         <w:spacing w:after="40" w:before="120"/>
@@ -1358,14 +1640,10 @@
       </w:tr>
     </w:tbl>
     <w:sectPr>
-      <w:headerReference w:type="default" r:id="rId7"/>
-      <w:headerReference w:type="first" r:id="rId8"/>
-      <w:footerReference w:type="default" r:id="rId9"/>
-      <w:footerReference w:type="first" r:id="rId10"/>
+      <w:footerReference w:type="default" r:id="rId7"/>
       <w:pgSz w:w="11905" w:h="16837" w:orient="portrait"/>
       <w:pgMar w:top="566" w:right="566" w:bottom="566" w:left="566" w:header="453" w:footer="453" w:gutter="0"/>
       <w:pgNumType/>
-      <w:titlePg/>
       <w:docGrid w:linePitch="360"/>
     </w:sectPr>
   </w:body>
@@ -1478,71 +1756,6 @@
 </w:ftr>
 </file>
 
-<file path=word/footer2.xml><?xml version="1.0" encoding="utf-8"?>
-<w:ftr xmlns:wpc="http://schemas.microsoft.com/office/word/2010/wordprocessingCanvas" xmlns:mc="http://schemas.openxmlformats.org/markup-compatibility/2006" xmlns:o="urn:schemas-microsoft-com:office:office" xmlns:r="http://schemas.openxmlformats.org/officeDocument/2006/relationships" xmlns:m="http://schemas.openxmlformats.org/officeDocument/2006/math" xmlns:v="urn:schemas-microsoft-com:vml" xmlns:wp14="http://schemas.microsoft.com/office/word/2010/wordprocessingDrawing" xmlns:wp="http://schemas.openxmlformats.org/drawingml/2006/wordprocessingDrawing" xmlns:w10="urn:schemas-microsoft-com:office:word" xmlns:w="http://schemas.openxmlformats.org/wordprocessingml/2006/main" xmlns:w14="http://schemas.microsoft.com/office/word/2010/wordml" xmlns:w15="http://schemas.microsoft.com/office/word/2012/wordml" xmlns:wpg="http://schemas.microsoft.com/office/word/2010/wordprocessingGroup" xmlns:wpi="http://schemas.microsoft.com/office/word/2010/wordprocessingInk" xmlns:wne="http://schemas.microsoft.com/office/word/2006/wordml" xmlns:wps="http://schemas.microsoft.com/office/word/2010/wordprocessingShape">
-  <w:p>
-    <w:pPr>
-      <w:pBdr>
-        <w:top w:val="single" w:color="E2E8F0" w:sz="4"/>
-      </w:pBdr>
-      <w:spacing w:after="0" w:before="60"/>
-      <w:jc w:val="center"/>
-    </w:pPr>
-    <w:r>
-      <w:rPr>
-        <w:rFonts w:ascii="Arial" w:cs="Arial" w:eastAsia="Arial" w:hAnsi="Arial"/>
-        <w:color w:val="64748B"/>
-        <w:sz w:val="17"/>
-        <w:szCs w:val="17"/>
-      </w:rPr>
-      <w:t xml:space="preserve">LGAA SGB MEETING NOTICE • 28 JAN 2026   </w:t>
-    </w:r>
-    <w:r>
-      <w:rPr>
-        <w:rFonts w:ascii="Arial" w:cs="Arial" w:eastAsia="Arial" w:hAnsi="Arial"/>
-        <w:color w:val="64748B"/>
-        <w:sz w:val="17"/>
-        <w:szCs w:val="17"/>
-      </w:rPr>
-      <w:t xml:space="preserve">Page </w:t>
-    </w:r>
-    <w:r>
-      <w:rPr>
-        <w:rFonts w:ascii="Arial" w:cs="Arial" w:eastAsia="Arial" w:hAnsi="Arial"/>
-        <w:color w:val="64748B"/>
-        <w:sz w:val="17"/>
-        <w:szCs w:val="17"/>
-      </w:rPr>
-      <w:fldChar w:fldCharType="begin"/>
-      <w:instrText xml:space="preserve">PAGE</w:instrText>
-      <w:fldChar w:fldCharType="separate"/>
-      <w:fldChar w:fldCharType="end"/>
-    </w:r>
-    <w:r>
-      <w:rPr>
-        <w:rFonts w:ascii="Arial" w:cs="Arial" w:eastAsia="Arial" w:hAnsi="Arial"/>
-        <w:color w:val="64748B"/>
-        <w:sz w:val="17"/>
-        <w:szCs w:val="17"/>
-      </w:rPr>
-      <w:t xml:space="preserve"> of </w:t>
-    </w:r>
-    <w:r>
-      <w:rPr>
-        <w:rFonts w:ascii="Arial" w:cs="Arial" w:eastAsia="Arial" w:hAnsi="Arial"/>
-        <w:color w:val="64748B"/>
-        <w:sz w:val="17"/>
-        <w:szCs w:val="17"/>
-      </w:rPr>
-      <w:fldChar w:fldCharType="begin"/>
-      <w:instrText xml:space="preserve">NUMPAGES</w:instrText>
-      <w:fldChar w:fldCharType="separate"/>
-      <w:fldChar w:fldCharType="end"/>
-    </w:r>
-  </w:p>
-</w:ftr>
-</file>
-
 <file path=word/footnotes.xml><?xml version="1.0" encoding="utf-8"?>
 <w:footnotes xmlns:wpc="http://schemas.microsoft.com/office/word/2010/wordprocessingCanvas" xmlns:mc="http://schemas.openxmlformats.org/markup-compatibility/2006" xmlns:o="urn:schemas-microsoft-com:office:office" xmlns:r="http://schemas.openxmlformats.org/officeDocument/2006/relationships" xmlns:m="http://schemas.openxmlformats.org/officeDocument/2006/math" xmlns:v="urn:schemas-microsoft-com:vml" xmlns:wp14="http://schemas.microsoft.com/office/word/2010/wordprocessingDrawing" xmlns:wp="http://schemas.openxmlformats.org/drawingml/2006/wordprocessingDrawing" xmlns:w10="urn:schemas-microsoft-com:office:word" xmlns:w="http://schemas.openxmlformats.org/wordprocessingml/2006/main" xmlns:w14="http://schemas.microsoft.com/office/word/2010/wordml" xmlns:w15="http://schemas.microsoft.com/office/word/2012/wordml" xmlns:wpg="http://schemas.microsoft.com/office/word/2010/wordprocessingGroup" xmlns:wpi="http://schemas.microsoft.com/office/word/2010/wordprocessingInk" xmlns:wne="http://schemas.microsoft.com/office/word/2006/wordml" xmlns:wps="http://schemas.microsoft.com/office/word/2010/wordprocessingShape" mc:Ignorable="w14 w15 wp14">
   <w:footnote w:type="separator" w:id="-1">
@@ -1578,282 +1791,6 @@
     </w:p>
   </w:footnote>
 </w:footnotes>
-</file>
-
-<file path=word/header1.xml><?xml version="1.0" encoding="utf-8"?>
-<w:hdr xmlns:wpc="http://schemas.microsoft.com/office/word/2010/wordprocessingCanvas" xmlns:mc="http://schemas.openxmlformats.org/markup-compatibility/2006" xmlns:o="urn:schemas-microsoft-com:office:office" xmlns:r="http://schemas.openxmlformats.org/officeDocument/2006/relationships" xmlns:m="http://schemas.openxmlformats.org/officeDocument/2006/math" xmlns:v="urn:schemas-microsoft-com:vml" xmlns:wp14="http://schemas.microsoft.com/office/word/2010/wordprocessingDrawing" xmlns:wp="http://schemas.openxmlformats.org/drawingml/2006/wordprocessingDrawing" xmlns:w10="urn:schemas-microsoft-com:office:word" xmlns:w="http://schemas.openxmlformats.org/wordprocessingml/2006/main" xmlns:w14="http://schemas.microsoft.com/office/word/2010/wordml" xmlns:w15="http://schemas.microsoft.com/office/word/2012/wordml" xmlns:wpg="http://schemas.microsoft.com/office/word/2010/wordprocessingGroup" xmlns:wpi="http://schemas.microsoft.com/office/word/2010/wordprocessingInk" xmlns:wne="http://schemas.microsoft.com/office/word/2006/wordml" xmlns:wps="http://schemas.microsoft.com/office/word/2010/wordprocessingShape" xmlns:cx="http://schemas.microsoft.com/office/drawing/2014/chartex" xmlns:cx1="http://schemas.microsoft.com/office/drawing/2015/9/8/chartex" xmlns:cx2="http://schemas.microsoft.com/office/drawing/2015/10/21/chartex" xmlns:cx3="http://schemas.microsoft.com/office/drawing/2016/5/9/chartex" xmlns:cx4="http://schemas.microsoft.com/office/drawing/2016/5/10/chartex" xmlns:cx5="http://schemas.microsoft.com/office/drawing/2016/5/11/chartex" xmlns:cx6="http://schemas.microsoft.com/office/drawing/2016/5/12/chartex" xmlns:cx7="http://schemas.microsoft.com/office/drawing/2016/5/13/chartex" xmlns:cx8="http://schemas.microsoft.com/office/drawing/2016/5/14/chartex" xmlns:w16cid="http://schemas.microsoft.com/office/word/2016/wordml/cid" xmlns:w16se="http://schemas.microsoft.com/office/word/2015/wordml/symex"/>
-</file>
-
-<file path=word/header2.xml><?xml version="1.0" encoding="utf-8"?>
-<w:hdr xmlns:wpc="http://schemas.microsoft.com/office/word/2010/wordprocessingCanvas" xmlns:mc="http://schemas.openxmlformats.org/markup-compatibility/2006" xmlns:o="urn:schemas-microsoft-com:office:office" xmlns:r="http://schemas.openxmlformats.org/officeDocument/2006/relationships" xmlns:m="http://schemas.openxmlformats.org/officeDocument/2006/math" xmlns:v="urn:schemas-microsoft-com:vml" xmlns:wp14="http://schemas.microsoft.com/office/word/2010/wordprocessingDrawing" xmlns:wp="http://schemas.openxmlformats.org/drawingml/2006/wordprocessingDrawing" xmlns:w10="urn:schemas-microsoft-com:office:word" xmlns:w="http://schemas.openxmlformats.org/wordprocessingml/2006/main" xmlns:w14="http://schemas.microsoft.com/office/word/2010/wordml" xmlns:w15="http://schemas.microsoft.com/office/word/2012/wordml" xmlns:wpg="http://schemas.microsoft.com/office/word/2010/wordprocessingGroup" xmlns:wpi="http://schemas.microsoft.com/office/word/2010/wordprocessingInk" xmlns:wne="http://schemas.microsoft.com/office/word/2006/wordml" xmlns:wps="http://schemas.microsoft.com/office/word/2010/wordprocessingShape" xmlns:cx="http://schemas.microsoft.com/office/drawing/2014/chartex" xmlns:cx1="http://schemas.microsoft.com/office/drawing/2015/9/8/chartex" xmlns:cx2="http://schemas.microsoft.com/office/drawing/2015/10/21/chartex" xmlns:cx3="http://schemas.microsoft.com/office/drawing/2016/5/9/chartex" xmlns:cx4="http://schemas.microsoft.com/office/drawing/2016/5/10/chartex" xmlns:cx5="http://schemas.microsoft.com/office/drawing/2016/5/11/chartex" xmlns:cx6="http://schemas.microsoft.com/office/drawing/2016/5/12/chartex" xmlns:cx7="http://schemas.microsoft.com/office/drawing/2016/5/13/chartex" xmlns:cx8="http://schemas.microsoft.com/office/drawing/2016/5/14/chartex" xmlns:w16cid="http://schemas.microsoft.com/office/word/2016/wordml/cid" xmlns:w16se="http://schemas.microsoft.com/office/word/2015/wordml/symex">
-  <w:tbl>
-    <w:tblPr>
-      <w:tblW w:type="dxa" w:w="10771"/>
-      <w:tblBorders>
-        <w:top w:val="none"/>
-        <w:left w:val="none"/>
-        <w:bottom w:val="none"/>
-        <w:right w:val="none"/>
-        <w:insideH w:val="none"/>
-        <w:insideV w:val="none"/>
-      </w:tblBorders>
-    </w:tblPr>
-    <w:tblGrid>
-      <w:gridCol w:w="100"/>
-      <w:gridCol w:w="100"/>
-    </w:tblGrid>
-    <w:tr>
-      <w:trPr>
-        <w:trHeight w:val="124" w:hRule="exact"/>
-      </w:trPr>
-      <w:tc>
-        <w:tcPr>
-          <w:tcW w:type="dxa" w:w="7001"/>
-          <w:shd w:fill="A6192E"/>
-          <w:tcMar>
-            <w:top w:type="dxa" w:w="0"/>
-            <w:left w:type="dxa" w:w="0"/>
-            <w:bottom w:type="dxa" w:w="0"/>
-            <w:right w:type="dxa" w:w="0"/>
-          </w:tcMar>
-        </w:tcPr>
-        <w:p>
-          <w:pPr>
-            <w:spacing w:after="0" w:before="0" w:line="20"/>
-          </w:pPr>
-          <w:r>
-            <w:rPr>
-              <w:sz w:val="2"/>
-              <w:szCs w:val="2"/>
-            </w:rPr>
-            <w:t xml:space="preserve"> </w:t>
-          </w:r>
-        </w:p>
-      </w:tc>
-      <w:tc>
-        <w:tcPr>
-          <w:tcW w:type="dxa" w:w="3770"/>
-          <w:shd w:fill="0C2340"/>
-          <w:tcMar>
-            <w:top w:type="dxa" w:w="0"/>
-            <w:left w:type="dxa" w:w="0"/>
-            <w:bottom w:type="dxa" w:w="0"/>
-            <w:right w:type="dxa" w:w="0"/>
-          </w:tcMar>
-        </w:tcPr>
-        <w:p>
-          <w:pPr>
-            <w:spacing w:after="0" w:before="0" w:line="20"/>
-          </w:pPr>
-          <w:r>
-            <w:rPr>
-              <w:sz w:val="2"/>
-              <w:szCs w:val="2"/>
-            </w:rPr>
-            <w:t xml:space="preserve"> </w:t>
-          </w:r>
-        </w:p>
-      </w:tc>
-    </w:tr>
-  </w:tbl>
-  <w:tbl>
-    <w:tblPr>
-      <w:tblW w:type="dxa" w:w="10771"/>
-      <w:tblBorders>
-        <w:top w:val="none"/>
-        <w:left w:val="none"/>
-        <w:bottom w:val="single" w:color="CBD5E1" w:sz="8"/>
-        <w:right w:val="none"/>
-        <w:insideH w:val="none"/>
-        <w:insideV w:val="none"/>
-      </w:tblBorders>
-    </w:tblPr>
-    <w:tblGrid>
-      <w:gridCol w:w="100"/>
-      <w:gridCol w:w="100"/>
-      <w:gridCol w:w="100"/>
-    </w:tblGrid>
-    <w:tr>
-      <w:tc>
-        <w:tcPr>
-          <w:tcW w:type="dxa" w:w="1020"/>
-          <w:tcMar>
-            <w:top w:type="dxa" w:w="20"/>
-            <w:left w:type="dxa" w:w="0"/>
-            <w:bottom w:type="dxa" w:w="20"/>
-            <w:right w:type="dxa" w:w="30"/>
-          </w:tcMar>
-          <w:vAlign w:val="center"/>
-        </w:tcPr>
-        <w:p>
-          <w:pPr>
-            <w:spacing w:after="0" w:before="0"/>
-          </w:pPr>
-          <w:r>
-            <w:drawing>
-              <wp:inline distT="0" distB="0" distL="0" distR="0">
-                <wp:extent cx="438150" cy="438150"/>
-                <wp:effectExtent t="0" r="0" b="0" l="0"/>
-                <wp:docPr id="1" name="" descr="" title=""/>
-                <wp:cNvGraphicFramePr>
-                  <a:graphicFrameLocks xmlns:a="http://schemas.openxmlformats.org/drawingml/2006/main" noChangeAspect="1"/>
-                </wp:cNvGraphicFramePr>
-                <a:graphic xmlns:a="http://schemas.openxmlformats.org/drawingml/2006/main">
-                  <a:graphicData uri="http://schemas.openxmlformats.org/drawingml/2006/picture">
-                    <pic:pic xmlns:pic="http://schemas.openxmlformats.org/drawingml/2006/picture">
-                      <pic:nvPicPr>
-                        <pic:cNvPr id="0" name="" descr=""/>
-                        <pic:cNvPicPr>
-                          <a:picLocks noChangeAspect="1" noChangeArrowheads="1"/>
-                        </pic:cNvPicPr>
-                      </pic:nvPicPr>
-                      <pic:blipFill>
-                        <a:blip r:embed="rId0" cstate="none"/>
-                        <a:srcRect/>
-                        <a:stretch>
-                          <a:fillRect/>
-                        </a:stretch>
-                      </pic:blipFill>
-                      <pic:spPr bwMode="auto">
-                        <a:xfrm>
-                          <a:off x="0" y="0"/>
-                          <a:ext cx="438150" cy="438150"/>
-                        </a:xfrm>
-                        <a:prstGeom prst="rect">
-                          <a:avLst/>
-                        </a:prstGeom>
-                      </pic:spPr>
-                    </pic:pic>
-                  </a:graphicData>
-                </a:graphic>
-              </wp:inline>
-            </w:drawing>
-          </w:r>
-        </w:p>
-      </w:tc>
-      <w:tc>
-        <w:tcPr>
-          <w:tcW w:type="dxa" w:w="7483"/>
-          <w:tcMar>
-            <w:top w:type="dxa" w:w="15"/>
-            <w:left w:type="dxa" w:w="40"/>
-            <w:bottom w:type="dxa" w:w="15"/>
-            <w:right w:type="dxa" w:w="40"/>
-          </w:tcMar>
-          <w:vAlign w:val="center"/>
-        </w:tcPr>
-        <w:p>
-          <w:pPr>
-            <w:spacing w:after="15" w:before="0" w:line="240"/>
-          </w:pPr>
-          <w:r>
-            <w:rPr>
-              <w:rFonts w:ascii="Arial" w:cs="Arial" w:eastAsia="Arial" w:hAnsi="Arial"/>
-              <w:b/>
-              <w:bCs/>
-              <w:color w:val="0C2340"/>
-              <w:sz w:val="22"/>
-              <w:szCs w:val="22"/>
-            </w:rPr>
-            <w:t xml:space="preserve">LADY GREY ARTS ACADEMY</w:t>
-          </w:r>
-        </w:p>
-        <w:p>
-          <w:pPr>
-            <w:spacing w:after="15" w:before="0" w:line="240"/>
-          </w:pPr>
-          <w:r>
-            <w:rPr>
-              <w:rFonts w:ascii="Arial" w:cs="Arial" w:eastAsia="Arial" w:hAnsi="Arial"/>
-              <w:b/>
-              <w:bCs/>
-              <w:color w:val="A6192E"/>
-              <w:sz w:val="17"/>
-              <w:szCs w:val="17"/>
-            </w:rPr>
-            <w:t xml:space="preserve">Where Learning is an Art</w:t>
-          </w:r>
-        </w:p>
-        <w:p>
-          <w:pPr>
-            <w:spacing w:after="10" w:before="0" w:line="220"/>
-          </w:pPr>
-          <w:r>
-            <w:rPr>
-              <w:rFonts w:ascii="Arial" w:cs="Arial" w:eastAsia="Arial" w:hAnsi="Arial"/>
-              <w:color w:val="475569"/>
-              <w:sz w:val="15"/>
-              <w:szCs w:val="15"/>
-            </w:rPr>
-            <w:t xml:space="preserve">18 Brummer Street, Lady Grey, 9755 | Tel: 051 603 0046</w:t>
-          </w:r>
-        </w:p>
-        <w:p>
-          <w:pPr>
-            <w:spacing w:after="0" w:before="0" w:line="200"/>
-          </w:pPr>
-          <w:r>
-            <w:rPr>
-              <w:rFonts w:ascii="Arial" w:cs="Arial" w:eastAsia="Arial" w:hAnsi="Arial"/>
-              <w:color w:val="475569"/>
-              <w:sz w:val="14"/>
-              <w:szCs w:val="14"/>
-            </w:rPr>
-            <w:t xml:space="preserve">EMIS: 200600985</w:t>
-          </w:r>
-        </w:p>
-      </w:tc>
-      <w:tc>
-        <w:tcPr>
-          <w:tcW w:type="dxa" w:w="2267"/>
-          <w:tcBorders>
-            <w:top w:val="none"/>
-            <w:left w:val="single" w:color="0C2340" w:sz="18"/>
-            <w:bottom w:val="none"/>
-            <w:right w:val="none"/>
-          </w:tcBorders>
-          <w:tcMar>
-            <w:top w:type="dxa" w:w="15"/>
-            <w:left w:type="dxa" w:w="80"/>
-            <w:bottom w:type="dxa" w:w="15"/>
-            <w:right w:type="dxa" w:w="0"/>
-          </w:tcMar>
-          <w:vAlign w:val="center"/>
-        </w:tcPr>
-        <w:p>
-          <w:pPr>
-            <w:spacing w:after="4" w:before="0"/>
-          </w:pPr>
-          <w:r>
-            <w:rPr>
-              <w:rFonts w:ascii="Arial" w:cs="Arial" w:eastAsia="Arial" w:hAnsi="Arial"/>
-              <w:b/>
-              <w:bCs/>
-              <w:color w:val="0C2340"/>
-              <w:sz w:val="18"/>
-              <w:szCs w:val="18"/>
-            </w:rPr>
-            <w:t xml:space="preserve">SGB</w:t>
-          </w:r>
-        </w:p>
-        <w:p>
-          <w:pPr>
-            <w:spacing w:after="0" w:before="0"/>
-          </w:pPr>
-          <w:r>
-            <w:rPr>
-              <w:rFonts w:ascii="Arial" w:cs="Arial" w:eastAsia="Arial" w:hAnsi="Arial"/>
-              <w:color w:val="64748B"/>
-              <w:sz w:val="14"/>
-              <w:szCs w:val="14"/>
-            </w:rPr>
-            <w:t xml:space="preserve">NOTICE &amp; INVITATION</w:t>
-          </w:r>
-        </w:p>
-      </w:tc>
-    </w:tr>
-  </w:tbl>
-</w:hdr>
 </file>
 
 <file path=word/numbering.xml><?xml version="1.0" encoding="utf-8"?>

</xml_diff>

<commit_message>
Fix signature block: remove 'Surname, Name:' prefix and replace wrapping underscore text with clean non-wrapping solid vector border lines
</commit_message>
<xml_diff>
--- a/SGB_Functionality_Audit_2026/01_SGB_Constitution/01_Meeting_Notice_and_Invitation_2026-01-19.docx
+++ b/SGB_Functionality_Audit_2026/01_SGB_Constitution/01_Meeting_Notice_and_Invitation_2026-01-19.docx
@@ -1429,7 +1429,7 @@
           <w:tcPr>
             <w:tcW w:type="dxa" w:w="5385"/>
             <w:tcMar>
-              <w:top w:type="dxa" w:w="160"/>
+              <w:top w:type="dxa" w:w="140"/>
               <w:left w:type="dxa" w:w="40"/>
               <w:bottom w:type="dxa" w:w="40"/>
               <w:right w:type="dxa" w:w="40"/>
@@ -1438,22 +1438,24 @@
           <w:p>
             <w:pPr>
               <w:keepLines/>
+              <w:pBdr>
+                <w:bottom w:val="single" w:color="64748B" w:sz="6"/>
+              </w:pBdr>
               <w:spacing w:after="20" w:before="0"/>
             </w:pPr>
             <w:r>
               <w:rPr>
                 <w:rFonts w:ascii="Arial" w:cs="Arial" w:eastAsia="Arial" w:hAnsi="Arial"/>
-                <w:color w:val="64748B"/>
-                <w:sz w:val="20"/>
-                <w:szCs w:val="20"/>
-              </w:rPr>
-              <w:t xml:space="preserve">__________________________________</w:t>
+                <w:sz w:val="2"/>
+                <w:szCs w:val="2"/>
+              </w:rPr>
+              <w:t xml:space="preserve"/>
             </w:r>
           </w:p>
           <w:p>
             <w:pPr>
               <w:keepLines/>
-              <w:spacing w:after="60" w:before="0"/>
+              <w:spacing w:after="50" w:before="0"/>
             </w:pPr>
             <w:r>
               <w:rPr>
@@ -1470,22 +1472,16 @@
           <w:p>
             <w:pPr>
               <w:keepLines/>
-              <w:spacing w:after="30" w:before="0"/>
+              <w:spacing w:after="20" w:before="0"/>
             </w:pPr>
             <w:r>
               <w:rPr>
                 <w:rFonts w:ascii="Arial" w:cs="Arial" w:eastAsia="Arial" w:hAnsi="Arial"/>
-                <w:sz w:val="19"/>
-                <w:szCs w:val="19"/>
-              </w:rPr>
-              <w:t xml:space="preserve">Surname, Name: </w:t>
-            </w:r>
-            <w:r>
-              <w:rPr>
-                <w:rFonts w:ascii="Arial" w:cs="Arial" w:eastAsia="Arial" w:hAnsi="Arial"/>
+                <w:b/>
+                <w:bCs/>
                 <w:color w:val="1A1A1A"/>
-                <w:sz w:val="19"/>
-                <w:szCs w:val="19"/>
+                <w:sz w:val="20"/>
+                <w:szCs w:val="20"/>
               </w:rPr>
               <w:t xml:space="preserve">Mr. K. Dyasi</w:t>
             </w:r>
@@ -1493,7 +1489,7 @@
           <w:p>
             <w:pPr>
               <w:keepLines/>
-              <w:spacing w:after="0" w:before="0"/>
+              <w:spacing w:after="30" w:before="0"/>
             </w:pPr>
             <w:r>
               <w:rPr>
@@ -1510,24 +1506,16 @@
           <w:p>
             <w:pPr>
               <w:keepLines/>
-              <w:spacing w:after="0" w:before="140"/>
+              <w:spacing w:after="0" w:before="40"/>
             </w:pPr>
             <w:r>
               <w:rPr>
                 <w:rFonts w:ascii="Arial" w:cs="Arial" w:eastAsia="Arial" w:hAnsi="Arial"/>
+                <w:color w:val="64748B"/>
                 <w:sz w:val="18"/>
                 <w:szCs w:val="18"/>
               </w:rPr>
-              <w:t xml:space="preserve">Date: </w:t>
-            </w:r>
-            <w:r>
-              <w:rPr>
-                <w:rFonts w:ascii="Arial" w:cs="Arial" w:eastAsia="Arial" w:hAnsi="Arial"/>
-                <w:color w:val="1A1A1A"/>
-                <w:sz w:val="18"/>
-                <w:szCs w:val="18"/>
-              </w:rPr>
-              <w:t xml:space="preserve">19/01/2026</w:t>
+              <w:t xml:space="preserve">Date: 19/01/2026</w:t>
             </w:r>
           </w:p>
         </w:tc>
@@ -1535,7 +1523,7 @@
           <w:tcPr>
             <w:tcW w:type="dxa" w:w="5385"/>
             <w:tcMar>
-              <w:top w:type="dxa" w:w="160"/>
+              <w:top w:type="dxa" w:w="140"/>
               <w:left w:type="dxa" w:w="40"/>
               <w:bottom w:type="dxa" w:w="40"/>
               <w:right w:type="dxa" w:w="40"/>
@@ -1544,22 +1532,24 @@
           <w:p>
             <w:pPr>
               <w:keepLines/>
+              <w:pBdr>
+                <w:bottom w:val="single" w:color="64748B" w:sz="6"/>
+              </w:pBdr>
               <w:spacing w:after="20" w:before="0"/>
             </w:pPr>
             <w:r>
               <w:rPr>
                 <w:rFonts w:ascii="Arial" w:cs="Arial" w:eastAsia="Arial" w:hAnsi="Arial"/>
-                <w:color w:val="64748B"/>
-                <w:sz w:val="20"/>
-                <w:szCs w:val="20"/>
-              </w:rPr>
-              <w:t xml:space="preserve">__________________________________</w:t>
+                <w:sz w:val="2"/>
+                <w:szCs w:val="2"/>
+              </w:rPr>
+              <w:t xml:space="preserve"/>
             </w:r>
           </w:p>
           <w:p>
             <w:pPr>
               <w:keepLines/>
-              <w:spacing w:after="60" w:before="0"/>
+              <w:spacing w:after="50" w:before="0"/>
             </w:pPr>
             <w:r>
               <w:rPr>
@@ -1576,22 +1566,16 @@
           <w:p>
             <w:pPr>
               <w:keepLines/>
-              <w:spacing w:after="30" w:before="0"/>
+              <w:spacing w:after="20" w:before="0"/>
             </w:pPr>
             <w:r>
               <w:rPr>
                 <w:rFonts w:ascii="Arial" w:cs="Arial" w:eastAsia="Arial" w:hAnsi="Arial"/>
-                <w:sz w:val="19"/>
-                <w:szCs w:val="19"/>
-              </w:rPr>
-              <w:t xml:space="preserve">Surname, Name: </w:t>
-            </w:r>
-            <w:r>
-              <w:rPr>
-                <w:rFonts w:ascii="Arial" w:cs="Arial" w:eastAsia="Arial" w:hAnsi="Arial"/>
+                <w:b/>
+                <w:bCs/>
                 <w:color w:val="1A1A1A"/>
-                <w:sz w:val="19"/>
-                <w:szCs w:val="19"/>
+                <w:sz w:val="20"/>
+                <w:szCs w:val="20"/>
               </w:rPr>
               <w:t xml:space="preserve">Ms. M. Botha</w:t>
             </w:r>
@@ -1599,7 +1583,7 @@
           <w:p>
             <w:pPr>
               <w:keepLines/>
-              <w:spacing w:after="0" w:before="0"/>
+              <w:spacing w:after="30" w:before="0"/>
             </w:pPr>
             <w:r>
               <w:rPr>
@@ -1616,24 +1600,16 @@
           <w:p>
             <w:pPr>
               <w:keepLines/>
-              <w:spacing w:after="0" w:before="140"/>
+              <w:spacing w:after="0" w:before="40"/>
             </w:pPr>
             <w:r>
               <w:rPr>
                 <w:rFonts w:ascii="Arial" w:cs="Arial" w:eastAsia="Arial" w:hAnsi="Arial"/>
+                <w:color w:val="64748B"/>
                 <w:sz w:val="18"/>
                 <w:szCs w:val="18"/>
               </w:rPr>
-              <w:t xml:space="preserve">Date: </w:t>
-            </w:r>
-            <w:r>
-              <w:rPr>
-                <w:rFonts w:ascii="Arial" w:cs="Arial" w:eastAsia="Arial" w:hAnsi="Arial"/>
-                <w:color w:val="1A1A1A"/>
-                <w:sz w:val="18"/>
-                <w:szCs w:val="18"/>
-              </w:rPr>
-              <w:t xml:space="preserve">19/01/2026</w:t>
+              <w:t xml:space="preserve">Date: 19/01/2026</w:t>
             </w:r>
           </w:p>
         </w:tc>

</xml_diff>

<commit_message>
Keep signature heading and block together atomically, shorten signature lines, move running titles to header, and format footers strictly as X/Y across all audit files
</commit_message>
<xml_diff>
--- a/SGB_Functionality_Audit_2026/01_SGB_Constitution/01_Meeting_Notice_and_Invitation_2026-01-19.docx
+++ b/SGB_Functionality_Audit_2026/01_SGB_Constitution/01_Meeting_Notice_and_Invitation_2026-01-19.docx
@@ -129,7 +129,7 @@
                           </pic:cNvPicPr>
                         </pic:nvPicPr>
                         <pic:blipFill>
-                          <a:blip r:embed="rId8" cstate="none"/>
+                          <a:blip r:embed="rId9" cstate="none"/>
                           <a:srcRect/>
                           <a:stretch>
                             <a:fillRect/>
@@ -701,7 +701,7 @@
         <w:tabs>
           <w:tab w:val="left" w:pos="566"/>
         </w:tabs>
-        <w:spacing w:after="100" w:before="240"/>
+        <w:spacing w:after="80" w:before="0"/>
         <w:ind w:left="0"/>
       </w:pPr>
       <w:r>
@@ -740,7 +740,7 @@
         <w:tabs>
           <w:tab w:val="left" w:pos="566"/>
         </w:tabs>
-        <w:spacing w:after="90" w:before="70" w:line="276"/>
+        <w:spacing w:after="80" w:before="0" w:line="276"/>
         <w:ind w:left="566" w:hanging="566"/>
         <w:jc w:val="both"/>
       </w:pPr>
@@ -780,7 +780,7 @@
         <w:tabs>
           <w:tab w:val="left" w:pos="566"/>
         </w:tabs>
-        <w:spacing w:after="90" w:before="70" w:line="276"/>
+        <w:spacing w:after="80" w:before="0" w:line="276"/>
         <w:ind w:left="566" w:hanging="566"/>
         <w:jc w:val="both"/>
       </w:pPr>
@@ -820,7 +820,7 @@
         <w:tabs>
           <w:tab w:val="left" w:pos="566"/>
         </w:tabs>
-        <w:spacing w:after="90" w:before="70" w:line="276"/>
+        <w:spacing w:after="80" w:before="0" w:line="276"/>
         <w:ind w:left="566" w:hanging="566"/>
         <w:jc w:val="both"/>
       </w:pPr>
@@ -860,7 +860,7 @@
         <w:tabs>
           <w:tab w:val="left" w:pos="566"/>
         </w:tabs>
-        <w:spacing w:after="90" w:before="70" w:line="276"/>
+        <w:spacing w:after="80" w:before="0" w:line="276"/>
         <w:ind w:left="566" w:hanging="566"/>
         <w:jc w:val="both"/>
       </w:pPr>
@@ -900,7 +900,7 @@
         <w:tabs>
           <w:tab w:val="left" w:pos="566"/>
         </w:tabs>
-        <w:spacing w:after="90" w:before="70" w:line="276"/>
+        <w:spacing w:after="80" w:before="0" w:line="276"/>
         <w:ind w:left="566" w:hanging="566"/>
         <w:jc w:val="both"/>
       </w:pPr>
@@ -940,7 +940,7 @@
         <w:tabs>
           <w:tab w:val="left" w:pos="566"/>
         </w:tabs>
-        <w:spacing w:after="100" w:before="240"/>
+        <w:spacing w:after="80" w:before="0"/>
         <w:ind w:left="0"/>
       </w:pPr>
       <w:r>
@@ -979,7 +979,7 @@
         <w:tabs>
           <w:tab w:val="left" w:pos="566"/>
         </w:tabs>
-        <w:spacing w:after="90" w:before="70" w:line="276"/>
+        <w:spacing w:after="80" w:before="0" w:line="276"/>
         <w:ind w:left="566" w:hanging="566"/>
         <w:jc w:val="both"/>
       </w:pPr>
@@ -1019,7 +1019,7 @@
         <w:tabs>
           <w:tab w:val="left" w:pos="566"/>
         </w:tabs>
-        <w:spacing w:after="90" w:before="70" w:line="276"/>
+        <w:spacing w:after="80" w:before="0" w:line="276"/>
         <w:ind w:left="566" w:hanging="566"/>
         <w:jc w:val="both"/>
       </w:pPr>
@@ -1059,7 +1059,7 @@
         <w:tabs>
           <w:tab w:val="left" w:pos="566"/>
         </w:tabs>
-        <w:spacing w:after="90" w:before="70" w:line="276"/>
+        <w:spacing w:after="80" w:before="0" w:line="276"/>
         <w:ind w:left="566" w:hanging="566"/>
         <w:jc w:val="both"/>
       </w:pPr>
@@ -1099,7 +1099,7 @@
         <w:tabs>
           <w:tab w:val="left" w:pos="566"/>
         </w:tabs>
-        <w:spacing w:after="100" w:before="240"/>
+        <w:spacing w:after="80" w:before="0"/>
         <w:ind w:left="0"/>
       </w:pPr>
       <w:r>
@@ -1138,7 +1138,7 @@
         <w:tabs>
           <w:tab w:val="left" w:pos="566"/>
         </w:tabs>
-        <w:spacing w:after="90" w:before="70" w:line="276"/>
+        <w:spacing w:after="80" w:before="0" w:line="276"/>
         <w:ind w:left="566" w:hanging="566"/>
         <w:jc w:val="both"/>
       </w:pPr>
@@ -1178,7 +1178,7 @@
         <w:tabs>
           <w:tab w:val="left" w:pos="566"/>
         </w:tabs>
-        <w:spacing w:after="90" w:before="70" w:line="276"/>
+        <w:spacing w:after="80" w:before="0" w:line="276"/>
         <w:ind w:left="566" w:hanging="566"/>
         <w:jc w:val="both"/>
       </w:pPr>
@@ -1218,7 +1218,7 @@
         <w:tabs>
           <w:tab w:val="left" w:pos="566"/>
         </w:tabs>
-        <w:spacing w:after="90" w:before="70" w:line="276"/>
+        <w:spacing w:after="80" w:before="0" w:line="276"/>
         <w:ind w:left="566" w:hanging="566"/>
         <w:jc w:val="both"/>
       </w:pPr>
@@ -1258,7 +1258,7 @@
         <w:tabs>
           <w:tab w:val="left" w:pos="566"/>
         </w:tabs>
-        <w:spacing w:after="100" w:before="240"/>
+        <w:spacing w:after="80" w:before="0"/>
         <w:ind w:left="0"/>
       </w:pPr>
       <w:r>
@@ -1297,7 +1297,7 @@
         <w:tabs>
           <w:tab w:val="left" w:pos="566"/>
         </w:tabs>
-        <w:spacing w:after="90" w:before="70" w:line="276"/>
+        <w:spacing w:after="80" w:before="0" w:line="276"/>
         <w:ind w:left="566" w:hanging="566"/>
         <w:jc w:val="both"/>
       </w:pPr>
@@ -1337,7 +1337,7 @@
         <w:tabs>
           <w:tab w:val="left" w:pos="566"/>
         </w:tabs>
-        <w:spacing w:after="90" w:before="70" w:line="276"/>
+        <w:spacing w:after="80" w:before="0" w:line="276"/>
         <w:ind w:left="566" w:hanging="566"/>
         <w:jc w:val="both"/>
       </w:pPr>
@@ -1370,39 +1370,6 @@
           <w:szCs w:val="20"/>
         </w:rPr>
         <w:t xml:space="preserve">Members unable to attend must submit a formal written apology with reasons to the Secretary not later than 24 hours prior to the meeting.</w:t>
-      </w:r>
-    </w:p>
-    <w:p>
-      <w:pPr>
-        <w:keepLines/>
-        <w:spacing w:after="100" w:before="260"/>
-      </w:pPr>
-      <w:r>
-        <w:rPr>
-          <w:rFonts w:ascii="Arial" w:cs="Arial" w:eastAsia="Arial" w:hAnsi="Arial"/>
-          <w:b/>
-          <w:bCs/>
-          <w:color w:val="0C2340"/>
-          <w:sz w:val="22"/>
-          <w:szCs w:val="22"/>
-        </w:rPr>
-        <w:t xml:space="preserve">ISSUED ON BEHALF OF THE SCHOOL GOVERNING BODY</w:t>
-      </w:r>
-    </w:p>
-    <w:p>
-      <w:pPr>
-        <w:keepLines/>
-        <w:spacing w:after="140" w:before="60" w:line="276"/>
-        <w:jc w:val="both"/>
-      </w:pPr>
-      <w:r>
-        <w:rPr>
-          <w:rFonts w:ascii="Arial" w:cs="Arial" w:eastAsia="Arial" w:hAnsi="Arial"/>
-          <w:color w:val="1A1A1A"/>
-          <w:sz w:val="20"/>
-          <w:szCs w:val="20"/>
-        </w:rPr>
-        <w:t xml:space="preserve">By order of the Executive Committee of the School Governing Body of Lady Grey Arts Academy:</w:t>
       </w:r>
     </w:p>
     <w:tbl>
@@ -1427,35 +1394,100 @@
         </w:trPr>
         <w:tc>
           <w:tcPr>
+            <w:tcW w:type="dxa" w:w="10771"/>
+            <w:gridSpan w:val="2"/>
+            <w:tcMar>
+              <w:top w:type="dxa" w:w="160"/>
+              <w:left w:type="dxa" w:w="0"/>
+              <w:bottom w:type="dxa" w:w="40"/>
+              <w:right w:type="dxa" w:w="0"/>
+            </w:tcMar>
+          </w:tcPr>
+          <w:p>
+            <w:pPr>
+              <w:keepLines/>
+              <w:spacing w:after="40" w:before="160"/>
+            </w:pPr>
+            <w:r>
+              <w:rPr>
+                <w:rFonts w:ascii="Arial" w:cs="Arial" w:eastAsia="Arial" w:hAnsi="Arial"/>
+                <w:b/>
+                <w:bCs/>
+                <w:color w:val="0C2340"/>
+                <w:sz w:val="22"/>
+                <w:szCs w:val="22"/>
+              </w:rPr>
+              <w:t xml:space="preserve">ISSUED ON BEHALF OF THE SCHOOL GOVERNING BODY</w:t>
+            </w:r>
+          </w:p>
+        </w:tc>
+      </w:tr>
+      <w:tr>
+        <w:trPr>
+          <w:cantSplit/>
+        </w:trPr>
+        <w:tc>
+          <w:tcPr>
+            <w:tcW w:type="dxa" w:w="10771"/>
+            <w:gridSpan w:val="2"/>
+            <w:tcMar>
+              <w:top w:type="dxa" w:w="20"/>
+              <w:left w:type="dxa" w:w="0"/>
+              <w:bottom w:type="dxa" w:w="80"/>
+              <w:right w:type="dxa" w:w="0"/>
+            </w:tcMar>
+          </w:tcPr>
+          <w:p>
+            <w:pPr>
+              <w:keepLines/>
+              <w:spacing w:after="80" w:before="20" w:line="276"/>
+              <w:jc w:val="both"/>
+            </w:pPr>
+            <w:r>
+              <w:rPr>
+                <w:rFonts w:ascii="Arial" w:cs="Arial" w:eastAsia="Arial" w:hAnsi="Arial"/>
+                <w:color w:val="1A1A1A"/>
+                <w:sz w:val="20"/>
+                <w:szCs w:val="20"/>
+              </w:rPr>
+              <w:t xml:space="preserve">By order of the Executive Committee of the School Governing Body of Lady Grey Arts Academy:</w:t>
+            </w:r>
+          </w:p>
+        </w:tc>
+      </w:tr>
+      <w:tr>
+        <w:trPr>
+          <w:cantSplit/>
+        </w:trPr>
+        <w:tc>
+          <w:tcPr>
             <w:tcW w:type="dxa" w:w="5385"/>
             <w:tcMar>
-              <w:top w:type="dxa" w:w="140"/>
-              <w:left w:type="dxa" w:w="40"/>
+              <w:top w:type="dxa" w:w="80"/>
+              <w:left w:type="dxa" w:w="20"/>
               <w:bottom w:type="dxa" w:w="40"/>
-              <w:right w:type="dxa" w:w="40"/>
+              <w:right w:type="dxa" w:w="20"/>
             </w:tcMar>
           </w:tcPr>
           <w:p>
             <w:pPr>
               <w:keepLines/>
-              <w:pBdr>
-                <w:bottom w:val="single" w:color="64748B" w:sz="6"/>
-              </w:pBdr>
-              <w:spacing w:after="20" w:before="0"/>
+              <w:spacing w:after="10" w:before="0"/>
             </w:pPr>
             <w:r>
               <w:rPr>
                 <w:rFonts w:ascii="Arial" w:cs="Arial" w:eastAsia="Arial" w:hAnsi="Arial"/>
-                <w:sz w:val="2"/>
-                <w:szCs w:val="2"/>
-              </w:rPr>
-              <w:t xml:space="preserve"/>
+                <w:color w:val="64748B"/>
+                <w:sz w:val="20"/>
+                <w:szCs w:val="20"/>
+              </w:rPr>
+              <w:t xml:space="preserve">_________________________</w:t>
             </w:r>
           </w:p>
           <w:p>
             <w:pPr>
               <w:keepLines/>
-              <w:spacing w:after="50" w:before="0"/>
+              <w:spacing w:after="40" w:before="0"/>
             </w:pPr>
             <w:r>
               <w:rPr>
@@ -1506,7 +1538,7 @@
           <w:p>
             <w:pPr>
               <w:keepLines/>
-              <w:spacing w:after="0" w:before="40"/>
+              <w:spacing w:after="0" w:before="30"/>
             </w:pPr>
             <w:r>
               <w:rPr>
@@ -1523,33 +1555,31 @@
           <w:tcPr>
             <w:tcW w:type="dxa" w:w="5385"/>
             <w:tcMar>
-              <w:top w:type="dxa" w:w="140"/>
-              <w:left w:type="dxa" w:w="40"/>
+              <w:top w:type="dxa" w:w="80"/>
+              <w:left w:type="dxa" w:w="20"/>
               <w:bottom w:type="dxa" w:w="40"/>
-              <w:right w:type="dxa" w:w="40"/>
+              <w:right w:type="dxa" w:w="20"/>
             </w:tcMar>
           </w:tcPr>
           <w:p>
             <w:pPr>
               <w:keepLines/>
-              <w:pBdr>
-                <w:bottom w:val="single" w:color="64748B" w:sz="6"/>
-              </w:pBdr>
-              <w:spacing w:after="20" w:before="0"/>
+              <w:spacing w:after="10" w:before="0"/>
             </w:pPr>
             <w:r>
               <w:rPr>
                 <w:rFonts w:ascii="Arial" w:cs="Arial" w:eastAsia="Arial" w:hAnsi="Arial"/>
-                <w:sz w:val="2"/>
-                <w:szCs w:val="2"/>
-              </w:rPr>
-              <w:t xml:space="preserve"/>
+                <w:color w:val="64748B"/>
+                <w:sz w:val="20"/>
+                <w:szCs w:val="20"/>
+              </w:rPr>
+              <w:t xml:space="preserve">_________________________</w:t>
             </w:r>
           </w:p>
           <w:p>
             <w:pPr>
               <w:keepLines/>
-              <w:spacing w:after="50" w:before="0"/>
+              <w:spacing w:after="40" w:before="0"/>
             </w:pPr>
             <w:r>
               <w:rPr>
@@ -1600,7 +1630,7 @@
           <w:p>
             <w:pPr>
               <w:keepLines/>
-              <w:spacing w:after="0" w:before="40"/>
+              <w:spacing w:after="0" w:before="30"/>
             </w:pPr>
             <w:r>
               <w:rPr>
@@ -1616,7 +1646,8 @@
       </w:tr>
     </w:tbl>
     <w:sectPr>
-      <w:footerReference w:type="default" r:id="rId7"/>
+      <w:headerReference w:type="default" r:id="rId7"/>
+      <w:footerReference w:type="default" r:id="rId8"/>
       <w:pgSz w:w="11905" w:h="16837" w:orient="portrait"/>
       <w:pgMar w:top="566" w:right="566" w:bottom="566" w:left="566" w:header="453" w:footer="453" w:gutter="0"/>
       <w:pgNumType/>
@@ -1684,24 +1715,6 @@
         <w:sz w:val="17"/>
         <w:szCs w:val="17"/>
       </w:rPr>
-      <w:t xml:space="preserve">LGAA SGB MEETING NOTICE • 28 JAN 2026   </w:t>
-    </w:r>
-    <w:r>
-      <w:rPr>
-        <w:rFonts w:ascii="Arial" w:cs="Arial" w:eastAsia="Arial" w:hAnsi="Arial"/>
-        <w:color w:val="64748B"/>
-        <w:sz w:val="17"/>
-        <w:szCs w:val="17"/>
-      </w:rPr>
-      <w:t xml:space="preserve">Page </w:t>
-    </w:r>
-    <w:r>
-      <w:rPr>
-        <w:rFonts w:ascii="Arial" w:cs="Arial" w:eastAsia="Arial" w:hAnsi="Arial"/>
-        <w:color w:val="64748B"/>
-        <w:sz w:val="17"/>
-        <w:szCs w:val="17"/>
-      </w:rPr>
       <w:fldChar w:fldCharType="begin"/>
       <w:instrText xml:space="preserve">PAGE</w:instrText>
       <w:fldChar w:fldCharType="separate"/>
@@ -1714,7 +1727,7 @@
         <w:sz w:val="17"/>
         <w:szCs w:val="17"/>
       </w:rPr>
-      <w:t xml:space="preserve"> of </w:t>
+      <w:t xml:space="preserve"> / </w:t>
     </w:r>
     <w:r>
       <w:rPr>
@@ -1767,6 +1780,45 @@
     </w:p>
   </w:footnote>
 </w:footnotes>
+</file>
+
+<file path=word/header1.xml><?xml version="1.0" encoding="utf-8"?>
+<w:hdr xmlns:wpc="http://schemas.microsoft.com/office/word/2010/wordprocessingCanvas" xmlns:mc="http://schemas.openxmlformats.org/markup-compatibility/2006" xmlns:o="urn:schemas-microsoft-com:office:office" xmlns:r="http://schemas.openxmlformats.org/officeDocument/2006/relationships" xmlns:m="http://schemas.openxmlformats.org/officeDocument/2006/math" xmlns:v="urn:schemas-microsoft-com:vml" xmlns:wp14="http://schemas.microsoft.com/office/word/2010/wordprocessingDrawing" xmlns:wp="http://schemas.openxmlformats.org/drawingml/2006/wordprocessingDrawing" xmlns:w10="urn:schemas-microsoft-com:office:word" xmlns:w="http://schemas.openxmlformats.org/wordprocessingml/2006/main" xmlns:w14="http://schemas.microsoft.com/office/word/2010/wordml" xmlns:w15="http://schemas.microsoft.com/office/word/2012/wordml" xmlns:wpg="http://schemas.microsoft.com/office/word/2010/wordprocessingGroup" xmlns:wpi="http://schemas.microsoft.com/office/word/2010/wordprocessingInk" xmlns:wne="http://schemas.microsoft.com/office/word/2006/wordml" xmlns:wps="http://schemas.microsoft.com/office/word/2010/wordprocessingShape" xmlns:cx="http://schemas.microsoft.com/office/drawing/2014/chartex" xmlns:cx1="http://schemas.microsoft.com/office/drawing/2015/9/8/chartex" xmlns:cx2="http://schemas.microsoft.com/office/drawing/2015/10/21/chartex" xmlns:cx3="http://schemas.microsoft.com/office/drawing/2016/5/9/chartex" xmlns:cx4="http://schemas.microsoft.com/office/drawing/2016/5/10/chartex" xmlns:cx5="http://schemas.microsoft.com/office/drawing/2016/5/11/chartex" xmlns:cx6="http://schemas.microsoft.com/office/drawing/2016/5/12/chartex" xmlns:cx7="http://schemas.microsoft.com/office/drawing/2016/5/13/chartex" xmlns:cx8="http://schemas.microsoft.com/office/drawing/2016/5/14/chartex" xmlns:w16cid="http://schemas.microsoft.com/office/word/2016/wordml/cid" xmlns:w16se="http://schemas.microsoft.com/office/word/2015/wordml/symex">
+  <w:p>
+    <w:pPr>
+      <w:pBdr>
+        <w:bottom w:val="single" w:color="CBD5E1" w:sz="6"/>
+      </w:pBdr>
+      <w:spacing w:after="80" w:before="0"/>
+    </w:pPr>
+    <w:r>
+      <w:rPr>
+        <w:rFonts w:ascii="Arial" w:cs="Arial" w:eastAsia="Arial" w:hAnsi="Arial"/>
+        <w:b/>
+        <w:bCs/>
+        <w:color w:val="0C2340"/>
+        <w:sz w:val="16"/>
+        <w:szCs w:val="16"/>
+      </w:rPr>
+      <w:t xml:space="preserve">LADY GREY ARTS ACADEMY • NOTICE OF ORDINARY SGB MEETING</w:t>
+    </w:r>
+    <w:r>
+      <w:rPr>
+        <w:rFonts w:ascii="Arial" w:cs="Arial" w:eastAsia="Arial" w:hAnsi="Arial"/>
+      </w:rPr>
+      <w:t xml:space="preserve">	</w:t>
+    </w:r>
+    <w:r>
+      <w:rPr>
+        <w:rFonts w:ascii="Arial" w:cs="Arial" w:eastAsia="Arial" w:hAnsi="Arial"/>
+        <w:color w:val="64748B"/>
+        <w:sz w:val="14"/>
+        <w:szCs w:val="14"/>
+      </w:rPr>
+      <w:t xml:space="preserve">SGB</w:t>
+    </w:r>
+  </w:p>
+</w:hdr>
 </file>
 
 <file path=word/numbering.xml><?xml version="1.0" encoding="utf-8"?>

</xml_diff>

<commit_message>
Modernise signature block with spacious signing zone, clean baseline, executive card structure, and well-spaced name/date fields
</commit_message>
<xml_diff>
--- a/SGB_Functionality_Audit_2026/01_SGB_Constitution/01_Meeting_Notice_and_Invitation_2026-01-19.docx
+++ b/SGB_Functionality_Audit_2026/01_SGB_Constitution/01_Meeting_Notice_and_Invitation_2026-01-19.docx
@@ -1462,49 +1462,52 @@
         <w:tc>
           <w:tcPr>
             <w:tcW w:type="dxa" w:w="5385"/>
+            <w:tcBorders>
+              <w:top w:val="single" w:color="E2E8F0" w:sz="4"/>
+              <w:left w:val="single" w:color="E2E8F0" w:sz="4"/>
+              <w:bottom w:val="single" w:color="E2E8F0" w:sz="4"/>
+              <w:right w:val="single" w:color="E2E8F0" w:sz="4"/>
+            </w:tcBorders>
+            <w:shd w:fill="F8FAFC" w:val="clear"/>
             <w:tcMar>
-              <w:top w:type="dxa" w:w="80"/>
-              <w:left w:type="dxa" w:w="20"/>
-              <w:bottom w:type="dxa" w:w="40"/>
-              <w:right w:type="dxa" w:w="20"/>
+              <w:top w:type="dxa" w:w="60"/>
+              <w:left w:type="dxa" w:w="80"/>
+              <w:bottom w:type="dxa" w:w="60"/>
+              <w:right w:type="dxa" w:w="80"/>
             </w:tcMar>
           </w:tcPr>
           <w:p>
             <w:pPr>
-              <w:keepLines/>
+              <w:spacing w:after="0" w:before="200"/>
+            </w:pPr>
+          </w:p>
+          <w:p>
+            <w:pPr>
+              <w:pBdr>
+                <w:bottom w:val="single" w:color="0C2340" w:sz="8"/>
+              </w:pBdr>
               <w:spacing w:after="10" w:before="0"/>
             </w:pPr>
-            <w:r>
-              <w:rPr>
-                <w:rFonts w:ascii="Arial" w:cs="Arial" w:eastAsia="Arial" w:hAnsi="Arial"/>
+          </w:p>
+          <w:p>
+            <w:pPr>
+              <w:spacing w:after="30" w:before="0"/>
+            </w:pPr>
+            <w:r>
+              <w:rPr>
+                <w:rFonts w:ascii="Arial" w:cs="Arial" w:eastAsia="Arial" w:hAnsi="Arial"/>
+                <w:b/>
+                <w:bCs/>
                 <w:color w:val="64748B"/>
-                <w:sz w:val="20"/>
-                <w:szCs w:val="20"/>
-              </w:rPr>
-              <w:t xml:space="preserve">_________________________</w:t>
-            </w:r>
-          </w:p>
-          <w:p>
-            <w:pPr>
-              <w:keepLines/>
-              <w:spacing w:after="40" w:before="0"/>
-            </w:pPr>
-            <w:r>
-              <w:rPr>
-                <w:rFonts w:ascii="Arial" w:cs="Arial" w:eastAsia="Arial" w:hAnsi="Arial"/>
-                <w:i/>
-                <w:iCs/>
-                <w:color w:val="64748B"/>
-                <w:sz w:val="16"/>
-                <w:szCs w:val="16"/>
-              </w:rPr>
-              <w:t xml:space="preserve">Signature</w:t>
-            </w:r>
-          </w:p>
-          <w:p>
-            <w:pPr>
-              <w:keepLines/>
-              <w:spacing w:after="20" w:before="0"/>
+                <w:sz w:val="14"/>
+                <w:szCs w:val="14"/>
+              </w:rPr>
+              <w:t xml:space="preserve">SIGNATURE</w:t>
+            </w:r>
+          </w:p>
+          <w:p>
+            <w:pPr>
+              <w:spacing w:after="15" w:before="0"/>
             </w:pPr>
             <w:r>
               <w:rPr>
@@ -1520,8 +1523,7 @@
           </w:p>
           <w:p>
             <w:pPr>
-              <w:keepLines/>
-              <w:spacing w:after="30" w:before="0"/>
+              <w:spacing w:after="20" w:before="0"/>
             </w:pPr>
             <w:r>
               <w:rPr>
@@ -1532,71 +1534,84 @@
                 <w:sz w:val="19"/>
                 <w:szCs w:val="19"/>
               </w:rPr>
-              <w:t xml:space="preserve">SGB Chairperson</w:t>
-            </w:r>
-          </w:p>
-          <w:p>
-            <w:pPr>
-              <w:keepLines/>
-              <w:spacing w:after="0" w:before="30"/>
-            </w:pPr>
-            <w:r>
-              <w:rPr>
-                <w:rFonts w:ascii="Arial" w:cs="Arial" w:eastAsia="Arial" w:hAnsi="Arial"/>
+              <w:t xml:space="preserve">SGB CHAIRPERSON</w:t>
+            </w:r>
+          </w:p>
+          <w:p>
+            <w:pPr>
+              <w:spacing w:after="0" w:before="10"/>
+            </w:pPr>
+            <w:r>
+              <w:rPr>
+                <w:rFonts w:ascii="Arial" w:cs="Arial" w:eastAsia="Arial" w:hAnsi="Arial"/>
+                <w:b/>
+                <w:bCs/>
                 <w:color w:val="64748B"/>
                 <w:sz w:val="18"/>
                 <w:szCs w:val="18"/>
               </w:rPr>
-              <w:t xml:space="preserve">Date: 19/01/2026</w:t>
+              <w:t xml:space="preserve">Date: </w:t>
+            </w:r>
+            <w:r>
+              <w:rPr>
+                <w:rFonts w:ascii="Arial" w:cs="Arial" w:eastAsia="Arial" w:hAnsi="Arial"/>
+                <w:color w:val="1A1A1A"/>
+                <w:sz w:val="18"/>
+                <w:szCs w:val="18"/>
+              </w:rPr>
+              <w:t xml:space="preserve">19/01/2026</w:t>
             </w:r>
           </w:p>
         </w:tc>
         <w:tc>
           <w:tcPr>
             <w:tcW w:type="dxa" w:w="5385"/>
+            <w:tcBorders>
+              <w:top w:val="single" w:color="E2E8F0" w:sz="4"/>
+              <w:left w:val="single" w:color="E2E8F0" w:sz="4"/>
+              <w:bottom w:val="single" w:color="E2E8F0" w:sz="4"/>
+              <w:right w:val="single" w:color="E2E8F0" w:sz="4"/>
+            </w:tcBorders>
+            <w:shd w:fill="F8FAFC" w:val="clear"/>
             <w:tcMar>
-              <w:top w:type="dxa" w:w="80"/>
-              <w:left w:type="dxa" w:w="20"/>
-              <w:bottom w:type="dxa" w:w="40"/>
-              <w:right w:type="dxa" w:w="20"/>
+              <w:top w:type="dxa" w:w="60"/>
+              <w:left w:type="dxa" w:w="80"/>
+              <w:bottom w:type="dxa" w:w="60"/>
+              <w:right w:type="dxa" w:w="80"/>
             </w:tcMar>
           </w:tcPr>
           <w:p>
             <w:pPr>
-              <w:keepLines/>
+              <w:spacing w:after="0" w:before="200"/>
+            </w:pPr>
+          </w:p>
+          <w:p>
+            <w:pPr>
+              <w:pBdr>
+                <w:bottom w:val="single" w:color="0C2340" w:sz="8"/>
+              </w:pBdr>
               <w:spacing w:after="10" w:before="0"/>
             </w:pPr>
-            <w:r>
-              <w:rPr>
-                <w:rFonts w:ascii="Arial" w:cs="Arial" w:eastAsia="Arial" w:hAnsi="Arial"/>
+          </w:p>
+          <w:p>
+            <w:pPr>
+              <w:spacing w:after="30" w:before="0"/>
+            </w:pPr>
+            <w:r>
+              <w:rPr>
+                <w:rFonts w:ascii="Arial" w:cs="Arial" w:eastAsia="Arial" w:hAnsi="Arial"/>
+                <w:b/>
+                <w:bCs/>
                 <w:color w:val="64748B"/>
-                <w:sz w:val="20"/>
-                <w:szCs w:val="20"/>
-              </w:rPr>
-              <w:t xml:space="preserve">_________________________</w:t>
-            </w:r>
-          </w:p>
-          <w:p>
-            <w:pPr>
-              <w:keepLines/>
-              <w:spacing w:after="40" w:before="0"/>
-            </w:pPr>
-            <w:r>
-              <w:rPr>
-                <w:rFonts w:ascii="Arial" w:cs="Arial" w:eastAsia="Arial" w:hAnsi="Arial"/>
-                <w:i/>
-                <w:iCs/>
-                <w:color w:val="64748B"/>
-                <w:sz w:val="16"/>
-                <w:szCs w:val="16"/>
-              </w:rPr>
-              <w:t xml:space="preserve">Signature</w:t>
-            </w:r>
-          </w:p>
-          <w:p>
-            <w:pPr>
-              <w:keepLines/>
-              <w:spacing w:after="20" w:before="0"/>
+                <w:sz w:val="14"/>
+                <w:szCs w:val="14"/>
+              </w:rPr>
+              <w:t xml:space="preserve">SIGNATURE</w:t>
+            </w:r>
+          </w:p>
+          <w:p>
+            <w:pPr>
+              <w:spacing w:after="15" w:before="0"/>
             </w:pPr>
             <w:r>
               <w:rPr>
@@ -1612,8 +1627,7 @@
           </w:p>
           <w:p>
             <w:pPr>
-              <w:keepLines/>
-              <w:spacing w:after="30" w:before="0"/>
+              <w:spacing w:after="20" w:before="0"/>
             </w:pPr>
             <w:r>
               <w:rPr>
@@ -1624,22 +1638,32 @@
                 <w:sz w:val="19"/>
                 <w:szCs w:val="19"/>
               </w:rPr>
-              <w:t xml:space="preserve">School Principal</w:t>
-            </w:r>
-          </w:p>
-          <w:p>
-            <w:pPr>
-              <w:keepLines/>
-              <w:spacing w:after="0" w:before="30"/>
-            </w:pPr>
-            <w:r>
-              <w:rPr>
-                <w:rFonts w:ascii="Arial" w:cs="Arial" w:eastAsia="Arial" w:hAnsi="Arial"/>
+              <w:t xml:space="preserve">SCHOOL PRINCIPAL</w:t>
+            </w:r>
+          </w:p>
+          <w:p>
+            <w:pPr>
+              <w:spacing w:after="0" w:before="10"/>
+            </w:pPr>
+            <w:r>
+              <w:rPr>
+                <w:rFonts w:ascii="Arial" w:cs="Arial" w:eastAsia="Arial" w:hAnsi="Arial"/>
+                <w:b/>
+                <w:bCs/>
                 <w:color w:val="64748B"/>
                 <w:sz w:val="18"/>
                 <w:szCs w:val="18"/>
               </w:rPr>
-              <w:t xml:space="preserve">Date: 19/01/2026</w:t>
+              <w:t xml:space="preserve">Date: </w:t>
+            </w:r>
+            <w:r>
+              <w:rPr>
+                <w:rFonts w:ascii="Arial" w:cs="Arial" w:eastAsia="Arial" w:hAnsi="Arial"/>
+                <w:color w:val="1A1A1A"/>
+                <w:sz w:val="18"/>
+                <w:szCs w:val="18"/>
+              </w:rPr>
+              <w:t xml:space="preserve">19/01/2026</w:t>
             </w:r>
           </w:p>
         </w:tc>

</xml_diff>

<commit_message>
Remove dark signature card background for clean white paper styling and ensure signature block always starts on a new page
</commit_message>
<xml_diff>
--- a/SGB_Functionality_Audit_2026/01_SGB_Constitution/01_Meeting_Notice_and_Invitation_2026-01-19.docx
+++ b/SGB_Functionality_Audit_2026/01_SGB_Constitution/01_Meeting_Notice_and_Invitation_2026-01-19.docx
@@ -1372,6 +1372,12 @@
         <w:t xml:space="preserve">Members unable to attend must submit a formal written apology with reasons to the Secretary not later than 24 hours prior to the meeting.</w:t>
       </w:r>
     </w:p>
+    <w:p>
+      <w:pPr>
+        <w:pageBreakBefore/>
+        <w:spacing w:after="0" w:before="0"/>
+      </w:pPr>
+    </w:p>
     <w:tbl>
       <w:tblPr>
         <w:tblW w:type="dxa" w:w="10771"/>
@@ -1463,12 +1469,11 @@
           <w:tcPr>
             <w:tcW w:type="dxa" w:w="5385"/>
             <w:tcBorders>
-              <w:top w:val="single" w:color="E2E8F0" w:sz="4"/>
-              <w:left w:val="single" w:color="E2E8F0" w:sz="4"/>
-              <w:bottom w:val="single" w:color="E2E8F0" w:sz="4"/>
-              <w:right w:val="single" w:color="E2E8F0" w:sz="4"/>
+              <w:top w:val="single" w:color="CBD5E1" w:sz="4"/>
+              <w:left w:val="single" w:color="CBD5E1" w:sz="4"/>
+              <w:bottom w:val="single" w:color="CBD5E1" w:sz="4"/>
+              <w:right w:val="single" w:color="CBD5E1" w:sz="4"/>
             </w:tcBorders>
-            <w:shd w:fill="F8FAFC" w:val="clear"/>
             <w:tcMar>
               <w:top w:type="dxa" w:w="60"/>
               <w:left w:type="dxa" w:w="80"/>
@@ -1567,12 +1572,11 @@
           <w:tcPr>
             <w:tcW w:type="dxa" w:w="5385"/>
             <w:tcBorders>
-              <w:top w:val="single" w:color="E2E8F0" w:sz="4"/>
-              <w:left w:val="single" w:color="E2E8F0" w:sz="4"/>
-              <w:bottom w:val="single" w:color="E2E8F0" w:sz="4"/>
-              <w:right w:val="single" w:color="E2E8F0" w:sz="4"/>
+              <w:top w:val="single" w:color="CBD5E1" w:sz="4"/>
+              <w:left w:val="single" w:color="CBD5E1" w:sz="4"/>
+              <w:bottom w:val="single" w:color="CBD5E1" w:sz="4"/>
+              <w:right w:val="single" w:color="CBD5E1" w:sz="4"/>
             </w:tcBorders>
-            <w:shd w:fill="F8FAFC" w:val="clear"/>
             <w:tcMar>
               <w:top w:type="dxa" w:w="60"/>
               <w:left w:type="dxa" w:w="80"/>

</xml_diff>

<commit_message>
Right-justify date field and add blank line spacing after signature label for spacious name entry across preview, DOCX, and PDF
</commit_message>
<xml_diff>
--- a/SGB_Functionality_Audit_2026/01_SGB_Constitution/01_Meeting_Notice_and_Invitation_2026-01-19.docx
+++ b/SGB_Functionality_Audit_2026/01_SGB_Constitution/01_Meeting_Notice_and_Invitation_2026-01-19.docx
@@ -1496,7 +1496,7 @@
           </w:p>
           <w:p>
             <w:pPr>
-              <w:spacing w:after="30" w:before="0"/>
+              <w:spacing w:after="90" w:before="0"/>
             </w:pPr>
             <w:r>
               <w:rPr>
@@ -1544,7 +1544,8 @@
           </w:p>
           <w:p>
             <w:pPr>
-              <w:spacing w:after="0" w:before="10"/>
+              <w:spacing w:after="0" w:before="40"/>
+              <w:jc w:val="right"/>
             </w:pPr>
             <w:r>
               <w:rPr>
@@ -1555,7 +1556,7 @@
                 <w:sz w:val="18"/>
                 <w:szCs w:val="18"/>
               </w:rPr>
-              <w:t xml:space="preserve">Date: </w:t>
+              <w:t xml:space="preserve">DATE: </w:t>
             </w:r>
             <w:r>
               <w:rPr>
@@ -1599,7 +1600,7 @@
           </w:p>
           <w:p>
             <w:pPr>
-              <w:spacing w:after="30" w:before="0"/>
+              <w:spacing w:after="90" w:before="0"/>
             </w:pPr>
             <w:r>
               <w:rPr>
@@ -1647,7 +1648,8 @@
           </w:p>
           <w:p>
             <w:pPr>
-              <w:spacing w:after="0" w:before="10"/>
+              <w:spacing w:after="0" w:before="40"/>
+              <w:jc w:val="right"/>
             </w:pPr>
             <w:r>
               <w:rPr>
@@ -1658,7 +1660,7 @@
                 <w:sz w:val="18"/>
                 <w:szCs w:val="18"/>
               </w:rPr>
-              <w:t xml:space="preserve">Date: </w:t>
+              <w:t xml:space="preserve">DATE: </w:t>
             </w:r>
             <w:r>
               <w:rPr>

</xml_diff>

<commit_message>
Add distinct horizontal and vertical spacer padding around signature boxes and prevent orphan headings across preview, DOCX, and PDF
</commit_message>
<xml_diff>
--- a/SGB_Functionality_Audit_2026/01_SGB_Constitution/01_Meeting_Notice_and_Invitation_2026-01-19.docx
+++ b/SGB_Functionality_Audit_2026/01_SGB_Constitution/01_Meeting_Notice_and_Invitation_2026-01-19.docx
@@ -1381,16 +1381,18 @@
     <w:tbl>
       <w:tblPr>
         <w:tblW w:type="dxa" w:w="10771"/>
+        <w:jc w:val="center"/>
         <w:tblBorders>
-          <w:top w:val="none"/>
-          <w:left w:val="none"/>
-          <w:bottom w:val="none"/>
-          <w:right w:val="none"/>
-          <w:insideH w:val="none"/>
-          <w:insideV w:val="none"/>
+          <w:top w:val="single" w:color="auto" w:sz="4"/>
+          <w:left w:val="single" w:color="auto" w:sz="4"/>
+          <w:bottom w:val="single" w:color="auto" w:sz="4"/>
+          <w:right w:val="single" w:color="auto" w:sz="4"/>
+          <w:insideH w:val="single" w:color="auto" w:sz="4"/>
+          <w:insideV w:val="single" w:color="auto" w:sz="4"/>
         </w:tblBorders>
       </w:tblPr>
       <w:tblGrid>
+        <w:gridCol w:w="100"/>
         <w:gridCol w:w="100"/>
         <w:gridCol w:w="100"/>
       </w:tblGrid>
@@ -1401,7 +1403,7 @@
         <w:tc>
           <w:tcPr>
             <w:tcW w:type="dxa" w:w="10771"/>
-            <w:gridSpan w:val="2"/>
+            <w:gridSpan w:val="3"/>
             <w:tcMar>
               <w:top w:type="dxa" w:w="160"/>
               <w:left w:type="dxa" w:w="0"/>
@@ -1435,7 +1437,7 @@
         <w:tc>
           <w:tcPr>
             <w:tcW w:type="dxa" w:w="10771"/>
-            <w:gridSpan w:val="2"/>
+            <w:gridSpan w:val="3"/>
             <w:tcMar>
               <w:top w:type="dxa" w:w="20"/>
               <w:left w:type="dxa" w:w="0"/>
@@ -1467,7 +1469,7 @@
         </w:trPr>
         <w:tc>
           <w:tcPr>
-            <w:tcW w:type="dxa" w:w="5385"/>
+            <w:tcW w:type="dxa" w:w="5215"/>
             <w:tcBorders>
               <w:top w:val="single" w:color="CBD5E1" w:sz="4"/>
               <w:left w:val="single" w:color="CBD5E1" w:sz="4"/>
@@ -1475,10 +1477,10 @@
               <w:right w:val="single" w:color="CBD5E1" w:sz="4"/>
             </w:tcBorders>
             <w:tcMar>
-              <w:top w:type="dxa" w:w="60"/>
-              <w:left w:type="dxa" w:w="80"/>
-              <w:bottom w:type="dxa" w:w="60"/>
-              <w:right w:type="dxa" w:w="80"/>
+              <w:top w:type="dxa" w:w="120"/>
+              <w:left w:type="dxa" w:w="140"/>
+              <w:bottom w:type="dxa" w:w="120"/>
+              <w:right w:type="dxa" w:w="140"/>
             </w:tcMar>
           </w:tcPr>
           <w:p>
@@ -1571,7 +1573,29 @@
         </w:tc>
         <w:tc>
           <w:tcPr>
-            <w:tcW w:type="dxa" w:w="5385"/>
+            <w:tcW w:type="dxa" w:w="340"/>
+            <w:tcBorders>
+              <w:top w:val="none"/>
+              <w:left w:val="none"/>
+              <w:bottom w:val="none"/>
+              <w:right w:val="none"/>
+            </w:tcBorders>
+            <w:tcMar>
+              <w:top w:type="dxa" w:w="0"/>
+              <w:left w:type="dxa" w:w="0"/>
+              <w:bottom w:type="dxa" w:w="0"/>
+              <w:right w:type="dxa" w:w="0"/>
+            </w:tcMar>
+          </w:tcPr>
+          <w:p>
+            <w:pPr>
+              <w:spacing w:after="0" w:before="0"/>
+            </w:pPr>
+          </w:p>
+        </w:tc>
+        <w:tc>
+          <w:tcPr>
+            <w:tcW w:type="dxa" w:w="5215"/>
             <w:tcBorders>
               <w:top w:val="single" w:color="CBD5E1" w:sz="4"/>
               <w:left w:val="single" w:color="CBD5E1" w:sz="4"/>
@@ -1579,10 +1603,10 @@
               <w:right w:val="single" w:color="CBD5E1" w:sz="4"/>
             </w:tcBorders>
             <w:tcMar>
-              <w:top w:type="dxa" w:w="60"/>
-              <w:left w:type="dxa" w:w="80"/>
-              <w:bottom w:type="dxa" w:w="60"/>
-              <w:right w:type="dxa" w:w="80"/>
+              <w:top w:type="dxa" w:w="120"/>
+              <w:left w:type="dxa" w:w="140"/>
+              <w:bottom w:type="dxa" w:w="120"/>
+              <w:right w:type="dxa" w:w="140"/>
             </w:tcMar>
           </w:tcPr>
           <w:p>

</xml_diff>

<commit_message>
Remove table grid borders, cell borders, and empty placeholder cells for clean frameless signature layout
</commit_message>
<xml_diff>
--- a/SGB_Functionality_Audit_2026/01_SGB_Constitution/01_Meeting_Notice_and_Invitation_2026-01-19.docx
+++ b/SGB_Functionality_Audit_2026/01_SGB_Constitution/01_Meeting_Notice_and_Invitation_2026-01-19.docx
@@ -1378,21 +1378,53 @@
         <w:spacing w:after="0" w:before="0"/>
       </w:pPr>
     </w:p>
+    <w:p>
+      <w:pPr>
+        <w:keepLines/>
+        <w:spacing w:after="40" w:before="160"/>
+      </w:pPr>
+      <w:r>
+        <w:rPr>
+          <w:rFonts w:ascii="Arial" w:cs="Arial" w:eastAsia="Arial" w:hAnsi="Arial"/>
+          <w:b/>
+          <w:bCs/>
+          <w:color w:val="0C2340"/>
+          <w:sz w:val="22"/>
+          <w:szCs w:val="22"/>
+        </w:rPr>
+        <w:t xml:space="preserve">ISSUED ON BEHALF OF THE SCHOOL GOVERNING BODY</w:t>
+      </w:r>
+    </w:p>
+    <w:p>
+      <w:pPr>
+        <w:keepLines/>
+        <w:spacing w:after="120" w:before="20" w:line="276"/>
+        <w:jc w:val="both"/>
+      </w:pPr>
+      <w:r>
+        <w:rPr>
+          <w:rFonts w:ascii="Arial" w:cs="Arial" w:eastAsia="Arial" w:hAnsi="Arial"/>
+          <w:color w:val="1A1A1A"/>
+          <w:sz w:val="20"/>
+          <w:szCs w:val="20"/>
+        </w:rPr>
+        <w:t xml:space="preserve">By order of the Executive Committee of the School Governing Body of Lady Grey Arts Academy:</w:t>
+      </w:r>
+    </w:p>
     <w:tbl>
       <w:tblPr>
         <w:tblW w:type="dxa" w:w="10771"/>
         <w:jc w:val="center"/>
         <w:tblBorders>
-          <w:top w:val="single" w:color="auto" w:sz="4"/>
-          <w:left w:val="single" w:color="auto" w:sz="4"/>
-          <w:bottom w:val="single" w:color="auto" w:sz="4"/>
-          <w:right w:val="single" w:color="auto" w:sz="4"/>
-          <w:insideH w:val="single" w:color="auto" w:sz="4"/>
-          <w:insideV w:val="single" w:color="auto" w:sz="4"/>
+          <w:top w:val="none"/>
+          <w:left w:val="none"/>
+          <w:bottom w:val="none"/>
+          <w:right w:val="none"/>
+          <w:insideH w:val="none"/>
+          <w:insideV w:val="none"/>
         </w:tblBorders>
       </w:tblPr>
       <w:tblGrid>
-        <w:gridCol w:w="100"/>
         <w:gridCol w:w="100"/>
         <w:gridCol w:w="100"/>
       </w:tblGrid>
@@ -1402,178 +1434,7 @@
         </w:trPr>
         <w:tc>
           <w:tcPr>
-            <w:tcW w:type="dxa" w:w="10771"/>
-            <w:gridSpan w:val="3"/>
-            <w:tcMar>
-              <w:top w:type="dxa" w:w="160"/>
-              <w:left w:type="dxa" w:w="0"/>
-              <w:bottom w:type="dxa" w:w="40"/>
-              <w:right w:type="dxa" w:w="0"/>
-            </w:tcMar>
-          </w:tcPr>
-          <w:p>
-            <w:pPr>
-              <w:keepLines/>
-              <w:spacing w:after="40" w:before="160"/>
-            </w:pPr>
-            <w:r>
-              <w:rPr>
-                <w:rFonts w:ascii="Arial" w:cs="Arial" w:eastAsia="Arial" w:hAnsi="Arial"/>
-                <w:b/>
-                <w:bCs/>
-                <w:color w:val="0C2340"/>
-                <w:sz w:val="22"/>
-                <w:szCs w:val="22"/>
-              </w:rPr>
-              <w:t xml:space="preserve">ISSUED ON BEHALF OF THE SCHOOL GOVERNING BODY</w:t>
-            </w:r>
-          </w:p>
-        </w:tc>
-      </w:tr>
-      <w:tr>
-        <w:trPr>
-          <w:cantSplit/>
-        </w:trPr>
-        <w:tc>
-          <w:tcPr>
-            <w:tcW w:type="dxa" w:w="10771"/>
-            <w:gridSpan w:val="3"/>
-            <w:tcMar>
-              <w:top w:type="dxa" w:w="20"/>
-              <w:left w:type="dxa" w:w="0"/>
-              <w:bottom w:type="dxa" w:w="80"/>
-              <w:right w:type="dxa" w:w="0"/>
-            </w:tcMar>
-          </w:tcPr>
-          <w:p>
-            <w:pPr>
-              <w:keepLines/>
-              <w:spacing w:after="80" w:before="20" w:line="276"/>
-              <w:jc w:val="both"/>
-            </w:pPr>
-            <w:r>
-              <w:rPr>
-                <w:rFonts w:ascii="Arial" w:cs="Arial" w:eastAsia="Arial" w:hAnsi="Arial"/>
-                <w:color w:val="1A1A1A"/>
-                <w:sz w:val="20"/>
-                <w:szCs w:val="20"/>
-              </w:rPr>
-              <w:t xml:space="preserve">By order of the Executive Committee of the School Governing Body of Lady Grey Arts Academy:</w:t>
-            </w:r>
-          </w:p>
-        </w:tc>
-      </w:tr>
-      <w:tr>
-        <w:trPr>
-          <w:cantSplit/>
-        </w:trPr>
-        <w:tc>
-          <w:tcPr>
-            <w:tcW w:type="dxa" w:w="5215"/>
-            <w:tcBorders>
-              <w:top w:val="single" w:color="CBD5E1" w:sz="4"/>
-              <w:left w:val="single" w:color="CBD5E1" w:sz="4"/>
-              <w:bottom w:val="single" w:color="CBD5E1" w:sz="4"/>
-              <w:right w:val="single" w:color="CBD5E1" w:sz="4"/>
-            </w:tcBorders>
-            <w:tcMar>
-              <w:top w:type="dxa" w:w="120"/>
-              <w:left w:type="dxa" w:w="140"/>
-              <w:bottom w:type="dxa" w:w="120"/>
-              <w:right w:type="dxa" w:w="140"/>
-            </w:tcMar>
-          </w:tcPr>
-          <w:p>
-            <w:pPr>
-              <w:spacing w:after="0" w:before="200"/>
-            </w:pPr>
-          </w:p>
-          <w:p>
-            <w:pPr>
-              <w:pBdr>
-                <w:bottom w:val="single" w:color="0C2340" w:sz="8"/>
-              </w:pBdr>
-              <w:spacing w:after="10" w:before="0"/>
-            </w:pPr>
-          </w:p>
-          <w:p>
-            <w:pPr>
-              <w:spacing w:after="90" w:before="0"/>
-            </w:pPr>
-            <w:r>
-              <w:rPr>
-                <w:rFonts w:ascii="Arial" w:cs="Arial" w:eastAsia="Arial" w:hAnsi="Arial"/>
-                <w:b/>
-                <w:bCs/>
-                <w:color w:val="64748B"/>
-                <w:sz w:val="14"/>
-                <w:szCs w:val="14"/>
-              </w:rPr>
-              <w:t xml:space="preserve">SIGNATURE</w:t>
-            </w:r>
-          </w:p>
-          <w:p>
-            <w:pPr>
-              <w:spacing w:after="15" w:before="0"/>
-            </w:pPr>
-            <w:r>
-              <w:rPr>
-                <w:rFonts w:ascii="Arial" w:cs="Arial" w:eastAsia="Arial" w:hAnsi="Arial"/>
-                <w:b/>
-                <w:bCs/>
-                <w:color w:val="1A1A1A"/>
-                <w:sz w:val="20"/>
-                <w:szCs w:val="20"/>
-              </w:rPr>
-              <w:t xml:space="preserve">Mr. K. Dyasi</w:t>
-            </w:r>
-          </w:p>
-          <w:p>
-            <w:pPr>
-              <w:spacing w:after="20" w:before="0"/>
-            </w:pPr>
-            <w:r>
-              <w:rPr>
-                <w:rFonts w:ascii="Arial" w:cs="Arial" w:eastAsia="Arial" w:hAnsi="Arial"/>
-                <w:b/>
-                <w:bCs/>
-                <w:color w:val="0C2340"/>
-                <w:sz w:val="19"/>
-                <w:szCs w:val="19"/>
-              </w:rPr>
-              <w:t xml:space="preserve">SGB CHAIRPERSON</w:t>
-            </w:r>
-          </w:p>
-          <w:p>
-            <w:pPr>
-              <w:spacing w:after="0" w:before="40"/>
-              <w:jc w:val="right"/>
-            </w:pPr>
-            <w:r>
-              <w:rPr>
-                <w:rFonts w:ascii="Arial" w:cs="Arial" w:eastAsia="Arial" w:hAnsi="Arial"/>
-                <w:b/>
-                <w:bCs/>
-                <w:color w:val="64748B"/>
-                <w:sz w:val="18"/>
-                <w:szCs w:val="18"/>
-              </w:rPr>
-              <w:t xml:space="preserve">DATE: </w:t>
-            </w:r>
-            <w:r>
-              <w:rPr>
-                <w:rFonts w:ascii="Arial" w:cs="Arial" w:eastAsia="Arial" w:hAnsi="Arial"/>
-                <w:color w:val="1A1A1A"/>
-                <w:sz w:val="18"/>
-                <w:szCs w:val="18"/>
-              </w:rPr>
-              <w:t xml:space="preserve">19/01/2026</w:t>
-            </w:r>
-          </w:p>
-        </w:tc>
-        <w:tc>
-          <w:tcPr>
-            <w:tcW w:type="dxa" w:w="340"/>
+            <w:tcW w:type="dxa" w:w="5385"/>
             <w:tcBorders>
               <w:top w:val="none"/>
               <w:left w:val="none"/>
@@ -1581,37 +1442,119 @@
               <w:right w:val="none"/>
             </w:tcBorders>
             <w:tcMar>
-              <w:top w:type="dxa" w:w="0"/>
-              <w:left w:type="dxa" w:w="0"/>
-              <w:bottom w:type="dxa" w:w="0"/>
-              <w:right w:type="dxa" w:w="0"/>
+              <w:top w:type="dxa" w:w="40"/>
+              <w:left w:type="dxa" w:w="140"/>
+              <w:bottom w:type="dxa" w:w="80"/>
+              <w:right w:type="dxa" w:w="140"/>
             </w:tcMar>
           </w:tcPr>
           <w:p>
             <w:pPr>
-              <w:spacing w:after="0" w:before="0"/>
+              <w:spacing w:after="0" w:before="180"/>
             </w:pPr>
+          </w:p>
+          <w:p>
+            <w:pPr>
+              <w:pBdr>
+                <w:bottom w:val="single" w:color="0C2340" w:sz="8"/>
+              </w:pBdr>
+              <w:spacing w:after="10" w:before="0"/>
+            </w:pPr>
+          </w:p>
+          <w:p>
+            <w:pPr>
+              <w:spacing w:after="90" w:before="0"/>
+            </w:pPr>
+            <w:r>
+              <w:rPr>
+                <w:rFonts w:ascii="Arial" w:cs="Arial" w:eastAsia="Arial" w:hAnsi="Arial"/>
+                <w:b/>
+                <w:bCs/>
+                <w:color w:val="64748B"/>
+                <w:sz w:val="14"/>
+                <w:szCs w:val="14"/>
+              </w:rPr>
+              <w:t xml:space="preserve">SIGNATURE</w:t>
+            </w:r>
+          </w:p>
+          <w:p>
+            <w:pPr>
+              <w:spacing w:after="15" w:before="0"/>
+            </w:pPr>
+            <w:r>
+              <w:rPr>
+                <w:rFonts w:ascii="Arial" w:cs="Arial" w:eastAsia="Arial" w:hAnsi="Arial"/>
+                <w:b/>
+                <w:bCs/>
+                <w:color w:val="1A1A1A"/>
+                <w:sz w:val="20"/>
+                <w:szCs w:val="20"/>
+              </w:rPr>
+              <w:t xml:space="preserve">Mr. K. Dyasi</w:t>
+            </w:r>
+          </w:p>
+          <w:p>
+            <w:pPr>
+              <w:spacing w:after="20" w:before="0"/>
+            </w:pPr>
+            <w:r>
+              <w:rPr>
+                <w:rFonts w:ascii="Arial" w:cs="Arial" w:eastAsia="Arial" w:hAnsi="Arial"/>
+                <w:b/>
+                <w:bCs/>
+                <w:color w:val="0C2340"/>
+                <w:sz w:val="19"/>
+                <w:szCs w:val="19"/>
+              </w:rPr>
+              <w:t xml:space="preserve">SGB CHAIRPERSON</w:t>
+            </w:r>
+          </w:p>
+          <w:p>
+            <w:pPr>
+              <w:spacing w:after="0" w:before="40"/>
+              <w:jc w:val="right"/>
+            </w:pPr>
+            <w:r>
+              <w:rPr>
+                <w:rFonts w:ascii="Arial" w:cs="Arial" w:eastAsia="Arial" w:hAnsi="Arial"/>
+                <w:b/>
+                <w:bCs/>
+                <w:color w:val="64748B"/>
+                <w:sz w:val="18"/>
+                <w:szCs w:val="18"/>
+              </w:rPr>
+              <w:t xml:space="preserve">DATE: </w:t>
+            </w:r>
+            <w:r>
+              <w:rPr>
+                <w:rFonts w:ascii="Arial" w:cs="Arial" w:eastAsia="Arial" w:hAnsi="Arial"/>
+                <w:color w:val="1A1A1A"/>
+                <w:sz w:val="18"/>
+                <w:szCs w:val="18"/>
+              </w:rPr>
+              <w:t xml:space="preserve">19/01/2026</w:t>
+            </w:r>
           </w:p>
         </w:tc>
         <w:tc>
           <w:tcPr>
-            <w:tcW w:type="dxa" w:w="5215"/>
+            <w:tcW w:type="dxa" w:w="5385"/>
             <w:tcBorders>
-              <w:top w:val="single" w:color="CBD5E1" w:sz="4"/>
-              <w:left w:val="single" w:color="CBD5E1" w:sz="4"/>
-              <w:bottom w:val="single" w:color="CBD5E1" w:sz="4"/>
-              <w:right w:val="single" w:color="CBD5E1" w:sz="4"/>
+              <w:top w:val="none"/>
+              <w:left w:val="none"/>
+              <w:bottom w:val="none"/>
+              <w:right w:val="none"/>
             </w:tcBorders>
             <w:tcMar>
-              <w:top w:type="dxa" w:w="120"/>
+              <w:top w:type="dxa" w:w="40"/>
               <w:left w:type="dxa" w:w="140"/>
-              <w:bottom w:type="dxa" w:w="120"/>
+              <w:bottom w:type="dxa" w:w="80"/>
               <w:right w:type="dxa" w:w="140"/>
             </w:tcMar>
           </w:tcPr>
           <w:p>
             <w:pPr>
-              <w:spacing w:after="0" w:before="200"/>
+              <w:spacing w:after="0" w:before="180"/>
             </w:pPr>
           </w:p>
           <w:p>

</xml_diff>

<commit_message>
Fix orphaned headings: add keepLines to L1/L2 headings; align preview role casing with DOCX uppercase
</commit_message>
<xml_diff>
--- a/SGB_Functionality_Audit_2026/01_SGB_Constitution/01_Meeting_Notice_and_Invitation_2026-01-19.docx
+++ b/SGB_Functionality_Audit_2026/01_SGB_Constitution/01_Meeting_Notice_and_Invitation_2026-01-19.docx
@@ -698,6 +698,7 @@
     </w:p>
     <w:p>
       <w:pPr>
+        <w:keepLines/>
         <w:tabs>
           <w:tab w:val="left" w:pos="566"/>
         </w:tabs>
@@ -737,6 +738,7 @@
     </w:p>
     <w:p>
       <w:pPr>
+        <w:keepLines/>
         <w:tabs>
           <w:tab w:val="left" w:pos="566"/>
         </w:tabs>
@@ -777,6 +779,7 @@
     </w:p>
     <w:p>
       <w:pPr>
+        <w:keepLines/>
         <w:tabs>
           <w:tab w:val="left" w:pos="566"/>
         </w:tabs>
@@ -817,6 +820,7 @@
     </w:p>
     <w:p>
       <w:pPr>
+        <w:keepLines/>
         <w:tabs>
           <w:tab w:val="left" w:pos="566"/>
         </w:tabs>
@@ -857,6 +861,7 @@
     </w:p>
     <w:p>
       <w:pPr>
+        <w:keepLines/>
         <w:tabs>
           <w:tab w:val="left" w:pos="566"/>
         </w:tabs>
@@ -897,6 +902,7 @@
     </w:p>
     <w:p>
       <w:pPr>
+        <w:keepLines/>
         <w:tabs>
           <w:tab w:val="left" w:pos="566"/>
         </w:tabs>
@@ -937,6 +943,7 @@
     </w:p>
     <w:p>
       <w:pPr>
+        <w:keepLines/>
         <w:tabs>
           <w:tab w:val="left" w:pos="566"/>
         </w:tabs>
@@ -976,6 +983,7 @@
     </w:p>
     <w:p>
       <w:pPr>
+        <w:keepLines/>
         <w:tabs>
           <w:tab w:val="left" w:pos="566"/>
         </w:tabs>
@@ -1016,6 +1024,7 @@
     </w:p>
     <w:p>
       <w:pPr>
+        <w:keepLines/>
         <w:tabs>
           <w:tab w:val="left" w:pos="566"/>
         </w:tabs>
@@ -1056,6 +1065,7 @@
     </w:p>
     <w:p>
       <w:pPr>
+        <w:keepLines/>
         <w:tabs>
           <w:tab w:val="left" w:pos="566"/>
         </w:tabs>
@@ -1096,6 +1106,7 @@
     </w:p>
     <w:p>
       <w:pPr>
+        <w:keepLines/>
         <w:tabs>
           <w:tab w:val="left" w:pos="566"/>
         </w:tabs>
@@ -1135,6 +1146,7 @@
     </w:p>
     <w:p>
       <w:pPr>
+        <w:keepLines/>
         <w:tabs>
           <w:tab w:val="left" w:pos="566"/>
         </w:tabs>
@@ -1175,6 +1187,7 @@
     </w:p>
     <w:p>
       <w:pPr>
+        <w:keepLines/>
         <w:tabs>
           <w:tab w:val="left" w:pos="566"/>
         </w:tabs>
@@ -1215,6 +1228,7 @@
     </w:p>
     <w:p>
       <w:pPr>
+        <w:keepLines/>
         <w:tabs>
           <w:tab w:val="left" w:pos="566"/>
         </w:tabs>
@@ -1255,6 +1269,7 @@
     </w:p>
     <w:p>
       <w:pPr>
+        <w:keepLines/>
         <w:tabs>
           <w:tab w:val="left" w:pos="566"/>
         </w:tabs>
@@ -1294,6 +1309,7 @@
     </w:p>
     <w:p>
       <w:pPr>
+        <w:keepLines/>
         <w:tabs>
           <w:tab w:val="left" w:pos="566"/>
         </w:tabs>
@@ -1334,6 +1350,7 @@
     </w:p>
     <w:p>
       <w:pPr>
+        <w:keepLines/>
         <w:tabs>
           <w:tab w:val="left" w:pos="566"/>
         </w:tabs>

</xml_diff>

<commit_message>
Restore thicker bordered signature cards (#94A3B8, 1.5px) matching preview across DOCX, HTML, and PDF exports
</commit_message>
<xml_diff>
--- a/SGB_Functionality_Audit_2026/01_SGB_Constitution/01_Meeting_Notice_and_Invitation_2026-01-19.docx
+++ b/SGB_Functionality_Audit_2026/01_SGB_Constitution/01_Meeting_Notice_and_Invitation_2026-01-19.docx
@@ -1444,6 +1444,7 @@
       <w:tblGrid>
         <w:gridCol w:w="100"/>
         <w:gridCol w:w="100"/>
+        <w:gridCol w:w="100"/>
       </w:tblGrid>
       <w:tr>
         <w:trPr>
@@ -1451,7 +1452,111 @@
         </w:trPr>
         <w:tc>
           <w:tcPr>
-            <w:tcW w:type="dxa" w:w="5385"/>
+            <w:tcW w:type="dxa" w:w="5215"/>
+            <w:tcBorders>
+              <w:top w:val="single" w:color="94A3B8" w:sz="6"/>
+              <w:left w:val="single" w:color="94A3B8" w:sz="6"/>
+              <w:bottom w:val="single" w:color="94A3B8" w:sz="6"/>
+              <w:right w:val="single" w:color="94A3B8" w:sz="6"/>
+            </w:tcBorders>
+            <w:tcMar>
+              <w:top w:type="dxa" w:w="100"/>
+              <w:left w:type="dxa" w:w="160"/>
+              <w:bottom w:type="dxa" w:w="100"/>
+              <w:right w:type="dxa" w:w="160"/>
+            </w:tcMar>
+          </w:tcPr>
+          <w:p>
+            <w:pPr>
+              <w:spacing w:after="0" w:before="180"/>
+            </w:pPr>
+          </w:p>
+          <w:p>
+            <w:pPr>
+              <w:pBdr>
+                <w:bottom w:val="single" w:color="0C2340" w:sz="8"/>
+              </w:pBdr>
+              <w:spacing w:after="10" w:before="0"/>
+            </w:pPr>
+          </w:p>
+          <w:p>
+            <w:pPr>
+              <w:spacing w:after="90" w:before="0"/>
+            </w:pPr>
+            <w:r>
+              <w:rPr>
+                <w:rFonts w:ascii="Arial" w:cs="Arial" w:eastAsia="Arial" w:hAnsi="Arial"/>
+                <w:b/>
+                <w:bCs/>
+                <w:color w:val="64748B"/>
+                <w:sz w:val="14"/>
+                <w:szCs w:val="14"/>
+              </w:rPr>
+              <w:t xml:space="preserve">SIGNATURE</w:t>
+            </w:r>
+          </w:p>
+          <w:p>
+            <w:pPr>
+              <w:spacing w:after="15" w:before="0"/>
+            </w:pPr>
+            <w:r>
+              <w:rPr>
+                <w:rFonts w:ascii="Arial" w:cs="Arial" w:eastAsia="Arial" w:hAnsi="Arial"/>
+                <w:b/>
+                <w:bCs/>
+                <w:color w:val="1A1A1A"/>
+                <w:sz w:val="20"/>
+                <w:szCs w:val="20"/>
+              </w:rPr>
+              <w:t xml:space="preserve">Mr. K. Dyasi</w:t>
+            </w:r>
+          </w:p>
+          <w:p>
+            <w:pPr>
+              <w:spacing w:after="20" w:before="0"/>
+            </w:pPr>
+            <w:r>
+              <w:rPr>
+                <w:rFonts w:ascii="Arial" w:cs="Arial" w:eastAsia="Arial" w:hAnsi="Arial"/>
+                <w:b/>
+                <w:bCs/>
+                <w:color w:val="0C2340"/>
+                <w:sz w:val="19"/>
+                <w:szCs w:val="19"/>
+              </w:rPr>
+              <w:t xml:space="preserve">SGB CHAIRPERSON</w:t>
+            </w:r>
+          </w:p>
+          <w:p>
+            <w:pPr>
+              <w:spacing w:after="0" w:before="40"/>
+              <w:jc w:val="right"/>
+            </w:pPr>
+            <w:r>
+              <w:rPr>
+                <w:rFonts w:ascii="Arial" w:cs="Arial" w:eastAsia="Arial" w:hAnsi="Arial"/>
+                <w:b/>
+                <w:bCs/>
+                <w:color w:val="64748B"/>
+                <w:sz w:val="18"/>
+                <w:szCs w:val="18"/>
+              </w:rPr>
+              <w:t xml:space="preserve">DATE: </w:t>
+            </w:r>
+            <w:r>
+              <w:rPr>
+                <w:rFonts w:ascii="Arial" w:cs="Arial" w:eastAsia="Arial" w:hAnsi="Arial"/>
+                <w:color w:val="1A1A1A"/>
+                <w:sz w:val="18"/>
+                <w:szCs w:val="18"/>
+              </w:rPr>
+              <w:t xml:space="preserve">19/01/2026</w:t>
+            </w:r>
+          </w:p>
+        </w:tc>
+        <w:tc>
+          <w:tcPr>
+            <w:tcW w:type="dxa" w:w="340"/>
             <w:tcBorders>
               <w:top w:val="none"/>
               <w:left w:val="none"/>
@@ -1459,114 +1564,32 @@
               <w:right w:val="none"/>
             </w:tcBorders>
             <w:tcMar>
-              <w:top w:type="dxa" w:w="40"/>
-              <w:left w:type="dxa" w:w="140"/>
-              <w:bottom w:type="dxa" w:w="80"/>
-              <w:right w:type="dxa" w:w="140"/>
+              <w:top w:type="dxa" w:w="0"/>
+              <w:left w:type="dxa" w:w="0"/>
+              <w:bottom w:type="dxa" w:w="0"/>
+              <w:right w:type="dxa" w:w="0"/>
             </w:tcMar>
           </w:tcPr>
           <w:p>
             <w:pPr>
-              <w:spacing w:after="0" w:before="180"/>
+              <w:spacing w:after="0" w:before="0"/>
             </w:pPr>
-          </w:p>
-          <w:p>
-            <w:pPr>
-              <w:pBdr>
-                <w:bottom w:val="single" w:color="0C2340" w:sz="8"/>
-              </w:pBdr>
-              <w:spacing w:after="10" w:before="0"/>
-            </w:pPr>
-          </w:p>
-          <w:p>
-            <w:pPr>
-              <w:spacing w:after="90" w:before="0"/>
-            </w:pPr>
-            <w:r>
-              <w:rPr>
-                <w:rFonts w:ascii="Arial" w:cs="Arial" w:eastAsia="Arial" w:hAnsi="Arial"/>
-                <w:b/>
-                <w:bCs/>
-                <w:color w:val="64748B"/>
-                <w:sz w:val="14"/>
-                <w:szCs w:val="14"/>
-              </w:rPr>
-              <w:t xml:space="preserve">SIGNATURE</w:t>
-            </w:r>
-          </w:p>
-          <w:p>
-            <w:pPr>
-              <w:spacing w:after="15" w:before="0"/>
-            </w:pPr>
-            <w:r>
-              <w:rPr>
-                <w:rFonts w:ascii="Arial" w:cs="Arial" w:eastAsia="Arial" w:hAnsi="Arial"/>
-                <w:b/>
-                <w:bCs/>
-                <w:color w:val="1A1A1A"/>
-                <w:sz w:val="20"/>
-                <w:szCs w:val="20"/>
-              </w:rPr>
-              <w:t xml:space="preserve">Mr. K. Dyasi</w:t>
-            </w:r>
-          </w:p>
-          <w:p>
-            <w:pPr>
-              <w:spacing w:after="20" w:before="0"/>
-            </w:pPr>
-            <w:r>
-              <w:rPr>
-                <w:rFonts w:ascii="Arial" w:cs="Arial" w:eastAsia="Arial" w:hAnsi="Arial"/>
-                <w:b/>
-                <w:bCs/>
-                <w:color w:val="0C2340"/>
-                <w:sz w:val="19"/>
-                <w:szCs w:val="19"/>
-              </w:rPr>
-              <w:t xml:space="preserve">SGB CHAIRPERSON</w:t>
-            </w:r>
-          </w:p>
-          <w:p>
-            <w:pPr>
-              <w:spacing w:after="0" w:before="40"/>
-              <w:jc w:val="right"/>
-            </w:pPr>
-            <w:r>
-              <w:rPr>
-                <w:rFonts w:ascii="Arial" w:cs="Arial" w:eastAsia="Arial" w:hAnsi="Arial"/>
-                <w:b/>
-                <w:bCs/>
-                <w:color w:val="64748B"/>
-                <w:sz w:val="18"/>
-                <w:szCs w:val="18"/>
-              </w:rPr>
-              <w:t xml:space="preserve">DATE: </w:t>
-            </w:r>
-            <w:r>
-              <w:rPr>
-                <w:rFonts w:ascii="Arial" w:cs="Arial" w:eastAsia="Arial" w:hAnsi="Arial"/>
-                <w:color w:val="1A1A1A"/>
-                <w:sz w:val="18"/>
-                <w:szCs w:val="18"/>
-              </w:rPr>
-              <w:t xml:space="preserve">19/01/2026</w:t>
-            </w:r>
           </w:p>
         </w:tc>
         <w:tc>
           <w:tcPr>
-            <w:tcW w:type="dxa" w:w="5385"/>
+            <w:tcW w:type="dxa" w:w="5215"/>
             <w:tcBorders>
-              <w:top w:val="none"/>
-              <w:left w:val="none"/>
-              <w:bottom w:val="none"/>
-              <w:right w:val="none"/>
+              <w:top w:val="single" w:color="94A3B8" w:sz="6"/>
+              <w:left w:val="single" w:color="94A3B8" w:sz="6"/>
+              <w:bottom w:val="single" w:color="94A3B8" w:sz="6"/>
+              <w:right w:val="single" w:color="94A3B8" w:sz="6"/>
             </w:tcBorders>
             <w:tcMar>
-              <w:top w:type="dxa" w:w="40"/>
-              <w:left w:type="dxa" w:w="140"/>
-              <w:bottom w:type="dxa" w:w="80"/>
-              <w:right w:type="dxa" w:w="140"/>
+              <w:top w:type="dxa" w:w="100"/>
+              <w:left w:type="dxa" w:w="160"/>
+              <w:bottom w:type="dxa" w:w="100"/>
+              <w:right w:type="dxa" w:w="160"/>
             </w:tcMar>
           </w:tcPr>
           <w:p>

</xml_diff>

<commit_message>
Add Official School Stamp, District Stamp, and Circuit Manager signature box to resolution sign-off page
</commit_message>
<xml_diff>
--- a/SGB_Functionality_Audit_2026/01_SGB_Constitution/01_Meeting_Notice_and_Invitation_2026-01-19.docx
+++ b/SGB_Functionality_Audit_2026/01_SGB_Constitution/01_Meeting_Notice_and_Invitation_2026-01-19.docx
@@ -1677,6 +1677,312 @@
                 <w:szCs w:val="18"/>
               </w:rPr>
               <w:t xml:space="preserve">19/01/2026</w:t>
+            </w:r>
+          </w:p>
+        </w:tc>
+      </w:tr>
+    </w:tbl>
+    <w:p>
+      <w:pPr>
+        <w:spacing w:after="0" w:before="140"/>
+      </w:pPr>
+    </w:p>
+    <w:tbl>
+      <w:tblPr>
+        <w:tblW w:type="dxa" w:w="3590"/>
+        <w:jc w:val="left"/>
+        <w:tblBorders>
+          <w:top w:val="dashed" w:color="94A3B8" w:sz="6"/>
+          <w:left w:val="dashed" w:color="94A3B8" w:sz="6"/>
+          <w:bottom w:val="dashed" w:color="94A3B8" w:sz="6"/>
+          <w:right w:val="dashed" w:color="94A3B8" w:sz="6"/>
+          <w:insideH w:val="single" w:color="auto" w:sz="4"/>
+          <w:insideV w:val="single" w:color="auto" w:sz="4"/>
+        </w:tblBorders>
+      </w:tblPr>
+      <w:tblGrid>
+        <w:gridCol w:w="100"/>
+      </w:tblGrid>
+      <w:tr>
+        <w:trPr>
+          <w:cantSplit/>
+        </w:trPr>
+        <w:tc>
+          <w:tcPr>
+            <w:tcW w:type="dxa" w:w="3590"/>
+            <w:shd w:fill="F8FAFC" w:val="clear"/>
+            <w:tcMar>
+              <w:top w:type="dxa" w:w="100"/>
+              <w:left w:type="dxa" w:w="140"/>
+              <w:bottom w:type="dxa" w:w="100"/>
+              <w:right w:type="dxa" w:w="140"/>
+            </w:tcMar>
+          </w:tcPr>
+          <w:p>
+            <w:pPr>
+              <w:spacing w:after="30" w:before="60"/>
+              <w:jc w:val="center"/>
+            </w:pPr>
+            <w:r>
+              <w:rPr>
+                <w:rFonts w:ascii="Arial" w:cs="Arial" w:eastAsia="Arial" w:hAnsi="Arial"/>
+                <w:b/>
+                <w:bCs/>
+                <w:color w:val="475569"/>
+                <w:sz w:val="15"/>
+                <w:szCs w:val="15"/>
+              </w:rPr>
+              <w:t xml:space="preserve">OFFICIAL SCHOOL STAMP</w:t>
+            </w:r>
+          </w:p>
+          <w:p>
+            <w:pPr>
+              <w:spacing w:after="80" w:before="80"/>
+              <w:jc w:val="center"/>
+            </w:pPr>
+            <w:r>
+              <w:rPr>
+                <w:rFonts w:ascii="Arial" w:cs="Arial" w:eastAsia="Arial" w:hAnsi="Arial"/>
+                <w:color w:val="94A3B8"/>
+                <w:sz w:val="14"/>
+                <w:szCs w:val="14"/>
+              </w:rPr>
+              <w:t xml:space="preserve">(Place Official School Date Stamp Here)</w:t>
+            </w:r>
+          </w:p>
+        </w:tc>
+      </w:tr>
+    </w:tbl>
+    <w:p>
+      <w:pPr>
+        <w:keepLines/>
+        <w:spacing w:after="30" w:before="180"/>
+      </w:pPr>
+      <w:r>
+        <w:rPr>
+          <w:rFonts w:ascii="Arial" w:cs="Arial" w:eastAsia="Arial" w:hAnsi="Arial"/>
+          <w:b/>
+          <w:bCs/>
+          <w:color w:val="0C2340"/>
+          <w:sz w:val="18"/>
+          <w:szCs w:val="18"/>
+        </w:rPr>
+        <w:t xml:space="preserve">DISTRICT ENDORSEMENT &amp; RECORD OF RECEIPT</w:t>
+      </w:r>
+    </w:p>
+    <w:p>
+      <w:pPr>
+        <w:keepLines/>
+        <w:spacing w:after="60" w:before="0"/>
+      </w:pPr>
+      <w:r>
+        <w:rPr>
+          <w:rFonts w:ascii="Arial" w:cs="Arial" w:eastAsia="Arial" w:hAnsi="Arial"/>
+          <w:color w:val="1A1A1A"/>
+          <w:sz w:val="18"/>
+          <w:szCs w:val="18"/>
+        </w:rPr>
+        <w:t xml:space="preserve">Received, verified, and endorsed for departmental records by the District Office:</w:t>
+      </w:r>
+    </w:p>
+    <w:tbl>
+      <w:tblPr>
+        <w:tblW w:type="dxa" w:w="10771"/>
+        <w:jc w:val="center"/>
+        <w:tblBorders>
+          <w:top w:val="none"/>
+          <w:left w:val="none"/>
+          <w:bottom w:val="none"/>
+          <w:right w:val="none"/>
+          <w:insideH w:val="none"/>
+          <w:insideV w:val="none"/>
+        </w:tblBorders>
+      </w:tblPr>
+      <w:tblGrid>
+        <w:gridCol w:w="100"/>
+        <w:gridCol w:w="100"/>
+        <w:gridCol w:w="100"/>
+      </w:tblGrid>
+      <w:tr>
+        <w:trPr>
+          <w:cantSplit/>
+        </w:trPr>
+        <w:tc>
+          <w:tcPr>
+            <w:tcW w:type="dxa" w:w="5244"/>
+            <w:tcBorders>
+              <w:top w:val="dashed" w:color="94A3B8" w:sz="6"/>
+              <w:left w:val="dashed" w:color="94A3B8" w:sz="6"/>
+              <w:bottom w:val="dashed" w:color="94A3B8" w:sz="6"/>
+              <w:right w:val="dashed" w:color="94A3B8" w:sz="6"/>
+            </w:tcBorders>
+            <w:shd w:fill="F8FAFC" w:val="clear"/>
+            <w:tcMar>
+              <w:top w:type="dxa" w:w="120"/>
+              <w:left w:type="dxa" w:w="160"/>
+              <w:bottom w:type="dxa" w:w="120"/>
+              <w:right w:type="dxa" w:w="160"/>
+            </w:tcMar>
+          </w:tcPr>
+          <w:p>
+            <w:pPr>
+              <w:spacing w:after="40" w:before="80"/>
+              <w:jc w:val="center"/>
+            </w:pPr>
+            <w:r>
+              <w:rPr>
+                <w:rFonts w:ascii="Arial" w:cs="Arial" w:eastAsia="Arial" w:hAnsi="Arial"/>
+                <w:b/>
+                <w:bCs/>
+                <w:color w:val="475569"/>
+                <w:sz w:val="15"/>
+                <w:szCs w:val="15"/>
+              </w:rPr>
+              <w:t xml:space="preserve">OFFICIAL DISTRICT / CIRCUIT STAMP</w:t>
+            </w:r>
+          </w:p>
+          <w:p>
+            <w:pPr>
+              <w:spacing w:after="160" w:before="180"/>
+              <w:jc w:val="center"/>
+            </w:pPr>
+            <w:r>
+              <w:rPr>
+                <w:rFonts w:ascii="Arial" w:cs="Arial" w:eastAsia="Arial" w:hAnsi="Arial"/>
+                <w:color w:val="94A3B8"/>
+                <w:sz w:val="14"/>
+                <w:szCs w:val="14"/>
+              </w:rPr>
+              <w:t xml:space="preserve">(Place District Registry / Circuit Office Date Stamp Here)</w:t>
+            </w:r>
+          </w:p>
+        </w:tc>
+        <w:tc>
+          <w:tcPr>
+            <w:tcW w:type="dxa" w:w="283"/>
+            <w:tcBorders>
+              <w:top w:val="none"/>
+              <w:left w:val="none"/>
+              <w:bottom w:val="none"/>
+              <w:right w:val="none"/>
+            </w:tcBorders>
+            <w:tcMar>
+              <w:top w:type="dxa" w:w="0"/>
+              <w:left w:type="dxa" w:w="0"/>
+              <w:bottom w:type="dxa" w:w="0"/>
+              <w:right w:type="dxa" w:w="0"/>
+            </w:tcMar>
+          </w:tcPr>
+          <w:p>
+            <w:pPr>
+              <w:spacing w:after="0" w:before="0"/>
+            </w:pPr>
+          </w:p>
+        </w:tc>
+        <w:tc>
+          <w:tcPr>
+            <w:tcW w:type="dxa" w:w="5244"/>
+            <w:tcBorders>
+              <w:top w:val="single" w:color="94A3B8" w:sz="6"/>
+              <w:left w:val="single" w:color="94A3B8" w:sz="6"/>
+              <w:bottom w:val="single" w:color="94A3B8" w:sz="6"/>
+              <w:right w:val="single" w:color="94A3B8" w:sz="6"/>
+            </w:tcBorders>
+            <w:tcMar>
+              <w:top w:type="dxa" w:w="100"/>
+              <w:left w:type="dxa" w:w="160"/>
+              <w:bottom w:type="dxa" w:w="100"/>
+              <w:right w:type="dxa" w:w="160"/>
+            </w:tcMar>
+          </w:tcPr>
+          <w:p>
+            <w:pPr>
+              <w:spacing w:after="0" w:before="180"/>
+            </w:pPr>
+          </w:p>
+          <w:p>
+            <w:pPr>
+              <w:pBdr>
+                <w:bottom w:val="single" w:color="0C2340" w:sz="8"/>
+              </w:pBdr>
+              <w:spacing w:after="10" w:before="0"/>
+            </w:pPr>
+          </w:p>
+          <w:p>
+            <w:pPr>
+              <w:spacing w:after="90" w:before="0"/>
+            </w:pPr>
+            <w:r>
+              <w:rPr>
+                <w:rFonts w:ascii="Arial" w:cs="Arial" w:eastAsia="Arial" w:hAnsi="Arial"/>
+                <w:b/>
+                <w:bCs/>
+                <w:color w:val="64748B"/>
+                <w:sz w:val="14"/>
+                <w:szCs w:val="14"/>
+              </w:rPr>
+              <w:t xml:space="preserve">SIGNATURE</w:t>
+            </w:r>
+          </w:p>
+          <w:p>
+            <w:pPr>
+              <w:tabs>
+                <w:tab w:val="right" w:pos="4924" w:leader="underscore"/>
+              </w:tabs>
+              <w:spacing w:after="15" w:before="0"/>
+            </w:pPr>
+            <w:r>
+              <w:rPr>
+                <w:rFonts w:ascii="Arial" w:cs="Arial" w:eastAsia="Arial" w:hAnsi="Arial"/>
+                <w:b/>
+                <w:bCs/>
+                <w:color w:val="64748B"/>
+                <w:sz w:val="18"/>
+                <w:szCs w:val="18"/>
+              </w:rPr>
+              <w:t xml:space="preserve">NAME:	</w:t>
+            </w:r>
+          </w:p>
+          <w:p>
+            <w:pPr>
+              <w:spacing w:after="20" w:before="0"/>
+            </w:pPr>
+            <w:r>
+              <w:rPr>
+                <w:rFonts w:ascii="Arial" w:cs="Arial" w:eastAsia="Arial" w:hAnsi="Arial"/>
+                <w:b/>
+                <w:bCs/>
+                <w:color w:val="0C2340"/>
+                <w:sz w:val="19"/>
+                <w:szCs w:val="19"/>
+              </w:rPr>
+              <w:t xml:space="preserve">CIRCUIT MANAGER</w:t>
+            </w:r>
+          </w:p>
+          <w:p>
+            <w:pPr>
+              <w:spacing w:after="0" w:before="40"/>
+              <w:jc w:val="right"/>
+            </w:pPr>
+            <w:r>
+              <w:rPr>
+                <w:rFonts w:ascii="Arial" w:cs="Arial" w:eastAsia="Arial" w:hAnsi="Arial"/>
+                <w:b/>
+                <w:bCs/>
+                <w:color w:val="64748B"/>
+                <w:sz w:val="18"/>
+                <w:szCs w:val="18"/>
+              </w:rPr>
+              <w:t xml:space="preserve">DATE: </w:t>
+            </w:r>
+            <w:r>
+              <w:rPr>
+                <w:rFonts w:ascii="Arial" w:cs="Arial" w:eastAsia="Arial" w:hAnsi="Arial"/>
+                <w:color w:val="94A3B8"/>
+                <w:sz w:val="18"/>
+                <w:szCs w:val="18"/>
+              </w:rPr>
+              <w:t xml:space="preserve">________________________</w:t>
             </w:r>
           </w:p>
         </w:tc>

</xml_diff>

<commit_message>
Update signature card boxes and stamp layout across all Item 01 SGB Constitution audit files (DOCX and PDF)
</commit_message>
<xml_diff>
--- a/SGB_Functionality_Audit_2026/01_SGB_Constitution/01_Meeting_Notice_and_Invitation_2026-01-19.docx
+++ b/SGB_Functionality_Audit_2026/01_SGB_Constitution/01_Meeting_Notice_and_Invitation_2026-01-19.docx
@@ -129,7 +129,7 @@
                           </pic:cNvPicPr>
                         </pic:nvPicPr>
                         <pic:blipFill>
-                          <a:blip r:embed="rId9" cstate="none"/>
+                          <a:blip r:embed="rId8" cstate="none"/>
                           <a:srcRect/>
                           <a:stretch>
                             <a:fillRect/>
@@ -154,7 +154,7 @@
         </w:tc>
         <w:tc>
           <w:tcPr>
-            <w:tcW w:type="dxa" w:w="7823"/>
+            <w:tcW w:type="dxa" w:w="7880"/>
             <w:tcMar>
               <w:top w:type="dxa" w:w="10"/>
               <w:left w:type="dxa" w:w="30"/>
@@ -228,7 +228,7 @@
         </w:tc>
         <w:tc>
           <w:tcPr>
-            <w:tcW w:type="dxa" w:w="2040"/>
+            <w:tcW w:type="dxa" w:w="1984"/>
             <w:tcBorders>
               <w:top w:val="none"/>
               <w:left w:val="single" w:color="0C2340" w:sz="20"/>
@@ -237,7 +237,7 @@
             </w:tcBorders>
             <w:tcMar>
               <w:top w:type="dxa" w:w="10"/>
-              <w:left w:type="dxa" w:w="60"/>
+              <w:left w:type="dxa" w:w="90"/>
               <w:bottom w:type="dxa" w:w="10"/>
               <w:right w:type="dxa" w:w="0"/>
             </w:tcMar>
@@ -245,7 +245,7 @@
           </w:tcPr>
           <w:p>
             <w:pPr>
-              <w:spacing w:after="2" w:before="0" w:line="200"/>
+              <w:spacing w:after="30" w:before="0" w:line="220"/>
             </w:pPr>
             <w:r>
               <w:rPr>
@@ -261,7 +261,7 @@
           </w:p>
           <w:p>
             <w:pPr>
-              <w:spacing w:after="0" w:before="0" w:line="180"/>
+              <w:spacing w:after="0" w:before="20" w:line="200"/>
             </w:pPr>
             <w:r>
               <w:rPr>
@@ -315,386 +315,25 @@
           <w:sz w:val="24"/>
           <w:szCs w:val="24"/>
         </w:rPr>
+        <w:t xml:space="preserve">LADY GREY ARTS ACADEMY</w:t>
+      </w:r>
+    </w:p>
+    <w:p>
+      <w:pPr>
+        <w:keepLines/>
+        <w:spacing w:after="80" w:before="0" w:line="276"/>
+        <w:ind w:left="0"/>
+        <w:jc w:val="both"/>
+      </w:pPr>
+      <w:r>
+        <w:rPr>
+          <w:rFonts w:ascii="Arial" w:cs="Arial" w:eastAsia="Arial" w:hAnsi="Arial"/>
+          <w:color w:val="1A1A1A"/>
+          <w:sz w:val="20"/>
+          <w:szCs w:val="20"/>
+        </w:rPr>
         <w:t xml:space="preserve">LADY GREY ARTS ACADEMY • GOVERNANCE CYCLE 2026</w:t>
       </w:r>
-    </w:p>
-    <w:tbl>
-      <w:tblPr>
-        <w:tblW w:type="dxa" w:w="10771"/>
-        <w:tblBorders>
-          <w:top w:val="single" w:color="auto" w:sz="4"/>
-          <w:left w:val="single" w:color="auto" w:sz="4"/>
-          <w:bottom w:val="single" w:color="auto" w:sz="4"/>
-          <w:right w:val="single" w:color="auto" w:sz="4"/>
-          <w:insideH w:val="single" w:color="auto" w:sz="4"/>
-          <w:insideV w:val="single" w:color="auto" w:sz="4"/>
-        </w:tblBorders>
-      </w:tblPr>
-      <w:tblGrid>
-        <w:gridCol w:w="100"/>
-        <w:gridCol w:w="100"/>
-      </w:tblGrid>
-      <w:tr>
-        <w:tc>
-          <w:tcPr>
-            <w:tcW w:type="dxa" w:w="4081"/>
-            <w:shd w:fill="0C2340"/>
-            <w:tcMar>
-              <w:top w:type="dxa" w:w="100"/>
-              <w:left w:type="dxa" w:w="140"/>
-              <w:bottom w:type="dxa" w:w="100"/>
-              <w:right w:type="dxa" w:w="140"/>
-            </w:tcMar>
-          </w:tcPr>
-          <w:p>
-            <w:r>
-              <w:rPr>
-                <w:rFonts w:ascii="Arial" w:cs="Arial" w:eastAsia="Arial" w:hAnsi="Arial"/>
-                <w:b/>
-                <w:bCs/>
-                <w:color w:val="FFFFFF"/>
-                <w:sz w:val="19"/>
-                <w:szCs w:val="19"/>
-              </w:rPr>
-              <w:t xml:space="preserve">Meeting Parameter</w:t>
-            </w:r>
-          </w:p>
-        </w:tc>
-        <w:tc>
-          <w:tcPr>
-            <w:tcW w:type="dxa" w:w="6689"/>
-            <w:shd w:fill="0C2340"/>
-            <w:tcMar>
-              <w:top w:type="dxa" w:w="100"/>
-              <w:left w:type="dxa" w:w="140"/>
-              <w:bottom w:type="dxa" w:w="100"/>
-              <w:right w:type="dxa" w:w="140"/>
-            </w:tcMar>
-          </w:tcPr>
-          <w:p>
-            <w:r>
-              <w:rPr>
-                <w:rFonts w:ascii="Arial" w:cs="Arial" w:eastAsia="Arial" w:hAnsi="Arial"/>
-                <w:b/>
-                <w:bCs/>
-                <w:color w:val="FFFFFF"/>
-                <w:sz w:val="19"/>
-                <w:szCs w:val="19"/>
-              </w:rPr>
-              <w:t xml:space="preserve">Specification Details</w:t>
-            </w:r>
-          </w:p>
-        </w:tc>
-      </w:tr>
-      <w:tr>
-        <w:tc>
-          <w:tcPr>
-            <w:tcW w:type="dxa" w:w="4081"/>
-            <w:tcBorders>
-              <w:top w:val="single" w:color="CBD5E1" w:sz="4"/>
-              <w:left w:val="single" w:color="CBD5E1" w:sz="4"/>
-              <w:bottom w:val="single" w:color="CBD5E1" w:sz="4"/>
-              <w:right w:val="single" w:color="CBD5E1" w:sz="4"/>
-            </w:tcBorders>
-            <w:tcMar>
-              <w:top w:type="dxa" w:w="80"/>
-              <w:left w:type="dxa" w:w="140"/>
-              <w:bottom w:type="dxa" w:w="80"/>
-              <w:right w:type="dxa" w:w="140"/>
-            </w:tcMar>
-          </w:tcPr>
-          <w:p>
-            <w:r>
-              <w:rPr>
-                <w:rFonts w:ascii="Arial" w:cs="Arial" w:eastAsia="Arial" w:hAnsi="Arial"/>
-                <w:b/>
-                <w:bCs/>
-                <w:color w:val="0C2340"/>
-                <w:sz w:val="20"/>
-                <w:szCs w:val="20"/>
-              </w:rPr>
-              <w:t xml:space="preserve">Date of Issue</w:t>
-            </w:r>
-          </w:p>
-        </w:tc>
-        <w:tc>
-          <w:tcPr>
-            <w:tcW w:type="dxa" w:w="6689"/>
-            <w:tcBorders>
-              <w:top w:val="single" w:color="CBD5E1" w:sz="4"/>
-              <w:left w:val="single" w:color="CBD5E1" w:sz="4"/>
-              <w:bottom w:val="single" w:color="CBD5E1" w:sz="4"/>
-              <w:right w:val="single" w:color="CBD5E1" w:sz="4"/>
-            </w:tcBorders>
-            <w:tcMar>
-              <w:top w:type="dxa" w:w="80"/>
-              <w:left w:type="dxa" w:w="140"/>
-              <w:bottom w:type="dxa" w:w="80"/>
-              <w:right w:type="dxa" w:w="140"/>
-            </w:tcMar>
-          </w:tcPr>
-          <w:p>
-            <w:r>
-              <w:rPr>
-                <w:rFonts w:ascii="Arial" w:cs="Arial" w:eastAsia="Arial" w:hAnsi="Arial"/>
-                <w:color w:val="1A1A1A"/>
-                <w:sz w:val="20"/>
-                <w:szCs w:val="20"/>
-              </w:rPr>
-              <w:t xml:space="preserve">Monday, 19 January 2026</w:t>
-            </w:r>
-          </w:p>
-        </w:tc>
-      </w:tr>
-      <w:tr>
-        <w:tc>
-          <w:tcPr>
-            <w:tcW w:type="dxa" w:w="4081"/>
-            <w:tcBorders>
-              <w:top w:val="single" w:color="CBD5E1" w:sz="4"/>
-              <w:left w:val="single" w:color="CBD5E1" w:sz="4"/>
-              <w:bottom w:val="single" w:color="CBD5E1" w:sz="4"/>
-              <w:right w:val="single" w:color="CBD5E1" w:sz="4"/>
-            </w:tcBorders>
-            <w:shd w:fill="F8FAFC"/>
-            <w:tcMar>
-              <w:top w:type="dxa" w:w="80"/>
-              <w:left w:type="dxa" w:w="140"/>
-              <w:bottom w:type="dxa" w:w="80"/>
-              <w:right w:type="dxa" w:w="140"/>
-            </w:tcMar>
-          </w:tcPr>
-          <w:p>
-            <w:r>
-              <w:rPr>
-                <w:rFonts w:ascii="Arial" w:cs="Arial" w:eastAsia="Arial" w:hAnsi="Arial"/>
-                <w:b/>
-                <w:bCs/>
-                <w:color w:val="0C2340"/>
-                <w:sz w:val="20"/>
-                <w:szCs w:val="20"/>
-              </w:rPr>
-              <w:t xml:space="preserve">Meeting Date &amp; Time</w:t>
-            </w:r>
-          </w:p>
-        </w:tc>
-        <w:tc>
-          <w:tcPr>
-            <w:tcW w:type="dxa" w:w="6689"/>
-            <w:tcBorders>
-              <w:top w:val="single" w:color="CBD5E1" w:sz="4"/>
-              <w:left w:val="single" w:color="CBD5E1" w:sz="4"/>
-              <w:bottom w:val="single" w:color="CBD5E1" w:sz="4"/>
-              <w:right w:val="single" w:color="CBD5E1" w:sz="4"/>
-            </w:tcBorders>
-            <w:shd w:fill="F8FAFC"/>
-            <w:tcMar>
-              <w:top w:type="dxa" w:w="80"/>
-              <w:left w:type="dxa" w:w="140"/>
-              <w:bottom w:type="dxa" w:w="80"/>
-              <w:right w:type="dxa" w:w="140"/>
-            </w:tcMar>
-          </w:tcPr>
-          <w:p>
-            <w:r>
-              <w:rPr>
-                <w:rFonts w:ascii="Arial" w:cs="Arial" w:eastAsia="Arial" w:hAnsi="Arial"/>
-                <w:color w:val="1A1A1A"/>
-                <w:sz w:val="20"/>
-                <w:szCs w:val="20"/>
-              </w:rPr>
-              <w:t xml:space="preserve">Wednesday, 28 January 2026 at 17:30</w:t>
-            </w:r>
-          </w:p>
-        </w:tc>
-      </w:tr>
-      <w:tr>
-        <w:tc>
-          <w:tcPr>
-            <w:tcW w:type="dxa" w:w="4081"/>
-            <w:tcBorders>
-              <w:top w:val="single" w:color="CBD5E1" w:sz="4"/>
-              <w:left w:val="single" w:color="CBD5E1" w:sz="4"/>
-              <w:bottom w:val="single" w:color="CBD5E1" w:sz="4"/>
-              <w:right w:val="single" w:color="CBD5E1" w:sz="4"/>
-            </w:tcBorders>
-            <w:tcMar>
-              <w:top w:type="dxa" w:w="80"/>
-              <w:left w:type="dxa" w:w="140"/>
-              <w:bottom w:type="dxa" w:w="80"/>
-              <w:right w:type="dxa" w:w="140"/>
-            </w:tcMar>
-          </w:tcPr>
-          <w:p>
-            <w:r>
-              <w:rPr>
-                <w:rFonts w:ascii="Arial" w:cs="Arial" w:eastAsia="Arial" w:hAnsi="Arial"/>
-                <w:b/>
-                <w:bCs/>
-                <w:color w:val="0C2340"/>
-                <w:sz w:val="20"/>
-                <w:szCs w:val="20"/>
-              </w:rPr>
-              <w:t xml:space="preserve">Meeting Venue</w:t>
-            </w:r>
-          </w:p>
-        </w:tc>
-        <w:tc>
-          <w:tcPr>
-            <w:tcW w:type="dxa" w:w="6689"/>
-            <w:tcBorders>
-              <w:top w:val="single" w:color="CBD5E1" w:sz="4"/>
-              <w:left w:val="single" w:color="CBD5E1" w:sz="4"/>
-              <w:bottom w:val="single" w:color="CBD5E1" w:sz="4"/>
-              <w:right w:val="single" w:color="CBD5E1" w:sz="4"/>
-            </w:tcBorders>
-            <w:tcMar>
-              <w:top w:type="dxa" w:w="80"/>
-              <w:left w:type="dxa" w:w="140"/>
-              <w:bottom w:type="dxa" w:w="80"/>
-              <w:right w:type="dxa" w:w="140"/>
-            </w:tcMar>
-          </w:tcPr>
-          <w:p>
-            <w:r>
-              <w:rPr>
-                <w:rFonts w:ascii="Arial" w:cs="Arial" w:eastAsia="Arial" w:hAnsi="Arial"/>
-                <w:color w:val="1A1A1A"/>
-                <w:sz w:val="20"/>
-                <w:szCs w:val="20"/>
-              </w:rPr>
-              <w:t xml:space="preserve">School Boardroom, Lady Grey Arts Academy</w:t>
-            </w:r>
-          </w:p>
-        </w:tc>
-      </w:tr>
-      <w:tr>
-        <w:tc>
-          <w:tcPr>
-            <w:tcW w:type="dxa" w:w="4081"/>
-            <w:tcBorders>
-              <w:top w:val="single" w:color="CBD5E1" w:sz="4"/>
-              <w:left w:val="single" w:color="CBD5E1" w:sz="4"/>
-              <w:bottom w:val="single" w:color="CBD5E1" w:sz="4"/>
-              <w:right w:val="single" w:color="CBD5E1" w:sz="4"/>
-            </w:tcBorders>
-            <w:shd w:fill="F8FAFC"/>
-            <w:tcMar>
-              <w:top w:type="dxa" w:w="80"/>
-              <w:left w:type="dxa" w:w="140"/>
-              <w:bottom w:type="dxa" w:w="80"/>
-              <w:right w:type="dxa" w:w="140"/>
-            </w:tcMar>
-          </w:tcPr>
-          <w:p>
-            <w:r>
-              <w:rPr>
-                <w:rFonts w:ascii="Arial" w:cs="Arial" w:eastAsia="Arial" w:hAnsi="Arial"/>
-                <w:b/>
-                <w:bCs/>
-                <w:color w:val="0C2340"/>
-                <w:sz w:val="20"/>
-                <w:szCs w:val="20"/>
-              </w:rPr>
-              <w:t xml:space="preserve">Convenor &amp; Chair</w:t>
-            </w:r>
-          </w:p>
-        </w:tc>
-        <w:tc>
-          <w:tcPr>
-            <w:tcW w:type="dxa" w:w="6689"/>
-            <w:tcBorders>
-              <w:top w:val="single" w:color="CBD5E1" w:sz="4"/>
-              <w:left w:val="single" w:color="CBD5E1" w:sz="4"/>
-              <w:bottom w:val="single" w:color="CBD5E1" w:sz="4"/>
-              <w:right w:val="single" w:color="CBD5E1" w:sz="4"/>
-            </w:tcBorders>
-            <w:shd w:fill="F8FAFC"/>
-            <w:tcMar>
-              <w:top w:type="dxa" w:w="80"/>
-              <w:left w:type="dxa" w:w="140"/>
-              <w:bottom w:type="dxa" w:w="80"/>
-              <w:right w:type="dxa" w:w="140"/>
-            </w:tcMar>
-          </w:tcPr>
-          <w:p>
-            <w:r>
-              <w:rPr>
-                <w:rFonts w:ascii="Arial" w:cs="Arial" w:eastAsia="Arial" w:hAnsi="Arial"/>
-                <w:color w:val="1A1A1A"/>
-                <w:sz w:val="20"/>
-                <w:szCs w:val="20"/>
-              </w:rPr>
-              <w:t xml:space="preserve">Mr. Kwezi Dyasi (SGB Chairperson)</w:t>
-            </w:r>
-          </w:p>
-        </w:tc>
-      </w:tr>
-      <w:tr>
-        <w:tc>
-          <w:tcPr>
-            <w:tcW w:type="dxa" w:w="4081"/>
-            <w:tcBorders>
-              <w:top w:val="single" w:color="CBD5E1" w:sz="4"/>
-              <w:left w:val="single" w:color="CBD5E1" w:sz="4"/>
-              <w:bottom w:val="single" w:color="CBD5E1" w:sz="4"/>
-              <w:right w:val="single" w:color="CBD5E1" w:sz="4"/>
-            </w:tcBorders>
-            <w:tcMar>
-              <w:top w:type="dxa" w:w="80"/>
-              <w:left w:type="dxa" w:w="140"/>
-              <w:bottom w:type="dxa" w:w="80"/>
-              <w:right w:type="dxa" w:w="140"/>
-            </w:tcMar>
-          </w:tcPr>
-          <w:p>
-            <w:r>
-              <w:rPr>
-                <w:rFonts w:ascii="Arial" w:cs="Arial" w:eastAsia="Arial" w:hAnsi="Arial"/>
-                <w:b/>
-                <w:bCs/>
-                <w:color w:val="0C2340"/>
-                <w:sz w:val="20"/>
-                <w:szCs w:val="20"/>
-              </w:rPr>
-              <w:t xml:space="preserve">Statutory Mandate</w:t>
-            </w:r>
-          </w:p>
-        </w:tc>
-        <w:tc>
-          <w:tcPr>
-            <w:tcW w:type="dxa" w:w="6689"/>
-            <w:tcBorders>
-              <w:top w:val="single" w:color="CBD5E1" w:sz="4"/>
-              <w:left w:val="single" w:color="CBD5E1" w:sz="4"/>
-              <w:bottom w:val="single" w:color="CBD5E1" w:sz="4"/>
-              <w:right w:val="single" w:color="CBD5E1" w:sz="4"/>
-            </w:tcBorders>
-            <w:tcMar>
-              <w:top w:type="dxa" w:w="80"/>
-              <w:left w:type="dxa" w:w="140"/>
-              <w:bottom w:type="dxa" w:w="80"/>
-              <w:right w:type="dxa" w:w="140"/>
-            </w:tcMar>
-          </w:tcPr>
-          <w:p>
-            <w:r>
-              <w:rPr>
-                <w:rFonts w:ascii="Arial" w:cs="Arial" w:eastAsia="Arial" w:hAnsi="Arial"/>
-                <w:color w:val="1A1A1A"/>
-                <w:sz w:val="20"/>
-                <w:szCs w:val="20"/>
-              </w:rPr>
-              <w:t xml:space="preserve">SASA Act 84 of 1996 (Section 18 Constitution Review)</w:t>
-            </w:r>
-          </w:p>
-        </w:tc>
-      </w:tr>
-    </w:tbl>
-    <w:p>
-      <w:pPr>
-        <w:spacing w:after="0" w:before="120"/>
-      </w:pPr>
     </w:p>
     <w:p>
       <w:pPr>
@@ -751,7 +390,7 @@
           <w:rFonts w:ascii="Arial" w:cs="Arial" w:eastAsia="Arial" w:hAnsi="Arial"/>
           <w:b/>
           <w:bCs/>
-          <w:color w:val="1A1A1A"/>
+          <w:color w:val="0C2340"/>
           <w:sz w:val="20"/>
           <w:szCs w:val="20"/>
         </w:rPr>
@@ -792,7 +431,7 @@
           <w:rFonts w:ascii="Arial" w:cs="Arial" w:eastAsia="Arial" w:hAnsi="Arial"/>
           <w:b/>
           <w:bCs/>
-          <w:color w:val="1A1A1A"/>
+          <w:color w:val="0C2340"/>
           <w:sz w:val="20"/>
           <w:szCs w:val="20"/>
         </w:rPr>
@@ -833,7 +472,7 @@
           <w:rFonts w:ascii="Arial" w:cs="Arial" w:eastAsia="Arial" w:hAnsi="Arial"/>
           <w:b/>
           <w:bCs/>
-          <w:color w:val="1A1A1A"/>
+          <w:color w:val="0C2340"/>
           <w:sz w:val="20"/>
           <w:szCs w:val="20"/>
         </w:rPr>
@@ -874,7 +513,7 @@
           <w:rFonts w:ascii="Arial" w:cs="Arial" w:eastAsia="Arial" w:hAnsi="Arial"/>
           <w:b/>
           <w:bCs/>
-          <w:color w:val="1A1A1A"/>
+          <w:color w:val="0C2340"/>
           <w:sz w:val="20"/>
           <w:szCs w:val="20"/>
         </w:rPr>
@@ -915,7 +554,7 @@
           <w:rFonts w:ascii="Arial" w:cs="Arial" w:eastAsia="Arial" w:hAnsi="Arial"/>
           <w:b/>
           <w:bCs/>
-          <w:color w:val="1A1A1A"/>
+          <w:color w:val="0C2340"/>
           <w:sz w:val="20"/>
           <w:szCs w:val="20"/>
         </w:rPr>
@@ -996,7 +635,7 @@
           <w:rFonts w:ascii="Arial" w:cs="Arial" w:eastAsia="Arial" w:hAnsi="Arial"/>
           <w:b/>
           <w:bCs/>
-          <w:color w:val="1A1A1A"/>
+          <w:color w:val="0C2340"/>
           <w:sz w:val="20"/>
           <w:szCs w:val="20"/>
         </w:rPr>
@@ -1037,7 +676,7 @@
           <w:rFonts w:ascii="Arial" w:cs="Arial" w:eastAsia="Arial" w:hAnsi="Arial"/>
           <w:b/>
           <w:bCs/>
-          <w:color w:val="1A1A1A"/>
+          <w:color w:val="0C2340"/>
           <w:sz w:val="20"/>
           <w:szCs w:val="20"/>
         </w:rPr>
@@ -1078,7 +717,7 @@
           <w:rFonts w:ascii="Arial" w:cs="Arial" w:eastAsia="Arial" w:hAnsi="Arial"/>
           <w:b/>
           <w:bCs/>
-          <w:color w:val="1A1A1A"/>
+          <w:color w:val="0C2340"/>
           <w:sz w:val="20"/>
           <w:szCs w:val="20"/>
         </w:rPr>
@@ -1159,7 +798,7 @@
           <w:rFonts w:ascii="Arial" w:cs="Arial" w:eastAsia="Arial" w:hAnsi="Arial"/>
           <w:b/>
           <w:bCs/>
-          <w:color w:val="1A1A1A"/>
+          <w:color w:val="0C2340"/>
           <w:sz w:val="20"/>
           <w:szCs w:val="20"/>
         </w:rPr>
@@ -1200,7 +839,7 @@
           <w:rFonts w:ascii="Arial" w:cs="Arial" w:eastAsia="Arial" w:hAnsi="Arial"/>
           <w:b/>
           <w:bCs/>
-          <w:color w:val="1A1A1A"/>
+          <w:color w:val="0C2340"/>
           <w:sz w:val="20"/>
           <w:szCs w:val="20"/>
         </w:rPr>
@@ -1241,7 +880,7 @@
           <w:rFonts w:ascii="Arial" w:cs="Arial" w:eastAsia="Arial" w:hAnsi="Arial"/>
           <w:b/>
           <w:bCs/>
-          <w:color w:val="1A1A1A"/>
+          <w:color w:val="0C2340"/>
           <w:sz w:val="20"/>
           <w:szCs w:val="20"/>
         </w:rPr>
@@ -1322,7 +961,7 @@
           <w:rFonts w:ascii="Arial" w:cs="Arial" w:eastAsia="Arial" w:hAnsi="Arial"/>
           <w:b/>
           <w:bCs/>
-          <w:color w:val="1A1A1A"/>
+          <w:color w:val="0C2340"/>
           <w:sz w:val="20"/>
           <w:szCs w:val="20"/>
         </w:rPr>
@@ -1363,7 +1002,7 @@
           <w:rFonts w:ascii="Arial" w:cs="Arial" w:eastAsia="Arial" w:hAnsi="Arial"/>
           <w:b/>
           <w:bCs/>
-          <w:color w:val="1A1A1A"/>
+          <w:color w:val="0C2340"/>
           <w:sz w:val="20"/>
           <w:szCs w:val="20"/>
         </w:rPr>
@@ -1391,6 +1030,120 @@
     </w:p>
     <w:p>
       <w:pPr>
+        <w:keepLines/>
+        <w:tabs>
+          <w:tab w:val="left" w:pos="566"/>
+        </w:tabs>
+        <w:spacing w:after="80" w:before="0"/>
+        <w:ind w:left="0"/>
+      </w:pPr>
+      <w:r>
+        <w:rPr>
+          <w:rFonts w:ascii="Arial" w:cs="Arial" w:eastAsia="Arial" w:hAnsi="Arial"/>
+          <w:b/>
+          <w:bCs/>
+          <w:color w:val="0C2340"/>
+          <w:sz w:val="22"/>
+          <w:szCs w:val="22"/>
+        </w:rPr>
+        <w:t xml:space="preserve">5.</w:t>
+      </w:r>
+      <w:r>
+        <w:rPr>
+          <w:rFonts w:ascii="Arial" w:cs="Arial" w:eastAsia="Arial" w:hAnsi="Arial"/>
+          <w:sz w:val="22"/>
+          <w:szCs w:val="22"/>
+        </w:rPr>
+        <w:t xml:space="preserve">	</w:t>
+      </w:r>
+      <w:r>
+        <w:rPr>
+          <w:rFonts w:ascii="Arial" w:cs="Arial" w:eastAsia="Arial" w:hAnsi="Arial"/>
+          <w:b/>
+          <w:bCs/>
+          <w:color w:val="0C2340"/>
+          <w:sz w:val="22"/>
+          <w:szCs w:val="22"/>
+        </w:rPr>
+        <w:t xml:space="preserve">ISSUED ON BEHALF OF THE SCHOOL GOVERNING BODY</w:t>
+      </w:r>
+    </w:p>
+    <w:p>
+      <w:pPr>
+        <w:keepLines/>
+        <w:spacing w:after="80" w:before="0" w:line="276"/>
+        <w:ind w:left="566"/>
+        <w:jc w:val="both"/>
+      </w:pPr>
+      <w:r>
+        <w:rPr>
+          <w:rFonts w:ascii="Arial" w:cs="Arial" w:eastAsia="Arial" w:hAnsi="Arial"/>
+          <w:color w:val="1A1A1A"/>
+          <w:sz w:val="20"/>
+          <w:szCs w:val="20"/>
+        </w:rPr>
+        <w:t xml:space="preserve">By order of the Executive Committee of the School Governing Body of Lady Grey Arts Academy:</w:t>
+      </w:r>
+    </w:p>
+    <w:p>
+      <w:pPr>
+        <w:keepLines/>
+        <w:tabs>
+          <w:tab w:val="left" w:pos="566"/>
+        </w:tabs>
+        <w:spacing w:after="80" w:before="0"/>
+        <w:ind w:left="0"/>
+      </w:pPr>
+      <w:r>
+        <w:rPr>
+          <w:rFonts w:ascii="Arial" w:cs="Arial" w:eastAsia="Arial" w:hAnsi="Arial"/>
+          <w:b/>
+          <w:bCs/>
+          <w:color w:val="0C2340"/>
+          <w:sz w:val="22"/>
+          <w:szCs w:val="22"/>
+        </w:rPr>
+        <w:t xml:space="preserve">6.</w:t>
+      </w:r>
+      <w:r>
+        <w:rPr>
+          <w:rFonts w:ascii="Arial" w:cs="Arial" w:eastAsia="Arial" w:hAnsi="Arial"/>
+          <w:sz w:val="22"/>
+          <w:szCs w:val="22"/>
+        </w:rPr>
+        <w:t xml:space="preserve">	</w:t>
+      </w:r>
+      <w:r>
+        <w:rPr>
+          <w:rFonts w:ascii="Arial" w:cs="Arial" w:eastAsia="Arial" w:hAnsi="Arial"/>
+          <w:b/>
+          <w:bCs/>
+          <w:color w:val="0C2340"/>
+          <w:sz w:val="22"/>
+          <w:szCs w:val="22"/>
+        </w:rPr>
+        <w:t xml:space="preserve">DISTRICT ENDORSEMENT &amp; RECORD OF RECEIPT</w:t>
+      </w:r>
+    </w:p>
+    <w:p>
+      <w:pPr>
+        <w:keepLines/>
+        <w:spacing w:after="80" w:before="0" w:line="276"/>
+        <w:ind w:left="566"/>
+        <w:jc w:val="both"/>
+      </w:pPr>
+      <w:r>
+        <w:rPr>
+          <w:rFonts w:ascii="Arial" w:cs="Arial" w:eastAsia="Arial" w:hAnsi="Arial"/>
+          <w:color w:val="1A1A1A"/>
+          <w:sz w:val="20"/>
+          <w:szCs w:val="20"/>
+        </w:rPr>
+        <w:t xml:space="preserve">Received, verified, and endorsed for departmental records by the District Office:</w:t>
+      </w:r>
+    </w:p>
+    <w:p>
+      <w:pPr>
         <w:pageBreakBefore/>
         <w:spacing w:after="0" w:before="0"/>
       </w:pPr>
@@ -1409,7 +1162,7 @@
           <w:sz w:val="22"/>
           <w:szCs w:val="22"/>
         </w:rPr>
-        <w:t xml:space="preserve">ISSUED ON BEHALF OF THE SCHOOL GOVERNING BODY</w:t>
+        <w:t xml:space="preserve">CONVENOR &amp; PRINCIPAL AUTHORISATION</w:t>
       </w:r>
     </w:p>
     <w:p>
@@ -1425,7 +1178,7 @@
           <w:sz w:val="20"/>
           <w:szCs w:val="20"/>
         </w:rPr>
-        <w:t xml:space="preserve">By order of the Executive Committee of the School Governing Body of Lady Grey Arts Academy:</w:t>
+        <w:t xml:space="preserve">Issued and signed on behalf of the School Governing Body and Executive Management of Lady Grey Arts Academy:</w:t>
       </w:r>
     </w:p>
     <w:tbl>
@@ -1452,7 +1205,7 @@
         </w:trPr>
         <w:tc>
           <w:tcPr>
-            <w:tcW w:type="dxa" w:w="5215"/>
+            <w:tcW w:type="dxa" w:w="5102"/>
             <w:tcBorders>
               <w:top w:val="single" w:color="94A3B8" w:sz="6"/>
               <w:left w:val="single" w:color="94A3B8" w:sz="6"/>
@@ -1460,28 +1213,28 @@
               <w:right w:val="single" w:color="94A3B8" w:sz="6"/>
             </w:tcBorders>
             <w:tcMar>
-              <w:top w:type="dxa" w:w="100"/>
-              <w:left w:type="dxa" w:w="160"/>
-              <w:bottom w:type="dxa" w:w="100"/>
-              <w:right w:type="dxa" w:w="160"/>
+              <w:top w:type="dxa" w:w="160"/>
+              <w:left w:type="dxa" w:w="200"/>
+              <w:bottom w:type="dxa" w:w="160"/>
+              <w:right w:type="dxa" w:w="200"/>
             </w:tcMar>
           </w:tcPr>
           <w:p>
             <w:pPr>
-              <w:spacing w:after="0" w:before="180"/>
+              <w:spacing w:after="240" w:before="0"/>
             </w:pPr>
           </w:p>
           <w:p>
             <w:pPr>
               <w:pBdr>
-                <w:bottom w:val="single" w:color="0C2340" w:sz="8"/>
+                <w:bottom w:val="single" w:color="0C2340" w:sz="10"/>
               </w:pBdr>
-              <w:spacing w:after="10" w:before="0"/>
-            </w:pPr>
-          </w:p>
-          <w:p>
-            <w:pPr>
-              <w:spacing w:after="90" w:before="0"/>
+              <w:spacing w:after="30" w:before="0"/>
+            </w:pPr>
+          </w:p>
+          <w:p>
+            <w:pPr>
+              <w:spacing w:after="180" w:before="0"/>
             </w:pPr>
             <w:r>
               <w:rPr>
@@ -1489,15 +1242,15 @@
                 <w:b/>
                 <w:bCs/>
                 <w:color w:val="64748B"/>
-                <w:sz w:val="14"/>
-                <w:szCs w:val="14"/>
+                <w:sz w:val="13"/>
+                <w:szCs w:val="13"/>
               </w:rPr>
               <w:t xml:space="preserve">SIGNATURE</w:t>
             </w:r>
           </w:p>
           <w:p>
             <w:pPr>
-              <w:spacing w:after="15" w:before="0"/>
+              <w:spacing w:after="120" w:before="0"/>
             </w:pPr>
             <w:r>
               <w:rPr>
@@ -1505,15 +1258,15 @@
                 <w:b/>
                 <w:bCs/>
                 <w:color w:val="1A1A1A"/>
-                <w:sz w:val="20"/>
-                <w:szCs w:val="20"/>
+                <w:sz w:val="17"/>
+                <w:szCs w:val="17"/>
               </w:rPr>
               <w:t xml:space="preserve">Mr. K. Dyasi</w:t>
             </w:r>
           </w:p>
           <w:p>
             <w:pPr>
-              <w:spacing w:after="20" w:before="0"/>
+              <w:spacing w:after="160" w:before="0"/>
             </w:pPr>
             <w:r>
               <w:rPr>
@@ -1521,15 +1274,15 @@
                 <w:b/>
                 <w:bCs/>
                 <w:color w:val="0C2340"/>
-                <w:sz w:val="19"/>
-                <w:szCs w:val="19"/>
+                <w:sz w:val="16"/>
+                <w:szCs w:val="16"/>
               </w:rPr>
               <w:t xml:space="preserve">SGB CHAIRPERSON</w:t>
             </w:r>
           </w:p>
           <w:p>
             <w:pPr>
-              <w:spacing w:after="0" w:before="40"/>
+              <w:spacing w:after="60" w:before="0"/>
               <w:jc w:val="right"/>
             </w:pPr>
             <w:r>
@@ -1538,17 +1291,19 @@
                 <w:b/>
                 <w:bCs/>
                 <w:color w:val="64748B"/>
-                <w:sz w:val="18"/>
-                <w:szCs w:val="18"/>
+                <w:sz w:val="15"/>
+                <w:szCs w:val="15"/>
               </w:rPr>
               <w:t xml:space="preserve">DATE: </w:t>
             </w:r>
             <w:r>
               <w:rPr>
                 <w:rFonts w:ascii="Arial" w:cs="Arial" w:eastAsia="Arial" w:hAnsi="Arial"/>
+                <w:b/>
+                <w:bCs/>
                 <w:color w:val="1A1A1A"/>
-                <w:sz w:val="18"/>
-                <w:szCs w:val="18"/>
+                <w:sz w:val="15"/>
+                <w:szCs w:val="15"/>
               </w:rPr>
               <w:t xml:space="preserve">19/01/2026</w:t>
             </w:r>
@@ -1556,7 +1311,7 @@
         </w:tc>
         <w:tc>
           <w:tcPr>
-            <w:tcW w:type="dxa" w:w="340"/>
+            <w:tcW w:type="dxa" w:w="566"/>
             <w:tcBorders>
               <w:top w:val="none"/>
               <w:left w:val="none"/>
@@ -1578,7 +1333,7 @@
         </w:tc>
         <w:tc>
           <w:tcPr>
-            <w:tcW w:type="dxa" w:w="5215"/>
+            <w:tcW w:type="dxa" w:w="5102"/>
             <w:tcBorders>
               <w:top w:val="single" w:color="94A3B8" w:sz="6"/>
               <w:left w:val="single" w:color="94A3B8" w:sz="6"/>
@@ -1586,28 +1341,28 @@
               <w:right w:val="single" w:color="94A3B8" w:sz="6"/>
             </w:tcBorders>
             <w:tcMar>
-              <w:top w:type="dxa" w:w="100"/>
-              <w:left w:type="dxa" w:w="160"/>
-              <w:bottom w:type="dxa" w:w="100"/>
-              <w:right w:type="dxa" w:w="160"/>
+              <w:top w:type="dxa" w:w="160"/>
+              <w:left w:type="dxa" w:w="200"/>
+              <w:bottom w:type="dxa" w:w="160"/>
+              <w:right w:type="dxa" w:w="200"/>
             </w:tcMar>
           </w:tcPr>
           <w:p>
             <w:pPr>
-              <w:spacing w:after="0" w:before="180"/>
+              <w:spacing w:after="240" w:before="0"/>
             </w:pPr>
           </w:p>
           <w:p>
             <w:pPr>
               <w:pBdr>
-                <w:bottom w:val="single" w:color="0C2340" w:sz="8"/>
+                <w:bottom w:val="single" w:color="0C2340" w:sz="10"/>
               </w:pBdr>
-              <w:spacing w:after="10" w:before="0"/>
-            </w:pPr>
-          </w:p>
-          <w:p>
-            <w:pPr>
-              <w:spacing w:after="90" w:before="0"/>
+              <w:spacing w:after="30" w:before="0"/>
+            </w:pPr>
+          </w:p>
+          <w:p>
+            <w:pPr>
+              <w:spacing w:after="180" w:before="0"/>
             </w:pPr>
             <w:r>
               <w:rPr>
@@ -1615,15 +1370,15 @@
                 <w:b/>
                 <w:bCs/>
                 <w:color w:val="64748B"/>
-                <w:sz w:val="14"/>
-                <w:szCs w:val="14"/>
+                <w:sz w:val="13"/>
+                <w:szCs w:val="13"/>
               </w:rPr>
               <w:t xml:space="preserve">SIGNATURE</w:t>
             </w:r>
           </w:p>
           <w:p>
             <w:pPr>
-              <w:spacing w:after="15" w:before="0"/>
+              <w:spacing w:after="120" w:before="0"/>
             </w:pPr>
             <w:r>
               <w:rPr>
@@ -1631,15 +1386,15 @@
                 <w:b/>
                 <w:bCs/>
                 <w:color w:val="1A1A1A"/>
-                <w:sz w:val="20"/>
-                <w:szCs w:val="20"/>
+                <w:sz w:val="17"/>
+                <w:szCs w:val="17"/>
               </w:rPr>
               <w:t xml:space="preserve">Ms. M. Botha</w:t>
             </w:r>
           </w:p>
           <w:p>
             <w:pPr>
-              <w:spacing w:after="20" w:before="0"/>
+              <w:spacing w:after="160" w:before="0"/>
             </w:pPr>
             <w:r>
               <w:rPr>
@@ -1647,15 +1402,15 @@
                 <w:b/>
                 <w:bCs/>
                 <w:color w:val="0C2340"/>
-                <w:sz w:val="19"/>
-                <w:szCs w:val="19"/>
+                <w:sz w:val="16"/>
+                <w:szCs w:val="16"/>
               </w:rPr>
               <w:t xml:space="preserve">SCHOOL PRINCIPAL</w:t>
             </w:r>
           </w:p>
           <w:p>
             <w:pPr>
-              <w:spacing w:after="0" w:before="40"/>
+              <w:spacing w:after="60" w:before="0"/>
               <w:jc w:val="right"/>
             </w:pPr>
             <w:r>
@@ -1664,17 +1419,19 @@
                 <w:b/>
                 <w:bCs/>
                 <w:color w:val="64748B"/>
-                <w:sz w:val="18"/>
-                <w:szCs w:val="18"/>
+                <w:sz w:val="15"/>
+                <w:szCs w:val="15"/>
               </w:rPr>
               <w:t xml:space="preserve">DATE: </w:t>
             </w:r>
             <w:r>
               <w:rPr>
                 <w:rFonts w:ascii="Arial" w:cs="Arial" w:eastAsia="Arial" w:hAnsi="Arial"/>
+                <w:b/>
+                <w:bCs/>
                 <w:color w:val="1A1A1A"/>
-                <w:sz w:val="18"/>
-                <w:szCs w:val="18"/>
+                <w:sz w:val="15"/>
+                <w:szCs w:val="15"/>
               </w:rPr>
               <w:t xml:space="preserve">19/01/2026</w:t>
             </w:r>
@@ -1689,7 +1446,7 @@
     </w:p>
     <w:tbl>
       <w:tblPr>
-        <w:tblW w:type="dxa" w:w="3590"/>
+        <w:tblW w:type="dxa" w:w="4535"/>
         <w:jc w:val="left"/>
         <w:tblBorders>
           <w:top w:val="dashed" w:color="94A3B8" w:sz="6"/>
@@ -1706,21 +1463,22 @@
       <w:tr>
         <w:trPr>
           <w:cantSplit/>
+          <w:trHeight w:val="2948" w:hRule="atLeast"/>
         </w:trPr>
         <w:tc>
           <w:tcPr>
-            <w:tcW w:type="dxa" w:w="3590"/>
+            <w:tcW w:type="dxa" w:w="4535"/>
             <w:shd w:fill="F8FAFC" w:val="clear"/>
             <w:tcMar>
               <w:top w:type="dxa" w:w="100"/>
               <w:left w:type="dxa" w:w="140"/>
-              <w:bottom w:type="dxa" w:w="100"/>
+              <w:bottom w:type="dxa" w:w="80"/>
               <w:right w:type="dxa" w:w="140"/>
             </w:tcMar>
           </w:tcPr>
           <w:p>
             <w:pPr>
-              <w:spacing w:after="30" w:before="60"/>
+              <w:spacing w:after="30" w:before="80"/>
               <w:jc w:val="center"/>
             </w:pPr>
             <w:r>
@@ -1729,15 +1487,15 @@
                 <w:b/>
                 <w:bCs/>
                 <w:color w:val="475569"/>
-                <w:sz w:val="15"/>
-                <w:szCs w:val="15"/>
+                <w:sz w:val="16"/>
+                <w:szCs w:val="16"/>
               </w:rPr>
               <w:t xml:space="preserve">OFFICIAL SCHOOL STAMP</w:t>
             </w:r>
           </w:p>
           <w:p>
             <w:pPr>
-              <w:spacing w:after="80" w:before="80"/>
+              <w:spacing w:after="40" w:before="2450"/>
               <w:jc w:val="center"/>
             </w:pPr>
             <w:r>
@@ -1806,6 +1564,7 @@
       <w:tr>
         <w:trPr>
           <w:cantSplit/>
+          <w:trHeight w:val="2948" w:hRule="atLeast"/>
         </w:trPr>
         <w:tc>
           <w:tcPr>
@@ -1820,13 +1579,13 @@
             <w:tcMar>
               <w:top w:type="dxa" w:w="120"/>
               <w:left w:type="dxa" w:w="160"/>
-              <w:bottom w:type="dxa" w:w="120"/>
+              <w:bottom w:type="dxa" w:w="80"/>
               <w:right w:type="dxa" w:w="160"/>
             </w:tcMar>
           </w:tcPr>
           <w:p>
             <w:pPr>
-              <w:spacing w:after="40" w:before="80"/>
+              <w:spacing w:after="30" w:before="80"/>
               <w:jc w:val="center"/>
             </w:pPr>
             <w:r>
@@ -1835,15 +1594,15 @@
                 <w:b/>
                 <w:bCs/>
                 <w:color w:val="475569"/>
-                <w:sz w:val="15"/>
-                <w:szCs w:val="15"/>
+                <w:sz w:val="16"/>
+                <w:szCs w:val="16"/>
               </w:rPr>
               <w:t xml:space="preserve">OFFICIAL DISTRICT / CIRCUIT STAMP</w:t>
             </w:r>
           </w:p>
           <w:p>
             <w:pPr>
-              <w:spacing w:after="160" w:before="180"/>
+              <w:spacing w:after="40" w:before="2450"/>
               <w:jc w:val="center"/>
             </w:pPr>
             <w:r>
@@ -1889,28 +1648,28 @@
               <w:right w:val="single" w:color="94A3B8" w:sz="6"/>
             </w:tcBorders>
             <w:tcMar>
-              <w:top w:type="dxa" w:w="100"/>
+              <w:top w:type="dxa" w:w="120"/>
               <w:left w:type="dxa" w:w="160"/>
-              <w:bottom w:type="dxa" w:w="100"/>
+              <w:bottom w:type="dxa" w:w="120"/>
               <w:right w:type="dxa" w:w="160"/>
             </w:tcMar>
           </w:tcPr>
           <w:p>
             <w:pPr>
-              <w:spacing w:after="0" w:before="180"/>
+              <w:spacing w:after="300" w:before="0"/>
             </w:pPr>
           </w:p>
           <w:p>
             <w:pPr>
               <w:pBdr>
-                <w:bottom w:val="single" w:color="0C2340" w:sz="8"/>
+                <w:bottom w:val="single" w:color="0C2340" w:sz="10"/>
               </w:pBdr>
-              <w:spacing w:after="10" w:before="0"/>
-            </w:pPr>
-          </w:p>
-          <w:p>
-            <w:pPr>
-              <w:spacing w:after="90" w:before="0"/>
+              <w:spacing w:after="30" w:before="0"/>
+            </w:pPr>
+          </w:p>
+          <w:p>
+            <w:pPr>
+              <w:spacing w:after="300" w:before="0"/>
             </w:pPr>
             <w:r>
               <w:rPr>
@@ -1918,18 +1677,15 @@
                 <w:b/>
                 <w:bCs/>
                 <w:color w:val="64748B"/>
-                <w:sz w:val="14"/>
-                <w:szCs w:val="14"/>
+                <w:sz w:val="13"/>
+                <w:szCs w:val="13"/>
               </w:rPr>
               <w:t xml:space="preserve">SIGNATURE</w:t>
             </w:r>
           </w:p>
           <w:p>
             <w:pPr>
-              <w:tabs>
-                <w:tab w:val="right" w:pos="4924" w:leader="underscore"/>
-              </w:tabs>
-              <w:spacing w:after="15" w:before="0"/>
+              <w:spacing w:after="240" w:before="0"/>
             </w:pPr>
             <w:r>
               <w:rPr>
@@ -1937,15 +1693,24 @@
                 <w:b/>
                 <w:bCs/>
                 <w:color w:val="64748B"/>
-                <w:sz w:val="18"/>
-                <w:szCs w:val="18"/>
-              </w:rPr>
-              <w:t xml:space="preserve">NAME:	</w:t>
-            </w:r>
-          </w:p>
-          <w:p>
-            <w:pPr>
-              <w:spacing w:after="20" w:before="0"/>
+                <w:sz w:val="15"/>
+                <w:szCs w:val="15"/>
+              </w:rPr>
+              <w:t xml:space="preserve">NAME: </w:t>
+            </w:r>
+            <w:r>
+              <w:rPr>
+                <w:rFonts w:ascii="Arial" w:cs="Arial" w:eastAsia="Arial" w:hAnsi="Arial"/>
+                <w:color w:val="94A3B8"/>
+                <w:sz w:val="14"/>
+                <w:szCs w:val="14"/>
+              </w:rPr>
+              <w:t xml:space="preserve">__________________________________________________________</w:t>
+            </w:r>
+          </w:p>
+          <w:p>
+            <w:pPr>
+              <w:spacing w:after="300" w:before="0"/>
             </w:pPr>
             <w:r>
               <w:rPr>
@@ -1953,16 +1718,15 @@
                 <w:b/>
                 <w:bCs/>
                 <w:color w:val="0C2340"/>
-                <w:sz w:val="19"/>
-                <w:szCs w:val="19"/>
+                <w:sz w:val="16"/>
+                <w:szCs w:val="16"/>
               </w:rPr>
               <w:t xml:space="preserve">CIRCUIT MANAGER</w:t>
             </w:r>
           </w:p>
           <w:p>
             <w:pPr>
-              <w:spacing w:after="0" w:before="40"/>
-              <w:jc w:val="right"/>
+              <w:spacing w:after="120" w:before="0"/>
             </w:pPr>
             <w:r>
               <w:rPr>
@@ -1970,8 +1734,8 @@
                 <w:b/>
                 <w:bCs/>
                 <w:color w:val="64748B"/>
-                <w:sz w:val="18"/>
-                <w:szCs w:val="18"/>
+                <w:sz w:val="15"/>
+                <w:szCs w:val="15"/>
               </w:rPr>
               <w:t xml:space="preserve">DATE: </w:t>
             </w:r>
@@ -1979,18 +1743,17 @@
               <w:rPr>
                 <w:rFonts w:ascii="Arial" w:cs="Arial" w:eastAsia="Arial" w:hAnsi="Arial"/>
                 <w:color w:val="94A3B8"/>
-                <w:sz w:val="18"/>
-                <w:szCs w:val="18"/>
-              </w:rPr>
-              <w:t xml:space="preserve">________________________</w:t>
+                <w:sz w:val="14"/>
+                <w:szCs w:val="14"/>
+              </w:rPr>
+              <w:t xml:space="preserve">__________________________________________________________</w:t>
             </w:r>
           </w:p>
         </w:tc>
       </w:tr>
     </w:tbl>
     <w:sectPr>
-      <w:headerReference w:type="default" r:id="rId7"/>
-      <w:footerReference w:type="default" r:id="rId8"/>
+      <w:footerReference w:type="default" r:id="rId7"/>
       <w:pgSz w:w="11905" w:h="16837" w:orient="portrait"/>
       <w:pgMar w:top="566" w:right="566" w:bottom="566" w:left="566" w:header="453" w:footer="453" w:gutter="0"/>
       <w:pgNumType/>
@@ -2123,48 +1886,6 @@
     </w:p>
   </w:footnote>
 </w:footnotes>
-</file>
-
-<file path=word/header1.xml><?xml version="1.0" encoding="utf-8"?>
-<w:hdr xmlns:wpc="http://schemas.microsoft.com/office/word/2010/wordprocessingCanvas" xmlns:mc="http://schemas.openxmlformats.org/markup-compatibility/2006" xmlns:o="urn:schemas-microsoft-com:office:office" xmlns:r="http://schemas.openxmlformats.org/officeDocument/2006/relationships" xmlns:m="http://schemas.openxmlformats.org/officeDocument/2006/math" xmlns:v="urn:schemas-microsoft-com:vml" xmlns:wp14="http://schemas.microsoft.com/office/word/2010/wordprocessingDrawing" xmlns:wp="http://schemas.openxmlformats.org/drawingml/2006/wordprocessingDrawing" xmlns:w10="urn:schemas-microsoft-com:office:word" xmlns:w="http://schemas.openxmlformats.org/wordprocessingml/2006/main" xmlns:w14="http://schemas.microsoft.com/office/word/2010/wordml" xmlns:w15="http://schemas.microsoft.com/office/word/2012/wordml" xmlns:wpg="http://schemas.microsoft.com/office/word/2010/wordprocessingGroup" xmlns:wpi="http://schemas.microsoft.com/office/word/2010/wordprocessingInk" xmlns:wne="http://schemas.microsoft.com/office/word/2006/wordml" xmlns:wps="http://schemas.microsoft.com/office/word/2010/wordprocessingShape" xmlns:cx="http://schemas.microsoft.com/office/drawing/2014/chartex" xmlns:cx1="http://schemas.microsoft.com/office/drawing/2015/9/8/chartex" xmlns:cx2="http://schemas.microsoft.com/office/drawing/2015/10/21/chartex" xmlns:cx3="http://schemas.microsoft.com/office/drawing/2016/5/9/chartex" xmlns:cx4="http://schemas.microsoft.com/office/drawing/2016/5/10/chartex" xmlns:cx5="http://schemas.microsoft.com/office/drawing/2016/5/11/chartex" xmlns:cx6="http://schemas.microsoft.com/office/drawing/2016/5/12/chartex" xmlns:cx7="http://schemas.microsoft.com/office/drawing/2016/5/13/chartex" xmlns:cx8="http://schemas.microsoft.com/office/drawing/2016/5/14/chartex" xmlns:w16cid="http://schemas.microsoft.com/office/word/2016/wordml/cid" xmlns:w16se="http://schemas.microsoft.com/office/word/2015/wordml/symex">
-  <w:p>
-    <w:pPr>
-      <w:pBdr>
-        <w:bottom w:val="single" w:color="CBD5E1" w:sz="6"/>
-      </w:pBdr>
-      <w:tabs>
-        <w:tab w:val="right" w:pos="10771"/>
-      </w:tabs>
-      <w:spacing w:after="80" w:before="0"/>
-    </w:pPr>
-    <w:r>
-      <w:rPr>
-        <w:rFonts w:ascii="Arial" w:cs="Arial" w:eastAsia="Arial" w:hAnsi="Arial"/>
-        <w:b/>
-        <w:bCs/>
-        <w:color w:val="0C2340"/>
-        <w:sz w:val="16"/>
-        <w:szCs w:val="16"/>
-      </w:rPr>
-      <w:t xml:space="preserve">LADY GREY ARTS ACADEMY • NOTICE OF ORDINARY SGB MEETING</w:t>
-    </w:r>
-    <w:r>
-      <w:rPr>
-        <w:rFonts w:ascii="Arial" w:cs="Arial" w:eastAsia="Arial" w:hAnsi="Arial"/>
-      </w:rPr>
-      <w:t xml:space="preserve">	</w:t>
-    </w:r>
-    <w:r>
-      <w:rPr>
-        <w:rFonts w:ascii="Arial" w:cs="Arial" w:eastAsia="Arial" w:hAnsi="Arial"/>
-        <w:color w:val="64748B"/>
-        <w:sz w:val="14"/>
-        <w:szCs w:val="14"/>
-      </w:rPr>
-      <w:t xml:space="preserve">SGB</w:t>
-    </w:r>
-  </w:p>
-</w:hdr>
 </file>
 
 <file path=word/numbering.xml><?xml version="1.0" encoding="utf-8"?>

</xml_diff>

<commit_message>
Fix agenda items ordering by highest votes first, fix multi-page print preview, and resolve startup store parse issue
</commit_message>
<xml_diff>
--- a/SGB_Functionality_Audit_2026/01_SGB_Constitution/01_Meeting_Notice_and_Invitation_2026-01-19.docx
+++ b/SGB_Functionality_Audit_2026/01_SGB_Constitution/01_Meeting_Notice_and_Invitation_2026-01-19.docx
@@ -169,7 +169,7 @@
             </w:pPr>
             <w:r>
               <w:rPr>
-                <w:rFonts w:ascii="Arial" w:cs="Arial" w:eastAsia="Arial" w:hAnsi="Arial"/>
+                <w:rFonts w:ascii="Aptos" w:cs="Aptos" w:eastAsia="Aptos" w:hAnsi="Aptos"/>
                 <w:b/>
                 <w:bCs/>
                 <w:color w:val="0C2340"/>
@@ -185,7 +185,7 @@
             </w:pPr>
             <w:r>
               <w:rPr>
-                <w:rFonts w:ascii="Arial" w:cs="Arial" w:eastAsia="Arial" w:hAnsi="Arial"/>
+                <w:rFonts w:ascii="Aptos" w:cs="Aptos" w:eastAsia="Aptos" w:hAnsi="Aptos"/>
                 <w:b/>
                 <w:bCs/>
                 <w:i/>
@@ -203,7 +203,7 @@
             </w:pPr>
             <w:r>
               <w:rPr>
-                <w:rFonts w:ascii="Arial" w:cs="Arial" w:eastAsia="Arial" w:hAnsi="Arial"/>
+                <w:rFonts w:ascii="Aptos" w:cs="Aptos" w:eastAsia="Aptos" w:hAnsi="Aptos"/>
                 <w:color w:val="475569"/>
                 <w:sz w:val="14"/>
                 <w:szCs w:val="14"/>
@@ -217,7 +217,7 @@
             </w:pPr>
             <w:r>
               <w:rPr>
-                <w:rFonts w:ascii="Arial" w:cs="Arial" w:eastAsia="Arial" w:hAnsi="Arial"/>
+                <w:rFonts w:ascii="Aptos" w:cs="Aptos" w:eastAsia="Aptos" w:hAnsi="Aptos"/>
                 <w:color w:val="475569"/>
                 <w:sz w:val="14"/>
                 <w:szCs w:val="14"/>
@@ -249,7 +249,7 @@
             </w:pPr>
             <w:r>
               <w:rPr>
-                <w:rFonts w:ascii="Arial" w:cs="Arial" w:eastAsia="Arial" w:hAnsi="Arial"/>
+                <w:rFonts w:ascii="Aptos" w:cs="Aptos" w:eastAsia="Aptos" w:hAnsi="Aptos"/>
                 <w:b/>
                 <w:bCs/>
                 <w:color w:val="0C2340"/>
@@ -265,7 +265,7 @@
             </w:pPr>
             <w:r>
               <w:rPr>
-                <w:rFonts w:ascii="Arial" w:cs="Arial" w:eastAsia="Arial" w:hAnsi="Arial"/>
+                <w:rFonts w:ascii="Aptos" w:cs="Aptos" w:eastAsia="Aptos" w:hAnsi="Aptos"/>
                 <w:color w:val="64748B"/>
                 <w:sz w:val="14"/>
                 <w:szCs w:val="14"/>
@@ -291,7 +291,7 @@
       </w:pPr>
       <w:r>
         <w:rPr>
-          <w:rFonts w:ascii="Arial" w:cs="Arial" w:eastAsia="Arial" w:hAnsi="Arial"/>
+          <w:rFonts w:ascii="Aptos" w:cs="Aptos" w:eastAsia="Aptos" w:hAnsi="Aptos"/>
           <w:b/>
           <w:bCs/>
           <w:color w:val="0C2340"/>
@@ -308,29 +308,12 @@
       </w:pPr>
       <w:r>
         <w:rPr>
-          <w:rFonts w:ascii="Arial" w:cs="Arial" w:eastAsia="Arial" w:hAnsi="Arial"/>
+          <w:rFonts w:ascii="Aptos" w:cs="Aptos" w:eastAsia="Aptos" w:hAnsi="Aptos"/>
           <w:b/>
           <w:bCs/>
           <w:color w:val="A6192E"/>
-          <w:sz w:val="24"/>
-          <w:szCs w:val="24"/>
-        </w:rPr>
-        <w:t xml:space="preserve">LADY GREY ARTS ACADEMY</w:t>
-      </w:r>
-    </w:p>
-    <w:p>
-      <w:pPr>
-        <w:keepLines/>
-        <w:spacing w:after="80" w:before="0" w:line="276"/>
-        <w:ind w:left="0"/>
-        <w:jc w:val="both"/>
-      </w:pPr>
-      <w:r>
-        <w:rPr>
-          <w:rFonts w:ascii="Arial" w:cs="Arial" w:eastAsia="Arial" w:hAnsi="Arial"/>
-          <w:color w:val="1A1A1A"/>
-          <w:sz w:val="20"/>
-          <w:szCs w:val="20"/>
+          <w:sz w:val="22"/>
+          <w:szCs w:val="22"/>
         </w:rPr>
         <w:t xml:space="preserve">LADY GREY ARTS ACADEMY • GOVERNANCE CYCLE 2026</w:t>
       </w:r>
@@ -341,12 +324,12 @@
         <w:tabs>
           <w:tab w:val="left" w:pos="566"/>
         </w:tabs>
-        <w:spacing w:after="80" w:before="0"/>
+        <w:spacing w:after="0" w:before="100"/>
         <w:ind w:left="0"/>
       </w:pPr>
       <w:r>
         <w:rPr>
-          <w:rFonts w:ascii="Arial" w:cs="Arial" w:eastAsia="Arial" w:hAnsi="Arial"/>
+          <w:rFonts w:ascii="Aptos" w:cs="Aptos" w:eastAsia="Aptos" w:hAnsi="Aptos"/>
           <w:b/>
           <w:bCs/>
           <w:color w:val="0C2340"/>
@@ -357,7 +340,7 @@
       </w:r>
       <w:r>
         <w:rPr>
-          <w:rFonts w:ascii="Arial" w:cs="Arial" w:eastAsia="Arial" w:hAnsi="Arial"/>
+          <w:rFonts w:ascii="Aptos" w:cs="Aptos" w:eastAsia="Aptos" w:hAnsi="Aptos"/>
           <w:sz w:val="22"/>
           <w:szCs w:val="22"/>
         </w:rPr>
@@ -365,7 +348,7 @@
       </w:r>
       <w:r>
         <w:rPr>
-          <w:rFonts w:ascii="Arial" w:cs="Arial" w:eastAsia="Arial" w:hAnsi="Arial"/>
+          <w:rFonts w:ascii="Aptos" w:cs="Aptos" w:eastAsia="Aptos" w:hAnsi="Aptos"/>
           <w:b/>
           <w:bCs/>
           <w:color w:val="0C2340"/>
@@ -381,16 +364,16 @@
         <w:tabs>
           <w:tab w:val="left" w:pos="566"/>
         </w:tabs>
-        <w:spacing w:after="80" w:before="0" w:line="276"/>
+        <w:spacing w:after="0" w:before="100" w:line="300"/>
         <w:ind w:left="566" w:hanging="566"/>
         <w:jc w:val="both"/>
       </w:pPr>
       <w:r>
         <w:rPr>
-          <w:rFonts w:ascii="Arial" w:cs="Arial" w:eastAsia="Arial" w:hAnsi="Arial"/>
-          <w:b/>
-          <w:bCs/>
-          <w:color w:val="0C2340"/>
+          <w:rFonts w:ascii="Aptos" w:cs="Aptos" w:eastAsia="Aptos" w:hAnsi="Aptos"/>
+          <w:b/>
+          <w:bCs/>
+          <w:color w:val="1A1A1A"/>
           <w:sz w:val="20"/>
           <w:szCs w:val="20"/>
         </w:rPr>
@@ -398,7 +381,7 @@
       </w:r>
       <w:r>
         <w:rPr>
-          <w:rFonts w:ascii="Arial" w:cs="Arial" w:eastAsia="Arial" w:hAnsi="Arial"/>
+          <w:rFonts w:ascii="Aptos" w:cs="Aptos" w:eastAsia="Aptos" w:hAnsi="Aptos"/>
           <w:sz w:val="20"/>
           <w:szCs w:val="20"/>
         </w:rPr>
@@ -406,14 +389,14 @@
       </w:r>
       <w:r>
         <w:rPr>
-          <w:rFonts w:ascii="Arial" w:cs="Arial" w:eastAsia="Arial" w:hAnsi="Arial"/>
+          <w:rFonts w:ascii="Aptos" w:cs="Aptos" w:eastAsia="Aptos" w:hAnsi="Aptos"/>
           <w:b w:val="false"/>
           <w:bCs w:val="false"/>
           <w:color w:val="1A1A1A"/>
           <w:sz w:val="20"/>
           <w:szCs w:val="20"/>
         </w:rPr>
-        <w:t xml:space="preserve">Notice is hereby given to all elected and ex-officio members of the School Governing Body of Lady Grey Arts Academy of an Ordinary Governance Meeting.</w:t>
+        <w:t xml:space="preserve">Notice is hereby given to all 10 elected and ex-officio members of the School Governing Body of Lady Grey Arts Academy of an Ordinary Governance Meeting.</w:t>
       </w:r>
     </w:p>
     <w:p>
@@ -422,16 +405,16 @@
         <w:tabs>
           <w:tab w:val="left" w:pos="566"/>
         </w:tabs>
-        <w:spacing w:after="80" w:before="0" w:line="276"/>
+        <w:spacing w:after="0" w:before="100" w:line="300"/>
         <w:ind w:left="566" w:hanging="566"/>
         <w:jc w:val="both"/>
       </w:pPr>
       <w:r>
         <w:rPr>
-          <w:rFonts w:ascii="Arial" w:cs="Arial" w:eastAsia="Arial" w:hAnsi="Arial"/>
-          <w:b/>
-          <w:bCs/>
-          <w:color w:val="0C2340"/>
+          <w:rFonts w:ascii="Aptos" w:cs="Aptos" w:eastAsia="Aptos" w:hAnsi="Aptos"/>
+          <w:b/>
+          <w:bCs/>
+          <w:color w:val="1A1A1A"/>
           <w:sz w:val="20"/>
           <w:szCs w:val="20"/>
         </w:rPr>
@@ -439,7 +422,7 @@
       </w:r>
       <w:r>
         <w:rPr>
-          <w:rFonts w:ascii="Arial" w:cs="Arial" w:eastAsia="Arial" w:hAnsi="Arial"/>
+          <w:rFonts w:ascii="Aptos" w:cs="Aptos" w:eastAsia="Aptos" w:hAnsi="Aptos"/>
           <w:sz w:val="20"/>
           <w:szCs w:val="20"/>
         </w:rPr>
@@ -447,7 +430,7 @@
       </w:r>
       <w:r>
         <w:rPr>
-          <w:rFonts w:ascii="Arial" w:cs="Arial" w:eastAsia="Arial" w:hAnsi="Arial"/>
+          <w:rFonts w:ascii="Aptos" w:cs="Aptos" w:eastAsia="Aptos" w:hAnsi="Aptos"/>
           <w:b w:val="false"/>
           <w:bCs w:val="false"/>
           <w:color w:val="1A1A1A"/>
@@ -463,16 +446,16 @@
         <w:tabs>
           <w:tab w:val="left" w:pos="566"/>
         </w:tabs>
-        <w:spacing w:after="80" w:before="0" w:line="276"/>
+        <w:spacing w:after="0" w:before="100" w:line="300"/>
         <w:ind w:left="566" w:hanging="566"/>
         <w:jc w:val="both"/>
       </w:pPr>
       <w:r>
         <w:rPr>
-          <w:rFonts w:ascii="Arial" w:cs="Arial" w:eastAsia="Arial" w:hAnsi="Arial"/>
-          <w:b/>
-          <w:bCs/>
-          <w:color w:val="0C2340"/>
+          <w:rFonts w:ascii="Aptos" w:cs="Aptos" w:eastAsia="Aptos" w:hAnsi="Aptos"/>
+          <w:b/>
+          <w:bCs/>
+          <w:color w:val="1A1A1A"/>
           <w:sz w:val="20"/>
           <w:szCs w:val="20"/>
         </w:rPr>
@@ -480,7 +463,7 @@
       </w:r>
       <w:r>
         <w:rPr>
-          <w:rFonts w:ascii="Arial" w:cs="Arial" w:eastAsia="Arial" w:hAnsi="Arial"/>
+          <w:rFonts w:ascii="Aptos" w:cs="Aptos" w:eastAsia="Aptos" w:hAnsi="Aptos"/>
           <w:sz w:val="20"/>
           <w:szCs w:val="20"/>
         </w:rPr>
@@ -488,7 +471,7 @@
       </w:r>
       <w:r>
         <w:rPr>
-          <w:rFonts w:ascii="Arial" w:cs="Arial" w:eastAsia="Arial" w:hAnsi="Arial"/>
+          <w:rFonts w:ascii="Aptos" w:cs="Aptos" w:eastAsia="Aptos" w:hAnsi="Aptos"/>
           <w:b w:val="false"/>
           <w:bCs w:val="false"/>
           <w:color w:val="1A1A1A"/>
@@ -504,16 +487,16 @@
         <w:tabs>
           <w:tab w:val="left" w:pos="566"/>
         </w:tabs>
-        <w:spacing w:after="80" w:before="0" w:line="276"/>
+        <w:spacing w:after="0" w:before="100" w:line="300"/>
         <w:ind w:left="566" w:hanging="566"/>
         <w:jc w:val="both"/>
       </w:pPr>
       <w:r>
         <w:rPr>
-          <w:rFonts w:ascii="Arial" w:cs="Arial" w:eastAsia="Arial" w:hAnsi="Arial"/>
-          <w:b/>
-          <w:bCs/>
-          <w:color w:val="0C2340"/>
+          <w:rFonts w:ascii="Aptos" w:cs="Aptos" w:eastAsia="Aptos" w:hAnsi="Aptos"/>
+          <w:b/>
+          <w:bCs/>
+          <w:color w:val="1A1A1A"/>
           <w:sz w:val="20"/>
           <w:szCs w:val="20"/>
         </w:rPr>
@@ -521,7 +504,7 @@
       </w:r>
       <w:r>
         <w:rPr>
-          <w:rFonts w:ascii="Arial" w:cs="Arial" w:eastAsia="Arial" w:hAnsi="Arial"/>
+          <w:rFonts w:ascii="Aptos" w:cs="Aptos" w:eastAsia="Aptos" w:hAnsi="Aptos"/>
           <w:sz w:val="20"/>
           <w:szCs w:val="20"/>
         </w:rPr>
@@ -529,7 +512,7 @@
       </w:r>
       <w:r>
         <w:rPr>
-          <w:rFonts w:ascii="Arial" w:cs="Arial" w:eastAsia="Arial" w:hAnsi="Arial"/>
+          <w:rFonts w:ascii="Aptos" w:cs="Aptos" w:eastAsia="Aptos" w:hAnsi="Aptos"/>
           <w:b w:val="false"/>
           <w:bCs w:val="false"/>
           <w:color w:val="1A1A1A"/>
@@ -545,16 +528,16 @@
         <w:tabs>
           <w:tab w:val="left" w:pos="566"/>
         </w:tabs>
-        <w:spacing w:after="80" w:before="0" w:line="276"/>
+        <w:spacing w:after="0" w:before="100" w:line="300"/>
         <w:ind w:left="566" w:hanging="566"/>
         <w:jc w:val="both"/>
       </w:pPr>
       <w:r>
         <w:rPr>
-          <w:rFonts w:ascii="Arial" w:cs="Arial" w:eastAsia="Arial" w:hAnsi="Arial"/>
-          <w:b/>
-          <w:bCs/>
-          <w:color w:val="0C2340"/>
+          <w:rFonts w:ascii="Aptos" w:cs="Aptos" w:eastAsia="Aptos" w:hAnsi="Aptos"/>
+          <w:b/>
+          <w:bCs/>
+          <w:color w:val="1A1A1A"/>
           <w:sz w:val="20"/>
           <w:szCs w:val="20"/>
         </w:rPr>
@@ -562,7 +545,7 @@
       </w:r>
       <w:r>
         <w:rPr>
-          <w:rFonts w:ascii="Arial" w:cs="Arial" w:eastAsia="Arial" w:hAnsi="Arial"/>
+          <w:rFonts w:ascii="Aptos" w:cs="Aptos" w:eastAsia="Aptos" w:hAnsi="Aptos"/>
           <w:sz w:val="20"/>
           <w:szCs w:val="20"/>
         </w:rPr>
@@ -570,7 +553,7 @@
       </w:r>
       <w:r>
         <w:rPr>
-          <w:rFonts w:ascii="Arial" w:cs="Arial" w:eastAsia="Arial" w:hAnsi="Arial"/>
+          <w:rFonts w:ascii="Aptos" w:cs="Aptos" w:eastAsia="Aptos" w:hAnsi="Aptos"/>
           <w:b w:val="false"/>
           <w:bCs w:val="false"/>
           <w:color w:val="1A1A1A"/>
@@ -586,12 +569,12 @@
         <w:tabs>
           <w:tab w:val="left" w:pos="566"/>
         </w:tabs>
-        <w:spacing w:after="80" w:before="0"/>
+        <w:spacing w:after="0" w:before="100"/>
         <w:ind w:left="0"/>
       </w:pPr>
       <w:r>
         <w:rPr>
-          <w:rFonts w:ascii="Arial" w:cs="Arial" w:eastAsia="Arial" w:hAnsi="Arial"/>
+          <w:rFonts w:ascii="Aptos" w:cs="Aptos" w:eastAsia="Aptos" w:hAnsi="Aptos"/>
           <w:b/>
           <w:bCs/>
           <w:color w:val="0C2340"/>
@@ -602,7 +585,7 @@
       </w:r>
       <w:r>
         <w:rPr>
-          <w:rFonts w:ascii="Arial" w:cs="Arial" w:eastAsia="Arial" w:hAnsi="Arial"/>
+          <w:rFonts w:ascii="Aptos" w:cs="Aptos" w:eastAsia="Aptos" w:hAnsi="Aptos"/>
           <w:sz w:val="22"/>
           <w:szCs w:val="22"/>
         </w:rPr>
@@ -610,7 +593,7 @@
       </w:r>
       <w:r>
         <w:rPr>
-          <w:rFonts w:ascii="Arial" w:cs="Arial" w:eastAsia="Arial" w:hAnsi="Arial"/>
+          <w:rFonts w:ascii="Aptos" w:cs="Aptos" w:eastAsia="Aptos" w:hAnsi="Aptos"/>
           <w:b/>
           <w:bCs/>
           <w:color w:val="0C2340"/>
@@ -626,16 +609,16 @@
         <w:tabs>
           <w:tab w:val="left" w:pos="566"/>
         </w:tabs>
-        <w:spacing w:after="80" w:before="0" w:line="276"/>
+        <w:spacing w:after="0" w:before="100" w:line="300"/>
         <w:ind w:left="566" w:hanging="566"/>
         <w:jc w:val="both"/>
       </w:pPr>
       <w:r>
         <w:rPr>
-          <w:rFonts w:ascii="Arial" w:cs="Arial" w:eastAsia="Arial" w:hAnsi="Arial"/>
-          <w:b/>
-          <w:bCs/>
-          <w:color w:val="0C2340"/>
+          <w:rFonts w:ascii="Aptos" w:cs="Aptos" w:eastAsia="Aptos" w:hAnsi="Aptos"/>
+          <w:b/>
+          <w:bCs/>
+          <w:color w:val="1A1A1A"/>
           <w:sz w:val="20"/>
           <w:szCs w:val="20"/>
         </w:rPr>
@@ -643,7 +626,7 @@
       </w:r>
       <w:r>
         <w:rPr>
-          <w:rFonts w:ascii="Arial" w:cs="Arial" w:eastAsia="Arial" w:hAnsi="Arial"/>
+          <w:rFonts w:ascii="Aptos" w:cs="Aptos" w:eastAsia="Aptos" w:hAnsi="Aptos"/>
           <w:sz w:val="20"/>
           <w:szCs w:val="20"/>
         </w:rPr>
@@ -651,14 +634,14 @@
       </w:r>
       <w:r>
         <w:rPr>
-          <w:rFonts w:ascii="Arial" w:cs="Arial" w:eastAsia="Arial" w:hAnsi="Arial"/>
+          <w:rFonts w:ascii="Aptos" w:cs="Aptos" w:eastAsia="Aptos" w:hAnsi="Aptos"/>
           <w:b w:val="false"/>
           <w:bCs w:val="false"/>
           <w:color w:val="1A1A1A"/>
           <w:sz w:val="20"/>
           <w:szCs w:val="20"/>
         </w:rPr>
-        <w:t xml:space="preserve">The primary purpose of this inaugural term meeting is to review, consider proposed amendments, and formally adopt the 2026 SGB Constitution in compliance with Section 18 of the South African Schools Act (Act No. 84 of 1996) as amended.</w:t>
+        <w:t xml:space="preserve">The primary purpose of this governance session is to review, consider proposed amendments, and formally adopt the Constitution of the School Governing Body in compliance with Section 18(1) of South African Schools Act, 1996 (Act No. 84 of 1996).</w:t>
       </w:r>
     </w:p>
     <w:p>
@@ -667,16 +650,16 @@
         <w:tabs>
           <w:tab w:val="left" w:pos="566"/>
         </w:tabs>
-        <w:spacing w:after="80" w:before="0" w:line="276"/>
+        <w:spacing w:after="0" w:before="100" w:line="300"/>
         <w:ind w:left="566" w:hanging="566"/>
         <w:jc w:val="both"/>
       </w:pPr>
       <w:r>
         <w:rPr>
-          <w:rFonts w:ascii="Arial" w:cs="Arial" w:eastAsia="Arial" w:hAnsi="Arial"/>
-          <w:b/>
-          <w:bCs/>
-          <w:color w:val="0C2340"/>
+          <w:rFonts w:ascii="Aptos" w:cs="Aptos" w:eastAsia="Aptos" w:hAnsi="Aptos"/>
+          <w:b/>
+          <w:bCs/>
+          <w:color w:val="1A1A1A"/>
           <w:sz w:val="20"/>
           <w:szCs w:val="20"/>
         </w:rPr>
@@ -684,7 +667,7 @@
       </w:r>
       <w:r>
         <w:rPr>
-          <w:rFonts w:ascii="Arial" w:cs="Arial" w:eastAsia="Arial" w:hAnsi="Arial"/>
+          <w:rFonts w:ascii="Aptos" w:cs="Aptos" w:eastAsia="Aptos" w:hAnsi="Aptos"/>
           <w:sz w:val="20"/>
           <w:szCs w:val="20"/>
         </w:rPr>
@@ -692,14 +675,14 @@
       </w:r>
       <w:r>
         <w:rPr>
-          <w:rFonts w:ascii="Arial" w:cs="Arial" w:eastAsia="Arial" w:hAnsi="Arial"/>
+          <w:rFonts w:ascii="Aptos" w:cs="Aptos" w:eastAsia="Aptos" w:hAnsi="Aptos"/>
           <w:b w:val="false"/>
           <w:bCs w:val="false"/>
           <w:color w:val="1A1A1A"/>
           <w:sz w:val="20"/>
           <w:szCs w:val="20"/>
         </w:rPr>
-        <w:t xml:space="preserve">Members are requested to carefully study the attached Draft SGB Constitution prior to the meeting.</w:t>
+        <w:t xml:space="preserve">Members are requested to carefully study the attached draft documentation prior to the meeting.</w:t>
       </w:r>
     </w:p>
     <w:p>
@@ -708,16 +691,16 @@
         <w:tabs>
           <w:tab w:val="left" w:pos="566"/>
         </w:tabs>
-        <w:spacing w:after="80" w:before="0" w:line="276"/>
+        <w:spacing w:after="0" w:before="100" w:line="300"/>
         <w:ind w:left="566" w:hanging="566"/>
         <w:jc w:val="both"/>
       </w:pPr>
       <w:r>
         <w:rPr>
-          <w:rFonts w:ascii="Arial" w:cs="Arial" w:eastAsia="Arial" w:hAnsi="Arial"/>
-          <w:b/>
-          <w:bCs/>
-          <w:color w:val="0C2340"/>
+          <w:rFonts w:ascii="Aptos" w:cs="Aptos" w:eastAsia="Aptos" w:hAnsi="Aptos"/>
+          <w:b/>
+          <w:bCs/>
+          <w:color w:val="1A1A1A"/>
           <w:sz w:val="20"/>
           <w:szCs w:val="20"/>
         </w:rPr>
@@ -725,7 +708,7 @@
       </w:r>
       <w:r>
         <w:rPr>
-          <w:rFonts w:ascii="Arial" w:cs="Arial" w:eastAsia="Arial" w:hAnsi="Arial"/>
+          <w:rFonts w:ascii="Aptos" w:cs="Aptos" w:eastAsia="Aptos" w:hAnsi="Aptos"/>
           <w:sz w:val="20"/>
           <w:szCs w:val="20"/>
         </w:rPr>
@@ -733,7 +716,7 @@
       </w:r>
       <w:r>
         <w:rPr>
-          <w:rFonts w:ascii="Arial" w:cs="Arial" w:eastAsia="Arial" w:hAnsi="Arial"/>
+          <w:rFonts w:ascii="Aptos" w:cs="Aptos" w:eastAsia="Aptos" w:hAnsi="Aptos"/>
           <w:b w:val="false"/>
           <w:bCs w:val="false"/>
           <w:color w:val="1A1A1A"/>
@@ -749,12 +732,12 @@
         <w:tabs>
           <w:tab w:val="left" w:pos="566"/>
         </w:tabs>
-        <w:spacing w:after="80" w:before="0"/>
+        <w:spacing w:after="0" w:before="100"/>
         <w:ind w:left="0"/>
       </w:pPr>
       <w:r>
         <w:rPr>
-          <w:rFonts w:ascii="Arial" w:cs="Arial" w:eastAsia="Arial" w:hAnsi="Arial"/>
+          <w:rFonts w:ascii="Aptos" w:cs="Aptos" w:eastAsia="Aptos" w:hAnsi="Aptos"/>
           <w:b/>
           <w:bCs/>
           <w:color w:val="0C2340"/>
@@ -765,7 +748,7 @@
       </w:r>
       <w:r>
         <w:rPr>
-          <w:rFonts w:ascii="Arial" w:cs="Arial" w:eastAsia="Arial" w:hAnsi="Arial"/>
+          <w:rFonts w:ascii="Aptos" w:cs="Aptos" w:eastAsia="Aptos" w:hAnsi="Aptos"/>
           <w:sz w:val="22"/>
           <w:szCs w:val="22"/>
         </w:rPr>
@@ -773,7 +756,7 @@
       </w:r>
       <w:r>
         <w:rPr>
-          <w:rFonts w:ascii="Arial" w:cs="Arial" w:eastAsia="Arial" w:hAnsi="Arial"/>
+          <w:rFonts w:ascii="Aptos" w:cs="Aptos" w:eastAsia="Aptos" w:hAnsi="Aptos"/>
           <w:b/>
           <w:bCs/>
           <w:color w:val="0C2340"/>
@@ -789,16 +772,16 @@
         <w:tabs>
           <w:tab w:val="left" w:pos="566"/>
         </w:tabs>
-        <w:spacing w:after="80" w:before="0" w:line="276"/>
+        <w:spacing w:after="0" w:before="100" w:line="300"/>
         <w:ind w:left="566" w:hanging="566"/>
         <w:jc w:val="both"/>
       </w:pPr>
       <w:r>
         <w:rPr>
-          <w:rFonts w:ascii="Arial" w:cs="Arial" w:eastAsia="Arial" w:hAnsi="Arial"/>
-          <w:b/>
-          <w:bCs/>
-          <w:color w:val="0C2340"/>
+          <w:rFonts w:ascii="Aptos" w:cs="Aptos" w:eastAsia="Aptos" w:hAnsi="Aptos"/>
+          <w:b/>
+          <w:bCs/>
+          <w:color w:val="1A1A1A"/>
           <w:sz w:val="20"/>
           <w:szCs w:val="20"/>
         </w:rPr>
@@ -806,7 +789,7 @@
       </w:r>
       <w:r>
         <w:rPr>
-          <w:rFonts w:ascii="Arial" w:cs="Arial" w:eastAsia="Arial" w:hAnsi="Arial"/>
+          <w:rFonts w:ascii="Aptos" w:cs="Aptos" w:eastAsia="Aptos" w:hAnsi="Aptos"/>
           <w:sz w:val="20"/>
           <w:szCs w:val="20"/>
         </w:rPr>
@@ -814,14 +797,14 @@
       </w:r>
       <w:r>
         <w:rPr>
-          <w:rFonts w:ascii="Arial" w:cs="Arial" w:eastAsia="Arial" w:hAnsi="Arial"/>
+          <w:rFonts w:ascii="Aptos" w:cs="Aptos" w:eastAsia="Aptos" w:hAnsi="Aptos"/>
           <w:b w:val="false"/>
           <w:bCs w:val="false"/>
           <w:color w:val="1A1A1A"/>
           <w:sz w:val="20"/>
           <w:szCs w:val="20"/>
         </w:rPr>
-        <w:t xml:space="preserve">Draft 2026 SGB Constitution of the Lady Grey Arts Academy.</w:t>
+        <w:t xml:space="preserve">Draft 2026 Constitution of the School Governing Body of the Lady Grey Arts Academy.</w:t>
       </w:r>
     </w:p>
     <w:p>
@@ -830,16 +813,16 @@
         <w:tabs>
           <w:tab w:val="left" w:pos="566"/>
         </w:tabs>
-        <w:spacing w:after="80" w:before="0" w:line="276"/>
+        <w:spacing w:after="0" w:before="100" w:line="300"/>
         <w:ind w:left="566" w:hanging="566"/>
         <w:jc w:val="both"/>
       </w:pPr>
       <w:r>
         <w:rPr>
-          <w:rFonts w:ascii="Arial" w:cs="Arial" w:eastAsia="Arial" w:hAnsi="Arial"/>
-          <w:b/>
-          <w:bCs/>
-          <w:color w:val="0C2340"/>
+          <w:rFonts w:ascii="Aptos" w:cs="Aptos" w:eastAsia="Aptos" w:hAnsi="Aptos"/>
+          <w:b/>
+          <w:bCs/>
+          <w:color w:val="1A1A1A"/>
           <w:sz w:val="20"/>
           <w:szCs w:val="20"/>
         </w:rPr>
@@ -847,7 +830,7 @@
       </w:r>
       <w:r>
         <w:rPr>
-          <w:rFonts w:ascii="Arial" w:cs="Arial" w:eastAsia="Arial" w:hAnsi="Arial"/>
+          <w:rFonts w:ascii="Aptos" w:cs="Aptos" w:eastAsia="Aptos" w:hAnsi="Aptos"/>
           <w:sz w:val="20"/>
           <w:szCs w:val="20"/>
         </w:rPr>
@@ -855,14 +838,14 @@
       </w:r>
       <w:r>
         <w:rPr>
-          <w:rFonts w:ascii="Arial" w:cs="Arial" w:eastAsia="Arial" w:hAnsi="Arial"/>
+          <w:rFonts w:ascii="Aptos" w:cs="Aptos" w:eastAsia="Aptos" w:hAnsi="Aptos"/>
           <w:b w:val="false"/>
           <w:bCs w:val="false"/>
           <w:color w:val="1A1A1A"/>
           <w:sz w:val="20"/>
           <w:szCs w:val="20"/>
         </w:rPr>
-        <w:t xml:space="preserve">2026 Governance Calendar and Draft Meeting Schedule.</w:t>
+        <w:t xml:space="preserve">Regulatory Alignment Briefing Sheet in terms of South African Schools Act, 1996 (Act No. 84 of 1996).</w:t>
       </w:r>
     </w:p>
     <w:p>
@@ -871,16 +854,16 @@
         <w:tabs>
           <w:tab w:val="left" w:pos="566"/>
         </w:tabs>
-        <w:spacing w:after="80" w:before="0" w:line="276"/>
+        <w:spacing w:after="0" w:before="100" w:line="300"/>
         <w:ind w:left="566" w:hanging="566"/>
         <w:jc w:val="both"/>
       </w:pPr>
       <w:r>
         <w:rPr>
-          <w:rFonts w:ascii="Arial" w:cs="Arial" w:eastAsia="Arial" w:hAnsi="Arial"/>
-          <w:b/>
-          <w:bCs/>
-          <w:color w:val="0C2340"/>
+          <w:rFonts w:ascii="Aptos" w:cs="Aptos" w:eastAsia="Aptos" w:hAnsi="Aptos"/>
+          <w:b/>
+          <w:bCs/>
+          <w:color w:val="1A1A1A"/>
           <w:sz w:val="20"/>
           <w:szCs w:val="20"/>
         </w:rPr>
@@ -888,7 +871,7 @@
       </w:r>
       <w:r>
         <w:rPr>
-          <w:rFonts w:ascii="Arial" w:cs="Arial" w:eastAsia="Arial" w:hAnsi="Arial"/>
+          <w:rFonts w:ascii="Aptos" w:cs="Aptos" w:eastAsia="Aptos" w:hAnsi="Aptos"/>
           <w:sz w:val="20"/>
           <w:szCs w:val="20"/>
         </w:rPr>
@@ -896,14 +879,14 @@
       </w:r>
       <w:r>
         <w:rPr>
-          <w:rFonts w:ascii="Arial" w:cs="Arial" w:eastAsia="Arial" w:hAnsi="Arial"/>
+          <w:rFonts w:ascii="Aptos" w:cs="Aptos" w:eastAsia="Aptos" w:hAnsi="Aptos"/>
           <w:b w:val="false"/>
           <w:bCs w:val="false"/>
           <w:color w:val="1A1A1A"/>
           <w:sz w:val="20"/>
           <w:szCs w:val="20"/>
         </w:rPr>
-        <w:t xml:space="preserve">SASA Section 18 &amp; 20 Regulatory Reference Sheet.</w:t>
+        <w:t xml:space="preserve">Department of Basic Education (DBE) Functionality Audit Compliance Checklist.</w:t>
       </w:r>
     </w:p>
     <w:p>
@@ -912,12 +895,12 @@
         <w:tabs>
           <w:tab w:val="left" w:pos="566"/>
         </w:tabs>
-        <w:spacing w:after="80" w:before="0"/>
+        <w:spacing w:after="0" w:before="100"/>
         <w:ind w:left="0"/>
       </w:pPr>
       <w:r>
         <w:rPr>
-          <w:rFonts w:ascii="Arial" w:cs="Arial" w:eastAsia="Arial" w:hAnsi="Arial"/>
+          <w:rFonts w:ascii="Aptos" w:cs="Aptos" w:eastAsia="Aptos" w:hAnsi="Aptos"/>
           <w:b/>
           <w:bCs/>
           <w:color w:val="0C2340"/>
@@ -928,7 +911,7 @@
       </w:r>
       <w:r>
         <w:rPr>
-          <w:rFonts w:ascii="Arial" w:cs="Arial" w:eastAsia="Arial" w:hAnsi="Arial"/>
+          <w:rFonts w:ascii="Aptos" w:cs="Aptos" w:eastAsia="Aptos" w:hAnsi="Aptos"/>
           <w:sz w:val="22"/>
           <w:szCs w:val="22"/>
         </w:rPr>
@@ -936,7 +919,7 @@
       </w:r>
       <w:r>
         <w:rPr>
-          <w:rFonts w:ascii="Arial" w:cs="Arial" w:eastAsia="Arial" w:hAnsi="Arial"/>
+          <w:rFonts w:ascii="Aptos" w:cs="Aptos" w:eastAsia="Aptos" w:hAnsi="Aptos"/>
           <w:b/>
           <w:bCs/>
           <w:color w:val="0C2340"/>
@@ -952,16 +935,16 @@
         <w:tabs>
           <w:tab w:val="left" w:pos="566"/>
         </w:tabs>
-        <w:spacing w:after="80" w:before="0" w:line="276"/>
+        <w:spacing w:after="0" w:before="100" w:line="300"/>
         <w:ind w:left="566" w:hanging="566"/>
         <w:jc w:val="both"/>
       </w:pPr>
       <w:r>
         <w:rPr>
-          <w:rFonts w:ascii="Arial" w:cs="Arial" w:eastAsia="Arial" w:hAnsi="Arial"/>
-          <w:b/>
-          <w:bCs/>
-          <w:color w:val="0C2340"/>
+          <w:rFonts w:ascii="Aptos" w:cs="Aptos" w:eastAsia="Aptos" w:hAnsi="Aptos"/>
+          <w:b/>
+          <w:bCs/>
+          <w:color w:val="1A1A1A"/>
           <w:sz w:val="20"/>
           <w:szCs w:val="20"/>
         </w:rPr>
@@ -969,7 +952,7 @@
       </w:r>
       <w:r>
         <w:rPr>
-          <w:rFonts w:ascii="Arial" w:cs="Arial" w:eastAsia="Arial" w:hAnsi="Arial"/>
+          <w:rFonts w:ascii="Aptos" w:cs="Aptos" w:eastAsia="Aptos" w:hAnsi="Aptos"/>
           <w:sz w:val="20"/>
           <w:szCs w:val="20"/>
         </w:rPr>
@@ -977,7 +960,7 @@
       </w:r>
       <w:r>
         <w:rPr>
-          <w:rFonts w:ascii="Arial" w:cs="Arial" w:eastAsia="Arial" w:hAnsi="Arial"/>
+          <w:rFonts w:ascii="Aptos" w:cs="Aptos" w:eastAsia="Aptos" w:hAnsi="Aptos"/>
           <w:b w:val="false"/>
           <w:bCs w:val="false"/>
           <w:color w:val="1A1A1A"/>
@@ -993,16 +976,16 @@
         <w:tabs>
           <w:tab w:val="left" w:pos="566"/>
         </w:tabs>
-        <w:spacing w:after="80" w:before="0" w:line="276"/>
+        <w:spacing w:after="0" w:before="100" w:line="300"/>
         <w:ind w:left="566" w:hanging="566"/>
         <w:jc w:val="both"/>
       </w:pPr>
       <w:r>
         <w:rPr>
-          <w:rFonts w:ascii="Arial" w:cs="Arial" w:eastAsia="Arial" w:hAnsi="Arial"/>
-          <w:b/>
-          <w:bCs/>
-          <w:color w:val="0C2340"/>
+          <w:rFonts w:ascii="Aptos" w:cs="Aptos" w:eastAsia="Aptos" w:hAnsi="Aptos"/>
+          <w:b/>
+          <w:bCs/>
+          <w:color w:val="1A1A1A"/>
           <w:sz w:val="20"/>
           <w:szCs w:val="20"/>
         </w:rPr>
@@ -1010,7 +993,7 @@
       </w:r>
       <w:r>
         <w:rPr>
-          <w:rFonts w:ascii="Arial" w:cs="Arial" w:eastAsia="Arial" w:hAnsi="Arial"/>
+          <w:rFonts w:ascii="Aptos" w:cs="Aptos" w:eastAsia="Aptos" w:hAnsi="Aptos"/>
           <w:sz w:val="20"/>
           <w:szCs w:val="20"/>
         </w:rPr>
@@ -1018,7 +1001,7 @@
       </w:r>
       <w:r>
         <w:rPr>
-          <w:rFonts w:ascii="Arial" w:cs="Arial" w:eastAsia="Arial" w:hAnsi="Arial"/>
+          <w:rFonts w:ascii="Aptos" w:cs="Aptos" w:eastAsia="Aptos" w:hAnsi="Aptos"/>
           <w:b w:val="false"/>
           <w:bCs w:val="false"/>
           <w:color w:val="1A1A1A"/>
@@ -1034,12 +1017,12 @@
         <w:tabs>
           <w:tab w:val="left" w:pos="566"/>
         </w:tabs>
-        <w:spacing w:after="80" w:before="0"/>
+        <w:spacing w:after="0" w:before="100"/>
         <w:ind w:left="0"/>
       </w:pPr>
       <w:r>
         <w:rPr>
-          <w:rFonts w:ascii="Arial" w:cs="Arial" w:eastAsia="Arial" w:hAnsi="Arial"/>
+          <w:rFonts w:ascii="Aptos" w:cs="Aptos" w:eastAsia="Aptos" w:hAnsi="Aptos"/>
           <w:b/>
           <w:bCs/>
           <w:color w:val="0C2340"/>
@@ -1050,7 +1033,7 @@
       </w:r>
       <w:r>
         <w:rPr>
-          <w:rFonts w:ascii="Arial" w:cs="Arial" w:eastAsia="Arial" w:hAnsi="Arial"/>
+          <w:rFonts w:ascii="Aptos" w:cs="Aptos" w:eastAsia="Aptos" w:hAnsi="Aptos"/>
           <w:sz w:val="22"/>
           <w:szCs w:val="22"/>
         </w:rPr>
@@ -1058,7 +1041,7 @@
       </w:r>
       <w:r>
         <w:rPr>
-          <w:rFonts w:ascii="Arial" w:cs="Arial" w:eastAsia="Arial" w:hAnsi="Arial"/>
+          <w:rFonts w:ascii="Aptos" w:cs="Aptos" w:eastAsia="Aptos" w:hAnsi="Aptos"/>
           <w:b/>
           <w:bCs/>
           <w:color w:val="0C2340"/>
@@ -1071,109 +1054,52 @@
     <w:p>
       <w:pPr>
         <w:keepLines/>
-        <w:spacing w:after="80" w:before="0" w:line="276"/>
+        <w:spacing w:after="0" w:before="0" w:line="300"/>
         <w:ind w:left="566"/>
         <w:jc w:val="both"/>
       </w:pPr>
       <w:r>
         <w:rPr>
-          <w:rFonts w:ascii="Arial" w:cs="Arial" w:eastAsia="Arial" w:hAnsi="Arial"/>
-          <w:color w:val="1A1A1A"/>
-          <w:sz w:val="20"/>
-          <w:szCs w:val="20"/>
-        </w:rPr>
-        <w:t xml:space="preserve">By order of the Executive Committee of the School Governing Body of Lady Grey Arts Academy:</w:t>
-      </w:r>
-    </w:p>
-    <w:p>
-      <w:pPr>
-        <w:keepLines/>
-        <w:tabs>
-          <w:tab w:val="left" w:pos="566"/>
-        </w:tabs>
-        <w:spacing w:after="80" w:before="0"/>
-        <w:ind w:left="0"/>
-      </w:pPr>
-      <w:r>
-        <w:rPr>
-          <w:rFonts w:ascii="Arial" w:cs="Arial" w:eastAsia="Arial" w:hAnsi="Arial"/>
+          <w:rFonts w:ascii="Aptos" w:cs="Aptos" w:eastAsia="Aptos" w:hAnsi="Aptos"/>
+          <w:color w:val="1A1A1A"/>
+          <w:sz w:val="20"/>
+          <w:szCs w:val="20"/>
+        </w:rPr>
+        <w:t xml:space="preserve">By order of the Executive Committee of the School Governing Body of Lady Grey Arts Academy.</w:t>
+      </w:r>
+    </w:p>
+    <w:p>
+      <w:pPr>
+        <w:pageBreakBefore/>
+        <w:spacing w:after="0" w:before="0"/>
+      </w:pPr>
+    </w:p>
+    <w:p>
+      <w:pPr>
+        <w:keepLines/>
+        <w:spacing w:after="40" w:before="160"/>
+      </w:pPr>
+      <w:r>
+        <w:rPr>
+          <w:rFonts w:ascii="Aptos" w:cs="Aptos" w:eastAsia="Aptos" w:hAnsi="Aptos"/>
           <w:b/>
           <w:bCs/>
           <w:color w:val="0C2340"/>
           <w:sz w:val="22"/>
           <w:szCs w:val="22"/>
         </w:rPr>
-        <w:t xml:space="preserve">6.</w:t>
-      </w:r>
-      <w:r>
-        <w:rPr>
-          <w:rFonts w:ascii="Arial" w:cs="Arial" w:eastAsia="Arial" w:hAnsi="Arial"/>
-          <w:sz w:val="22"/>
-          <w:szCs w:val="22"/>
-        </w:rPr>
-        <w:t xml:space="preserve">	</w:t>
-      </w:r>
-      <w:r>
-        <w:rPr>
-          <w:rFonts w:ascii="Arial" w:cs="Arial" w:eastAsia="Arial" w:hAnsi="Arial"/>
-          <w:b/>
-          <w:bCs/>
-          <w:color w:val="0C2340"/>
-          <w:sz w:val="22"/>
-          <w:szCs w:val="22"/>
-        </w:rPr>
-        <w:t xml:space="preserve">DISTRICT ENDORSEMENT &amp; RECORD OF RECEIPT</w:t>
-      </w:r>
-    </w:p>
-    <w:p>
-      <w:pPr>
-        <w:keepLines/>
-        <w:spacing w:after="80" w:before="0" w:line="276"/>
-        <w:ind w:left="566"/>
+        <w:t xml:space="preserve">CONVENOR &amp; PRINCIPAL AUTHORISATION</w:t>
+      </w:r>
+    </w:p>
+    <w:p>
+      <w:pPr>
+        <w:keepLines/>
+        <w:spacing w:after="120" w:before="20" w:line="300"/>
         <w:jc w:val="both"/>
       </w:pPr>
       <w:r>
         <w:rPr>
-          <w:rFonts w:ascii="Arial" w:cs="Arial" w:eastAsia="Arial" w:hAnsi="Arial"/>
-          <w:color w:val="1A1A1A"/>
-          <w:sz w:val="20"/>
-          <w:szCs w:val="20"/>
-        </w:rPr>
-        <w:t xml:space="preserve">Received, verified, and endorsed for departmental records by the District Office:</w:t>
-      </w:r>
-    </w:p>
-    <w:p>
-      <w:pPr>
-        <w:pageBreakBefore/>
-        <w:spacing w:after="0" w:before="0"/>
-      </w:pPr>
-    </w:p>
-    <w:p>
-      <w:pPr>
-        <w:keepLines/>
-        <w:spacing w:after="40" w:before="160"/>
-      </w:pPr>
-      <w:r>
-        <w:rPr>
-          <w:rFonts w:ascii="Arial" w:cs="Arial" w:eastAsia="Arial" w:hAnsi="Arial"/>
-          <w:b/>
-          <w:bCs/>
-          <w:color w:val="0C2340"/>
-          <w:sz w:val="22"/>
-          <w:szCs w:val="22"/>
-        </w:rPr>
-        <w:t xml:space="preserve">CONVENOR &amp; PRINCIPAL AUTHORISATION</w:t>
-      </w:r>
-    </w:p>
-    <w:p>
-      <w:pPr>
-        <w:keepLines/>
-        <w:spacing w:after="120" w:before="20" w:line="276"/>
-        <w:jc w:val="both"/>
-      </w:pPr>
-      <w:r>
-        <w:rPr>
-          <w:rFonts w:ascii="Arial" w:cs="Arial" w:eastAsia="Arial" w:hAnsi="Arial"/>
+          <w:rFonts w:ascii="Aptos" w:cs="Aptos" w:eastAsia="Aptos" w:hAnsi="Aptos"/>
           <w:color w:val="1A1A1A"/>
           <w:sz w:val="20"/>
           <w:szCs w:val="20"/>
@@ -1238,7 +1164,7 @@
             </w:pPr>
             <w:r>
               <w:rPr>
-                <w:rFonts w:ascii="Arial" w:cs="Arial" w:eastAsia="Arial" w:hAnsi="Arial"/>
+                <w:rFonts w:ascii="Aptos" w:cs="Aptos" w:eastAsia="Aptos" w:hAnsi="Aptos"/>
                 <w:b/>
                 <w:bCs/>
                 <w:color w:val="64748B"/>
@@ -1254,7 +1180,7 @@
             </w:pPr>
             <w:r>
               <w:rPr>
-                <w:rFonts w:ascii="Arial" w:cs="Arial" w:eastAsia="Arial" w:hAnsi="Arial"/>
+                <w:rFonts w:ascii="Aptos" w:cs="Aptos" w:eastAsia="Aptos" w:hAnsi="Aptos"/>
                 <w:b/>
                 <w:bCs/>
                 <w:color w:val="1A1A1A"/>
@@ -1270,7 +1196,7 @@
             </w:pPr>
             <w:r>
               <w:rPr>
-                <w:rFonts w:ascii="Arial" w:cs="Arial" w:eastAsia="Arial" w:hAnsi="Arial"/>
+                <w:rFonts w:ascii="Aptos" w:cs="Aptos" w:eastAsia="Aptos" w:hAnsi="Aptos"/>
                 <w:b/>
                 <w:bCs/>
                 <w:color w:val="0C2340"/>
@@ -1287,7 +1213,7 @@
             </w:pPr>
             <w:r>
               <w:rPr>
-                <w:rFonts w:ascii="Arial" w:cs="Arial" w:eastAsia="Arial" w:hAnsi="Arial"/>
+                <w:rFonts w:ascii="Aptos" w:cs="Aptos" w:eastAsia="Aptos" w:hAnsi="Aptos"/>
                 <w:b/>
                 <w:bCs/>
                 <w:color w:val="64748B"/>
@@ -1298,14 +1224,12 @@
             </w:r>
             <w:r>
               <w:rPr>
-                <w:rFonts w:ascii="Arial" w:cs="Arial" w:eastAsia="Arial" w:hAnsi="Arial"/>
-                <w:b/>
-                <w:bCs/>
-                <w:color w:val="1A1A1A"/>
-                <w:sz w:val="15"/>
-                <w:szCs w:val="15"/>
-              </w:rPr>
-              <w:t xml:space="preserve">19/01/2026</w:t>
+                <w:rFonts w:ascii="Aptos" w:cs="Aptos" w:eastAsia="Aptos" w:hAnsi="Aptos"/>
+                <w:color w:val="94A3B8"/>
+                <w:sz w:val="14"/>
+                <w:szCs w:val="14"/>
+              </w:rPr>
+              <w:t xml:space="preserve">___/___/2026</w:t>
             </w:r>
           </w:p>
         </w:tc>
@@ -1366,7 +1290,7 @@
             </w:pPr>
             <w:r>
               <w:rPr>
-                <w:rFonts w:ascii="Arial" w:cs="Arial" w:eastAsia="Arial" w:hAnsi="Arial"/>
+                <w:rFonts w:ascii="Aptos" w:cs="Aptos" w:eastAsia="Aptos" w:hAnsi="Aptos"/>
                 <w:b/>
                 <w:bCs/>
                 <w:color w:val="64748B"/>
@@ -1382,7 +1306,7 @@
             </w:pPr>
             <w:r>
               <w:rPr>
-                <w:rFonts w:ascii="Arial" w:cs="Arial" w:eastAsia="Arial" w:hAnsi="Arial"/>
+                <w:rFonts w:ascii="Aptos" w:cs="Aptos" w:eastAsia="Aptos" w:hAnsi="Aptos"/>
                 <w:b/>
                 <w:bCs/>
                 <w:color w:val="1A1A1A"/>
@@ -1398,7 +1322,7 @@
             </w:pPr>
             <w:r>
               <w:rPr>
-                <w:rFonts w:ascii="Arial" w:cs="Arial" w:eastAsia="Arial" w:hAnsi="Arial"/>
+                <w:rFonts w:ascii="Aptos" w:cs="Aptos" w:eastAsia="Aptos" w:hAnsi="Aptos"/>
                 <w:b/>
                 <w:bCs/>
                 <w:color w:val="0C2340"/>
@@ -1415,7 +1339,7 @@
             </w:pPr>
             <w:r>
               <w:rPr>
-                <w:rFonts w:ascii="Arial" w:cs="Arial" w:eastAsia="Arial" w:hAnsi="Arial"/>
+                <w:rFonts w:ascii="Aptos" w:cs="Aptos" w:eastAsia="Aptos" w:hAnsi="Aptos"/>
                 <w:b/>
                 <w:bCs/>
                 <w:color w:val="64748B"/>
@@ -1426,14 +1350,12 @@
             </w:r>
             <w:r>
               <w:rPr>
-                <w:rFonts w:ascii="Arial" w:cs="Arial" w:eastAsia="Arial" w:hAnsi="Arial"/>
-                <w:b/>
-                <w:bCs/>
-                <w:color w:val="1A1A1A"/>
-                <w:sz w:val="15"/>
-                <w:szCs w:val="15"/>
-              </w:rPr>
-              <w:t xml:space="preserve">19/01/2026</w:t>
+                <w:rFonts w:ascii="Aptos" w:cs="Aptos" w:eastAsia="Aptos" w:hAnsi="Aptos"/>
+                <w:color w:val="94A3B8"/>
+                <w:sz w:val="14"/>
+                <w:szCs w:val="14"/>
+              </w:rPr>
+              <w:t xml:space="preserve">___/___/2026</w:t>
             </w:r>
           </w:p>
         </w:tc>
@@ -1483,7 +1405,7 @@
             </w:pPr>
             <w:r>
               <w:rPr>
-                <w:rFonts w:ascii="Arial" w:cs="Arial" w:eastAsia="Arial" w:hAnsi="Arial"/>
+                <w:rFonts w:ascii="Aptos" w:cs="Aptos" w:eastAsia="Aptos" w:hAnsi="Aptos"/>
                 <w:b/>
                 <w:bCs/>
                 <w:color w:val="475569"/>
@@ -1500,7 +1422,7 @@
             </w:pPr>
             <w:r>
               <w:rPr>
-                <w:rFonts w:ascii="Arial" w:cs="Arial" w:eastAsia="Arial" w:hAnsi="Arial"/>
+                <w:rFonts w:ascii="Aptos" w:cs="Aptos" w:eastAsia="Aptos" w:hAnsi="Aptos"/>
                 <w:color w:val="94A3B8"/>
                 <w:sz w:val="14"/>
                 <w:szCs w:val="14"/>
@@ -1518,7 +1440,7 @@
       </w:pPr>
       <w:r>
         <w:rPr>
-          <w:rFonts w:ascii="Arial" w:cs="Arial" w:eastAsia="Arial" w:hAnsi="Arial"/>
+          <w:rFonts w:ascii="Aptos" w:cs="Aptos" w:eastAsia="Aptos" w:hAnsi="Aptos"/>
           <w:b/>
           <w:bCs/>
           <w:color w:val="0C2340"/>
@@ -1535,7 +1457,7 @@
       </w:pPr>
       <w:r>
         <w:rPr>
-          <w:rFonts w:ascii="Arial" w:cs="Arial" w:eastAsia="Arial" w:hAnsi="Arial"/>
+          <w:rFonts w:ascii="Aptos" w:cs="Aptos" w:eastAsia="Aptos" w:hAnsi="Aptos"/>
           <w:color w:val="1A1A1A"/>
           <w:sz w:val="18"/>
           <w:szCs w:val="18"/>
@@ -1590,7 +1512,7 @@
             </w:pPr>
             <w:r>
               <w:rPr>
-                <w:rFonts w:ascii="Arial" w:cs="Arial" w:eastAsia="Arial" w:hAnsi="Arial"/>
+                <w:rFonts w:ascii="Aptos" w:cs="Aptos" w:eastAsia="Aptos" w:hAnsi="Aptos"/>
                 <w:b/>
                 <w:bCs/>
                 <w:color w:val="475569"/>
@@ -1607,7 +1529,7 @@
             </w:pPr>
             <w:r>
               <w:rPr>
-                <w:rFonts w:ascii="Arial" w:cs="Arial" w:eastAsia="Arial" w:hAnsi="Arial"/>
+                <w:rFonts w:ascii="Aptos" w:cs="Aptos" w:eastAsia="Aptos" w:hAnsi="Aptos"/>
                 <w:color w:val="94A3B8"/>
                 <w:sz w:val="14"/>
                 <w:szCs w:val="14"/>
@@ -1673,7 +1595,7 @@
             </w:pPr>
             <w:r>
               <w:rPr>
-                <w:rFonts w:ascii="Arial" w:cs="Arial" w:eastAsia="Arial" w:hAnsi="Arial"/>
+                <w:rFonts w:ascii="Aptos" w:cs="Aptos" w:eastAsia="Aptos" w:hAnsi="Aptos"/>
                 <w:b/>
                 <w:bCs/>
                 <w:color w:val="64748B"/>
@@ -1689,7 +1611,7 @@
             </w:pPr>
             <w:r>
               <w:rPr>
-                <w:rFonts w:ascii="Arial" w:cs="Arial" w:eastAsia="Arial" w:hAnsi="Arial"/>
+                <w:rFonts w:ascii="Aptos" w:cs="Aptos" w:eastAsia="Aptos" w:hAnsi="Aptos"/>
                 <w:b/>
                 <w:bCs/>
                 <w:color w:val="64748B"/>
@@ -1700,7 +1622,7 @@
             </w:r>
             <w:r>
               <w:rPr>
-                <w:rFonts w:ascii="Arial" w:cs="Arial" w:eastAsia="Arial" w:hAnsi="Arial"/>
+                <w:rFonts w:ascii="Aptos" w:cs="Aptos" w:eastAsia="Aptos" w:hAnsi="Aptos"/>
                 <w:color w:val="94A3B8"/>
                 <w:sz w:val="14"/>
                 <w:szCs w:val="14"/>
@@ -1714,7 +1636,7 @@
             </w:pPr>
             <w:r>
               <w:rPr>
-                <w:rFonts w:ascii="Arial" w:cs="Arial" w:eastAsia="Arial" w:hAnsi="Arial"/>
+                <w:rFonts w:ascii="Aptos" w:cs="Aptos" w:eastAsia="Aptos" w:hAnsi="Aptos"/>
                 <w:b/>
                 <w:bCs/>
                 <w:color w:val="0C2340"/>
@@ -1730,7 +1652,7 @@
             </w:pPr>
             <w:r>
               <w:rPr>
-                <w:rFonts w:ascii="Arial" w:cs="Arial" w:eastAsia="Arial" w:hAnsi="Arial"/>
+                <w:rFonts w:ascii="Aptos" w:cs="Aptos" w:eastAsia="Aptos" w:hAnsi="Aptos"/>
                 <w:b/>
                 <w:bCs/>
                 <w:color w:val="64748B"/>
@@ -1741,7 +1663,7 @@
             </w:r>
             <w:r>
               <w:rPr>
-                <w:rFonts w:ascii="Arial" w:cs="Arial" w:eastAsia="Arial" w:hAnsi="Arial"/>
+                <w:rFonts w:ascii="Aptos" w:cs="Aptos" w:eastAsia="Aptos" w:hAnsi="Aptos"/>
                 <w:color w:val="94A3B8"/>
                 <w:sz w:val="14"/>
                 <w:szCs w:val="14"/>
@@ -1816,7 +1738,7 @@
     </w:pPr>
     <w:r>
       <w:rPr>
-        <w:rFonts w:ascii="Arial" w:cs="Arial" w:eastAsia="Arial" w:hAnsi="Arial"/>
+        <w:rFonts w:ascii="Aptos" w:cs="Aptos" w:eastAsia="Aptos" w:hAnsi="Aptos"/>
         <w:color w:val="64748B"/>
         <w:sz w:val="17"/>
         <w:szCs w:val="17"/>
@@ -1828,7 +1750,7 @@
     </w:r>
     <w:r>
       <w:rPr>
-        <w:rFonts w:ascii="Arial" w:cs="Arial" w:eastAsia="Arial" w:hAnsi="Arial"/>
+        <w:rFonts w:ascii="Aptos" w:cs="Aptos" w:eastAsia="Aptos" w:hAnsi="Aptos"/>
         <w:color w:val="64748B"/>
         <w:sz w:val="17"/>
         <w:szCs w:val="17"/>
@@ -1837,7 +1759,7 @@
     </w:r>
     <w:r>
       <w:rPr>
-        <w:rFonts w:ascii="Arial" w:cs="Arial" w:eastAsia="Arial" w:hAnsi="Arial"/>
+        <w:rFonts w:ascii="Aptos" w:cs="Aptos" w:eastAsia="Aptos" w:hAnsi="Aptos"/>
         <w:color w:val="64748B"/>
         <w:sz w:val="17"/>
         <w:szCs w:val="17"/>
@@ -1988,7 +1910,7 @@
   <w:docDefaults>
     <w:rPrDefault>
       <w:rPr>
-        <w:rFonts w:ascii="Arial" w:cs="Arial" w:eastAsia="Arial" w:hAnsi="Arial"/>
+        <w:rFonts w:ascii="Aptos" w:cs="Aptos" w:eastAsia="Aptos" w:hAnsi="Aptos"/>
         <w:color w:val="1A1A1A"/>
         <w:sz w:val="20"/>
         <w:szCs w:val="20"/>

</xml_diff>